<commit_message>
day 4 examples and notes
</commit_message>
<xml_diff>
--- a/Java Full Stack Notes.docx
+++ b/Java Full Stack Notes.docx
@@ -339,6 +339,9 @@
         <w:ind w:left="0" w:firstLine="0"/>
       </w:pPr>
       <w:r>
+        <w:rPr>
+          <w:noProof/>
+        </w:rPr>
         <w:drawing>
           <wp:inline distT="0" distB="0" distL="0" distR="0" wp14:anchorId="166C5E29" wp14:editId="46A9963B">
             <wp:extent cx="5943600" cy="2666365"/>
@@ -411,6 +414,9 @@
         <w:ind w:left="0" w:firstLine="0"/>
       </w:pPr>
       <w:r>
+        <w:rPr>
+          <w:noProof/>
+        </w:rPr>
         <w:lastRenderedPageBreak/>
         <w:drawing>
           <wp:inline distT="0" distB="0" distL="0" distR="0" wp14:anchorId="5F922634" wp14:editId="0E4A371C">
@@ -468,6 +474,9 @@
         <w:ind w:left="0" w:firstLine="0"/>
       </w:pPr>
       <w:r>
+        <w:rPr>
+          <w:noProof/>
+        </w:rPr>
         <w:drawing>
           <wp:inline distT="0" distB="0" distL="0" distR="0" wp14:anchorId="2355ECD3" wp14:editId="17D6955C">
             <wp:extent cx="5943600" cy="3388360"/>
@@ -633,6 +642,9 @@
         <w:ind w:left="0" w:firstLine="0"/>
       </w:pPr>
       <w:r>
+        <w:rPr>
+          <w:noProof/>
+        </w:rPr>
         <w:drawing>
           <wp:inline distT="0" distB="0" distL="0" distR="0" wp14:anchorId="245DA5D1" wp14:editId="5506682A">
             <wp:extent cx="5943600" cy="3924300"/>
@@ -801,8 +813,2770 @@
         <w:br/>
         <w:t>10 20 30</w:t>
       </w:r>
+    </w:p>
+    <w:p>
+      <w:pPr>
+        <w:ind w:left="0" w:firstLine="0"/>
+      </w:pPr>
+      <w:r>
+        <w:rPr>
+          <w:highlight w:val="yellow"/>
+        </w:rPr>
+        <w:t>for each / enhanced for loop</w:t>
+      </w:r>
+    </w:p>
+    <w:p>
+      <w:pPr>
+        <w:ind w:left="0" w:firstLine="0"/>
+      </w:pPr>
+      <w:r>
+        <w:t>it simplifies writing traditional for loop by eliminating initialization, comparison and index access.</w:t>
+      </w:r>
+    </w:p>
+    <w:p>
+      <w:pPr>
+        <w:ind w:left="0" w:firstLine="0"/>
+      </w:pPr>
+      <w:r>
+        <w:rPr>
+          <w:noProof/>
+        </w:rPr>
+        <w:lastRenderedPageBreak/>
+        <w:drawing>
+          <wp:inline distT="0" distB="0" distL="0" distR="0" wp14:anchorId="036F3080" wp14:editId="1A03686F">
+            <wp:extent cx="5943600" cy="4709795"/>
+            <wp:effectExtent l="0" t="0" r="0" b="0"/>
+            <wp:docPr id="1430264554" name="Picture 1"/>
+            <wp:cNvGraphicFramePr>
+              <a:graphicFrameLocks xmlns:a="http://schemas.openxmlformats.org/drawingml/2006/main" noChangeAspect="1"/>
+            </wp:cNvGraphicFramePr>
+            <a:graphic xmlns:a="http://schemas.openxmlformats.org/drawingml/2006/main">
+              <a:graphicData uri="http://schemas.openxmlformats.org/drawingml/2006/picture">
+                <pic:pic xmlns:pic="http://schemas.openxmlformats.org/drawingml/2006/picture">
+                  <pic:nvPicPr>
+                    <pic:cNvPr id="1430264554" name=""/>
+                    <pic:cNvPicPr/>
+                  </pic:nvPicPr>
+                  <pic:blipFill>
+                    <a:blip r:embed="rId9"/>
+                    <a:stretch>
+                      <a:fillRect/>
+                    </a:stretch>
+                  </pic:blipFill>
+                  <pic:spPr>
+                    <a:xfrm>
+                      <a:off x="0" y="0"/>
+                      <a:ext cx="5943600" cy="4709795"/>
+                    </a:xfrm>
+                    <a:prstGeom prst="rect">
+                      <a:avLst/>
+                    </a:prstGeom>
+                  </pic:spPr>
+                </pic:pic>
+              </a:graphicData>
+            </a:graphic>
+          </wp:inline>
+        </w:drawing>
+      </w:r>
+    </w:p>
+    <w:p>
+      <w:pPr>
+        <w:ind w:left="0" w:firstLine="0"/>
+      </w:pPr>
+    </w:p>
+    <w:p>
+      <w:pPr>
+        <w:ind w:left="0" w:firstLine="0"/>
+      </w:pPr>
+      <w:r>
+        <w:rPr>
+          <w:highlight w:val="yellow"/>
+        </w:rPr>
+        <w:t>Classes &amp; Objects</w:t>
+      </w:r>
+    </w:p>
+    <w:p>
+      <w:pPr>
+        <w:ind w:left="0" w:firstLine="0"/>
+      </w:pPr>
+      <w:r>
+        <w:rPr>
+          <w:noProof/>
+        </w:rPr>
+        <w:lastRenderedPageBreak/>
+        <w:drawing>
+          <wp:inline distT="0" distB="0" distL="0" distR="0" wp14:anchorId="5C0C9A98" wp14:editId="1737910F">
+            <wp:extent cx="5943600" cy="2884170"/>
+            <wp:effectExtent l="0" t="0" r="0" b="0"/>
+            <wp:docPr id="494419953" name="Picture 1"/>
+            <wp:cNvGraphicFramePr>
+              <a:graphicFrameLocks xmlns:a="http://schemas.openxmlformats.org/drawingml/2006/main" noChangeAspect="1"/>
+            </wp:cNvGraphicFramePr>
+            <a:graphic xmlns:a="http://schemas.openxmlformats.org/drawingml/2006/main">
+              <a:graphicData uri="http://schemas.openxmlformats.org/drawingml/2006/picture">
+                <pic:pic xmlns:pic="http://schemas.openxmlformats.org/drawingml/2006/picture">
+                  <pic:nvPicPr>
+                    <pic:cNvPr id="494419953" name=""/>
+                    <pic:cNvPicPr/>
+                  </pic:nvPicPr>
+                  <pic:blipFill>
+                    <a:blip r:embed="rId10"/>
+                    <a:stretch>
+                      <a:fillRect/>
+                    </a:stretch>
+                  </pic:blipFill>
+                  <pic:spPr>
+                    <a:xfrm>
+                      <a:off x="0" y="0"/>
+                      <a:ext cx="5943600" cy="2884170"/>
+                    </a:xfrm>
+                    <a:prstGeom prst="rect">
+                      <a:avLst/>
+                    </a:prstGeom>
+                  </pic:spPr>
+                </pic:pic>
+              </a:graphicData>
+            </a:graphic>
+          </wp:inline>
+        </w:drawing>
+      </w:r>
+    </w:p>
+    <w:p>
+      <w:pPr>
+        <w:ind w:left="0" w:firstLine="0"/>
+      </w:pPr>
+      <w:r>
+        <w:rPr>
+          <w:noProof/>
+        </w:rPr>
+        <w:drawing>
+          <wp:inline distT="0" distB="0" distL="0" distR="0" wp14:anchorId="2FF7B316" wp14:editId="6FCA902D">
+            <wp:extent cx="5943600" cy="3287395"/>
+            <wp:effectExtent l="0" t="0" r="0" b="8255"/>
+            <wp:docPr id="639739479" name="Picture 1"/>
+            <wp:cNvGraphicFramePr>
+              <a:graphicFrameLocks xmlns:a="http://schemas.openxmlformats.org/drawingml/2006/main" noChangeAspect="1"/>
+            </wp:cNvGraphicFramePr>
+            <a:graphic xmlns:a="http://schemas.openxmlformats.org/drawingml/2006/main">
+              <a:graphicData uri="http://schemas.openxmlformats.org/drawingml/2006/picture">
+                <pic:pic xmlns:pic="http://schemas.openxmlformats.org/drawingml/2006/picture">
+                  <pic:nvPicPr>
+                    <pic:cNvPr id="639739479" name=""/>
+                    <pic:cNvPicPr/>
+                  </pic:nvPicPr>
+                  <pic:blipFill>
+                    <a:blip r:embed="rId11"/>
+                    <a:stretch>
+                      <a:fillRect/>
+                    </a:stretch>
+                  </pic:blipFill>
+                  <pic:spPr>
+                    <a:xfrm>
+                      <a:off x="0" y="0"/>
+                      <a:ext cx="5943600" cy="3287395"/>
+                    </a:xfrm>
+                    <a:prstGeom prst="rect">
+                      <a:avLst/>
+                    </a:prstGeom>
+                  </pic:spPr>
+                </pic:pic>
+              </a:graphicData>
+            </a:graphic>
+          </wp:inline>
+        </w:drawing>
+      </w:r>
+    </w:p>
+    <w:p>
+      <w:pPr>
+        <w:ind w:left="0" w:firstLine="0"/>
+      </w:pPr>
+      <w:r>
+        <w:rPr>
+          <w:highlight w:val="yellow"/>
+        </w:rPr>
+        <w:t>Encapsulation:</w:t>
+      </w:r>
+      <w:r>
+        <w:t xml:space="preserve"> It </w:t>
+      </w:r>
+      <w:r>
+        <w:t>wraps the data &amp; method in a single unit, you can prevent direct access to the data using private and provide access to the methods using public</w:t>
+      </w:r>
+      <w:r>
+        <w:t>, the data can be access using getters &amp; setters</w:t>
+      </w:r>
+    </w:p>
+    <w:p>
+      <w:pPr>
+        <w:ind w:left="0" w:firstLine="0"/>
+      </w:pPr>
+      <w:r>
+        <w:rPr>
+          <w:noProof/>
+        </w:rPr>
+        <w:lastRenderedPageBreak/>
+        <w:drawing>
+          <wp:inline distT="0" distB="0" distL="0" distR="0" wp14:anchorId="0CAD7863" wp14:editId="3ED7B6E9">
+            <wp:extent cx="5943600" cy="4668520"/>
+            <wp:effectExtent l="0" t="0" r="0" b="0"/>
+            <wp:docPr id="1856132826" name="Picture 1"/>
+            <wp:cNvGraphicFramePr>
+              <a:graphicFrameLocks xmlns:a="http://schemas.openxmlformats.org/drawingml/2006/main" noChangeAspect="1"/>
+            </wp:cNvGraphicFramePr>
+            <a:graphic xmlns:a="http://schemas.openxmlformats.org/drawingml/2006/main">
+              <a:graphicData uri="http://schemas.openxmlformats.org/drawingml/2006/picture">
+                <pic:pic xmlns:pic="http://schemas.openxmlformats.org/drawingml/2006/picture">
+                  <pic:nvPicPr>
+                    <pic:cNvPr id="1856132826" name=""/>
+                    <pic:cNvPicPr/>
+                  </pic:nvPicPr>
+                  <pic:blipFill>
+                    <a:blip r:embed="rId12"/>
+                    <a:stretch>
+                      <a:fillRect/>
+                    </a:stretch>
+                  </pic:blipFill>
+                  <pic:spPr>
+                    <a:xfrm>
+                      <a:off x="0" y="0"/>
+                      <a:ext cx="5943600" cy="4668520"/>
+                    </a:xfrm>
+                    <a:prstGeom prst="rect">
+                      <a:avLst/>
+                    </a:prstGeom>
+                  </pic:spPr>
+                </pic:pic>
+              </a:graphicData>
+            </a:graphic>
+          </wp:inline>
+        </w:drawing>
+      </w:r>
+    </w:p>
+    <w:p>
+      <w:pPr>
+        <w:ind w:left="0" w:firstLine="0"/>
+      </w:pPr>
+      <w:r>
+        <w:rPr>
+          <w:noProof/>
+        </w:rPr>
+        <w:lastRenderedPageBreak/>
+        <w:drawing>
+          <wp:inline distT="0" distB="0" distL="0" distR="0" wp14:anchorId="7365CC84" wp14:editId="213DCF42">
+            <wp:extent cx="5943600" cy="4061460"/>
+            <wp:effectExtent l="0" t="0" r="0" b="0"/>
+            <wp:docPr id="672698838" name="Picture 1"/>
+            <wp:cNvGraphicFramePr>
+              <a:graphicFrameLocks xmlns:a="http://schemas.openxmlformats.org/drawingml/2006/main" noChangeAspect="1"/>
+            </wp:cNvGraphicFramePr>
+            <a:graphic xmlns:a="http://schemas.openxmlformats.org/drawingml/2006/main">
+              <a:graphicData uri="http://schemas.openxmlformats.org/drawingml/2006/picture">
+                <pic:pic xmlns:pic="http://schemas.openxmlformats.org/drawingml/2006/picture">
+                  <pic:nvPicPr>
+                    <pic:cNvPr id="672698838" name=""/>
+                    <pic:cNvPicPr/>
+                  </pic:nvPicPr>
+                  <pic:blipFill>
+                    <a:blip r:embed="rId13"/>
+                    <a:stretch>
+                      <a:fillRect/>
+                    </a:stretch>
+                  </pic:blipFill>
+                  <pic:spPr>
+                    <a:xfrm>
+                      <a:off x="0" y="0"/>
+                      <a:ext cx="5943600" cy="4061460"/>
+                    </a:xfrm>
+                    <a:prstGeom prst="rect">
+                      <a:avLst/>
+                    </a:prstGeom>
+                  </pic:spPr>
+                </pic:pic>
+              </a:graphicData>
+            </a:graphic>
+          </wp:inline>
+        </w:drawing>
+      </w:r>
+    </w:p>
+    <w:p>
+      <w:pPr>
+        <w:ind w:left="0" w:firstLine="0"/>
+      </w:pPr>
+      <w:r>
+        <w:rPr>
+          <w:highlight w:val="yellow"/>
+        </w:rPr>
+        <w:t>Inheritance:</w:t>
+      </w:r>
+    </w:p>
+    <w:p>
+      <w:pPr>
+        <w:ind w:left="0" w:firstLine="0"/>
+      </w:pPr>
+      <w:r>
+        <w:t xml:space="preserve">It is a process of acquiring properties and methods of an object form another object, this prevents re-writing the same code </w:t>
+      </w:r>
+    </w:p>
+    <w:p>
+      <w:pPr>
+        <w:ind w:left="0" w:firstLine="0"/>
+      </w:pPr>
+      <w:r>
+        <w:rPr>
+          <w:noProof/>
+        </w:rPr>
+        <w:lastRenderedPageBreak/>
+        <w:drawing>
+          <wp:inline distT="0" distB="0" distL="0" distR="0" wp14:anchorId="5FCB3329" wp14:editId="52270087">
+            <wp:extent cx="5943600" cy="5474335"/>
+            <wp:effectExtent l="0" t="0" r="0" b="0"/>
+            <wp:docPr id="1178769192" name="Picture 1"/>
+            <wp:cNvGraphicFramePr>
+              <a:graphicFrameLocks xmlns:a="http://schemas.openxmlformats.org/drawingml/2006/main" noChangeAspect="1"/>
+            </wp:cNvGraphicFramePr>
+            <a:graphic xmlns:a="http://schemas.openxmlformats.org/drawingml/2006/main">
+              <a:graphicData uri="http://schemas.openxmlformats.org/drawingml/2006/picture">
+                <pic:pic xmlns:pic="http://schemas.openxmlformats.org/drawingml/2006/picture">
+                  <pic:nvPicPr>
+                    <pic:cNvPr id="1178769192" name=""/>
+                    <pic:cNvPicPr/>
+                  </pic:nvPicPr>
+                  <pic:blipFill>
+                    <a:blip r:embed="rId14"/>
+                    <a:stretch>
+                      <a:fillRect/>
+                    </a:stretch>
+                  </pic:blipFill>
+                  <pic:spPr>
+                    <a:xfrm>
+                      <a:off x="0" y="0"/>
+                      <a:ext cx="5943600" cy="5474335"/>
+                    </a:xfrm>
+                    <a:prstGeom prst="rect">
+                      <a:avLst/>
+                    </a:prstGeom>
+                  </pic:spPr>
+                </pic:pic>
+              </a:graphicData>
+            </a:graphic>
+          </wp:inline>
+        </w:drawing>
+      </w:r>
+    </w:p>
+    <w:p>
+      <w:pPr>
+        <w:ind w:left="0" w:firstLine="0"/>
+      </w:pPr>
+      <w:r>
+        <w:rPr>
+          <w:noProof/>
+        </w:rPr>
+        <w:lastRenderedPageBreak/>
+        <w:drawing>
+          <wp:inline distT="0" distB="0" distL="0" distR="0" wp14:anchorId="38350290" wp14:editId="0C8B609B">
+            <wp:extent cx="5943600" cy="4424045"/>
+            <wp:effectExtent l="0" t="0" r="0" b="0"/>
+            <wp:docPr id="1994628685" name="Picture 1"/>
+            <wp:cNvGraphicFramePr>
+              <a:graphicFrameLocks xmlns:a="http://schemas.openxmlformats.org/drawingml/2006/main" noChangeAspect="1"/>
+            </wp:cNvGraphicFramePr>
+            <a:graphic xmlns:a="http://schemas.openxmlformats.org/drawingml/2006/main">
+              <a:graphicData uri="http://schemas.openxmlformats.org/drawingml/2006/picture">
+                <pic:pic xmlns:pic="http://schemas.openxmlformats.org/drawingml/2006/picture">
+                  <pic:nvPicPr>
+                    <pic:cNvPr id="1994628685" name=""/>
+                    <pic:cNvPicPr/>
+                  </pic:nvPicPr>
+                  <pic:blipFill>
+                    <a:blip r:embed="rId15"/>
+                    <a:stretch>
+                      <a:fillRect/>
+                    </a:stretch>
+                  </pic:blipFill>
+                  <pic:spPr>
+                    <a:xfrm>
+                      <a:off x="0" y="0"/>
+                      <a:ext cx="5943600" cy="4424045"/>
+                    </a:xfrm>
+                    <a:prstGeom prst="rect">
+                      <a:avLst/>
+                    </a:prstGeom>
+                  </pic:spPr>
+                </pic:pic>
+              </a:graphicData>
+            </a:graphic>
+          </wp:inline>
+        </w:drawing>
+      </w:r>
+    </w:p>
+    <w:p>
+      <w:pPr>
+        <w:ind w:left="0" w:firstLine="0"/>
+      </w:pPr>
+      <w:r>
+        <w:rPr>
+          <w:noProof/>
+        </w:rPr>
+        <w:lastRenderedPageBreak/>
+        <w:drawing>
+          <wp:inline distT="0" distB="0" distL="0" distR="0" wp14:anchorId="574C35B4" wp14:editId="2B8E5748">
+            <wp:extent cx="5943600" cy="4425950"/>
+            <wp:effectExtent l="0" t="0" r="0" b="0"/>
+            <wp:docPr id="1350182834" name="Picture 1"/>
+            <wp:cNvGraphicFramePr>
+              <a:graphicFrameLocks xmlns:a="http://schemas.openxmlformats.org/drawingml/2006/main" noChangeAspect="1"/>
+            </wp:cNvGraphicFramePr>
+            <a:graphic xmlns:a="http://schemas.openxmlformats.org/drawingml/2006/main">
+              <a:graphicData uri="http://schemas.openxmlformats.org/drawingml/2006/picture">
+                <pic:pic xmlns:pic="http://schemas.openxmlformats.org/drawingml/2006/picture">
+                  <pic:nvPicPr>
+                    <pic:cNvPr id="1350182834" name=""/>
+                    <pic:cNvPicPr/>
+                  </pic:nvPicPr>
+                  <pic:blipFill>
+                    <a:blip r:embed="rId16"/>
+                    <a:stretch>
+                      <a:fillRect/>
+                    </a:stretch>
+                  </pic:blipFill>
+                  <pic:spPr>
+                    <a:xfrm>
+                      <a:off x="0" y="0"/>
+                      <a:ext cx="5943600" cy="4425950"/>
+                    </a:xfrm>
+                    <a:prstGeom prst="rect">
+                      <a:avLst/>
+                    </a:prstGeom>
+                  </pic:spPr>
+                </pic:pic>
+              </a:graphicData>
+            </a:graphic>
+          </wp:inline>
+        </w:drawing>
+      </w:r>
+    </w:p>
+    <w:p>
+      <w:pPr>
+        <w:ind w:left="0" w:firstLine="0"/>
+      </w:pPr>
+      <w:r>
+        <w:rPr>
+          <w:noProof/>
+        </w:rPr>
+        <w:drawing>
+          <wp:inline distT="0" distB="0" distL="0" distR="0" wp14:anchorId="63DFC8D5" wp14:editId="4EA49D3A">
+            <wp:extent cx="5943600" cy="2857500"/>
+            <wp:effectExtent l="0" t="0" r="0" b="0"/>
+            <wp:docPr id="1176718470" name="Picture 1"/>
+            <wp:cNvGraphicFramePr>
+              <a:graphicFrameLocks xmlns:a="http://schemas.openxmlformats.org/drawingml/2006/main" noChangeAspect="1"/>
+            </wp:cNvGraphicFramePr>
+            <a:graphic xmlns:a="http://schemas.openxmlformats.org/drawingml/2006/main">
+              <a:graphicData uri="http://schemas.openxmlformats.org/drawingml/2006/picture">
+                <pic:pic xmlns:pic="http://schemas.openxmlformats.org/drawingml/2006/picture">
+                  <pic:nvPicPr>
+                    <pic:cNvPr id="1176718470" name=""/>
+                    <pic:cNvPicPr/>
+                  </pic:nvPicPr>
+                  <pic:blipFill>
+                    <a:blip r:embed="rId17"/>
+                    <a:stretch>
+                      <a:fillRect/>
+                    </a:stretch>
+                  </pic:blipFill>
+                  <pic:spPr>
+                    <a:xfrm>
+                      <a:off x="0" y="0"/>
+                      <a:ext cx="5943600" cy="2857500"/>
+                    </a:xfrm>
+                    <a:prstGeom prst="rect">
+                      <a:avLst/>
+                    </a:prstGeom>
+                  </pic:spPr>
+                </pic:pic>
+              </a:graphicData>
+            </a:graphic>
+          </wp:inline>
+        </w:drawing>
+      </w:r>
+    </w:p>
+    <w:p>
+      <w:pPr>
+        <w:ind w:left="0" w:firstLine="0"/>
+      </w:pPr>
+    </w:p>
+    <w:p>
+      <w:pPr>
+        <w:ind w:left="0" w:firstLine="0"/>
+      </w:pPr>
+      <w:r>
+        <w:rPr>
+          <w:highlight w:val="yellow"/>
+        </w:rPr>
+        <w:lastRenderedPageBreak/>
+        <w:t>Polymorphism</w:t>
+      </w:r>
+    </w:p>
+    <w:p>
+      <w:pPr>
+        <w:ind w:left="0" w:firstLine="0"/>
+      </w:pPr>
+      <w:r>
+        <w:t>A method with many forms, it can be achieved in 2 ways</w:t>
+      </w:r>
+    </w:p>
+    <w:p>
+      <w:pPr>
+        <w:pStyle w:val="ListParagraph"/>
+        <w:numPr>
+          <w:ilvl w:val="0"/>
+          <w:numId w:val="8"/>
+        </w:numPr>
+      </w:pPr>
+      <w:r>
+        <w:t>method overloading - compile time polymorphism</w:t>
+      </w:r>
+    </w:p>
+    <w:p>
+      <w:pPr>
+        <w:pStyle w:val="ListParagraph"/>
+        <w:numPr>
+          <w:ilvl w:val="0"/>
+          <w:numId w:val="8"/>
+        </w:numPr>
+      </w:pPr>
+      <w:r>
+        <w:t>method overriding - runtime polymorphism</w:t>
+      </w:r>
+    </w:p>
+    <w:p>
+      <w:pPr>
+        <w:ind w:left="0" w:firstLine="0"/>
+      </w:pPr>
+      <w:r>
+        <w:t>System.out.println(“Hello”);</w:t>
+      </w:r>
+      <w:r>
+        <w:t xml:space="preserve"> // accepts String</w:t>
+      </w:r>
       <w:r>
         <w:br/>
+        <w:t>System.out.println(employee1.getSalary());</w:t>
+      </w:r>
+      <w:r>
+        <w:t xml:space="preserve"> // accepts double </w:t>
+      </w:r>
+      <w:r>
+        <w:br/>
+        <w:t>System.out.println(customer1.getJoiningDate()); // accepts LocalDate</w:t>
+      </w:r>
+    </w:p>
+    <w:p>
+      <w:pPr>
+        <w:ind w:left="0" w:firstLine="0"/>
+        <w:rPr>
+          <w:highlight w:val="yellow"/>
+        </w:rPr>
+      </w:pPr>
+    </w:p>
+    <w:p>
+      <w:pPr>
+        <w:ind w:left="0" w:firstLine="0"/>
+      </w:pPr>
+      <w:r>
+        <w:rPr>
+          <w:highlight w:val="yellow"/>
+        </w:rPr>
+        <w:t>Method overloading:</w:t>
+      </w:r>
+      <w:r>
+        <w:t xml:space="preserve">  A method that will have same name but different arguments or type of arguments</w:t>
+      </w:r>
+    </w:p>
+    <w:p>
+      <w:pPr>
+        <w:ind w:left="0" w:firstLine="0"/>
+      </w:pPr>
+      <w:r>
+        <w:rPr>
+          <w:noProof/>
+        </w:rPr>
+        <w:drawing>
+          <wp:inline distT="0" distB="0" distL="0" distR="0" wp14:anchorId="0FC18573" wp14:editId="180FFBB6">
+            <wp:extent cx="5943600" cy="4545330"/>
+            <wp:effectExtent l="0" t="0" r="0" b="7620"/>
+            <wp:docPr id="947036514" name="Picture 1"/>
+            <wp:cNvGraphicFramePr>
+              <a:graphicFrameLocks xmlns:a="http://schemas.openxmlformats.org/drawingml/2006/main" noChangeAspect="1"/>
+            </wp:cNvGraphicFramePr>
+            <a:graphic xmlns:a="http://schemas.openxmlformats.org/drawingml/2006/main">
+              <a:graphicData uri="http://schemas.openxmlformats.org/drawingml/2006/picture">
+                <pic:pic xmlns:pic="http://schemas.openxmlformats.org/drawingml/2006/picture">
+                  <pic:nvPicPr>
+                    <pic:cNvPr id="947036514" name=""/>
+                    <pic:cNvPicPr/>
+                  </pic:nvPicPr>
+                  <pic:blipFill>
+                    <a:blip r:embed="rId18"/>
+                    <a:stretch>
+                      <a:fillRect/>
+                    </a:stretch>
+                  </pic:blipFill>
+                  <pic:spPr>
+                    <a:xfrm>
+                      <a:off x="0" y="0"/>
+                      <a:ext cx="5943600" cy="4545330"/>
+                    </a:xfrm>
+                    <a:prstGeom prst="rect">
+                      <a:avLst/>
+                    </a:prstGeom>
+                  </pic:spPr>
+                </pic:pic>
+              </a:graphicData>
+            </a:graphic>
+          </wp:inline>
+        </w:drawing>
+      </w:r>
+    </w:p>
+    <w:p>
+      <w:pPr>
+        <w:ind w:left="0" w:firstLine="0"/>
+      </w:pPr>
+      <w:r>
+        <w:rPr>
+          <w:noProof/>
+        </w:rPr>
+        <w:lastRenderedPageBreak/>
+        <w:drawing>
+          <wp:inline distT="0" distB="0" distL="0" distR="0" wp14:anchorId="67B3EE03" wp14:editId="0AB38C95">
+            <wp:extent cx="5943600" cy="1285240"/>
+            <wp:effectExtent l="0" t="0" r="0" b="0"/>
+            <wp:docPr id="799944028" name="Picture 1"/>
+            <wp:cNvGraphicFramePr>
+              <a:graphicFrameLocks xmlns:a="http://schemas.openxmlformats.org/drawingml/2006/main" noChangeAspect="1"/>
+            </wp:cNvGraphicFramePr>
+            <a:graphic xmlns:a="http://schemas.openxmlformats.org/drawingml/2006/main">
+              <a:graphicData uri="http://schemas.openxmlformats.org/drawingml/2006/picture">
+                <pic:pic xmlns:pic="http://schemas.openxmlformats.org/drawingml/2006/picture">
+                  <pic:nvPicPr>
+                    <pic:cNvPr id="799944028" name=""/>
+                    <pic:cNvPicPr/>
+                  </pic:nvPicPr>
+                  <pic:blipFill>
+                    <a:blip r:embed="rId19"/>
+                    <a:stretch>
+                      <a:fillRect/>
+                    </a:stretch>
+                  </pic:blipFill>
+                  <pic:spPr>
+                    <a:xfrm>
+                      <a:off x="0" y="0"/>
+                      <a:ext cx="5943600" cy="1285240"/>
+                    </a:xfrm>
+                    <a:prstGeom prst="rect">
+                      <a:avLst/>
+                    </a:prstGeom>
+                  </pic:spPr>
+                </pic:pic>
+              </a:graphicData>
+            </a:graphic>
+          </wp:inline>
+        </w:drawing>
+      </w:r>
+    </w:p>
+    <w:p>
+      <w:pPr>
+        <w:ind w:left="0" w:firstLine="0"/>
+      </w:pPr>
+      <w:r>
+        <w:rPr>
+          <w:highlight w:val="yellow"/>
+        </w:rPr>
+        <w:t>Method overriding</w:t>
+      </w:r>
+    </w:p>
+    <w:p>
+      <w:pPr>
+        <w:ind w:left="0" w:firstLine="0"/>
+      </w:pPr>
+      <w:r>
+        <w:t>It makes a single method to give multiple result, it is achieved using same method name and signature but different logics in the subclass</w:t>
+      </w:r>
+    </w:p>
+    <w:p>
+      <w:pPr>
+        <w:ind w:left="0" w:firstLine="0"/>
+      </w:pPr>
+      <w:r>
+        <w:rPr>
+          <w:noProof/>
+        </w:rPr>
+        <w:drawing>
+          <wp:inline distT="0" distB="0" distL="0" distR="0" wp14:anchorId="47E20BD5" wp14:editId="77F7FCB1">
+            <wp:extent cx="5943600" cy="4179570"/>
+            <wp:effectExtent l="0" t="0" r="0" b="0"/>
+            <wp:docPr id="1796755067" name="Picture 1"/>
+            <wp:cNvGraphicFramePr>
+              <a:graphicFrameLocks xmlns:a="http://schemas.openxmlformats.org/drawingml/2006/main" noChangeAspect="1"/>
+            </wp:cNvGraphicFramePr>
+            <a:graphic xmlns:a="http://schemas.openxmlformats.org/drawingml/2006/main">
+              <a:graphicData uri="http://schemas.openxmlformats.org/drawingml/2006/picture">
+                <pic:pic xmlns:pic="http://schemas.openxmlformats.org/drawingml/2006/picture">
+                  <pic:nvPicPr>
+                    <pic:cNvPr id="1796755067" name=""/>
+                    <pic:cNvPicPr/>
+                  </pic:nvPicPr>
+                  <pic:blipFill>
+                    <a:blip r:embed="rId20"/>
+                    <a:stretch>
+                      <a:fillRect/>
+                    </a:stretch>
+                  </pic:blipFill>
+                  <pic:spPr>
+                    <a:xfrm>
+                      <a:off x="0" y="0"/>
+                      <a:ext cx="5943600" cy="4179570"/>
+                    </a:xfrm>
+                    <a:prstGeom prst="rect">
+                      <a:avLst/>
+                    </a:prstGeom>
+                  </pic:spPr>
+                </pic:pic>
+              </a:graphicData>
+            </a:graphic>
+          </wp:inline>
+        </w:drawing>
+      </w:r>
+    </w:p>
+    <w:p>
+      <w:pPr>
+        <w:ind w:left="0" w:firstLine="0"/>
+      </w:pPr>
+      <w:r>
+        <w:rPr>
+          <w:noProof/>
+        </w:rPr>
+        <w:lastRenderedPageBreak/>
+        <w:drawing>
+          <wp:inline distT="0" distB="0" distL="0" distR="0" wp14:anchorId="0BF545C9" wp14:editId="312AB475">
+            <wp:extent cx="5943600" cy="2963545"/>
+            <wp:effectExtent l="0" t="0" r="0" b="8255"/>
+            <wp:docPr id="768394228" name="Picture 1"/>
+            <wp:cNvGraphicFramePr>
+              <a:graphicFrameLocks xmlns:a="http://schemas.openxmlformats.org/drawingml/2006/main" noChangeAspect="1"/>
+            </wp:cNvGraphicFramePr>
+            <a:graphic xmlns:a="http://schemas.openxmlformats.org/drawingml/2006/main">
+              <a:graphicData uri="http://schemas.openxmlformats.org/drawingml/2006/picture">
+                <pic:pic xmlns:pic="http://schemas.openxmlformats.org/drawingml/2006/picture">
+                  <pic:nvPicPr>
+                    <pic:cNvPr id="768394228" name=""/>
+                    <pic:cNvPicPr/>
+                  </pic:nvPicPr>
+                  <pic:blipFill>
+                    <a:blip r:embed="rId21"/>
+                    <a:stretch>
+                      <a:fillRect/>
+                    </a:stretch>
+                  </pic:blipFill>
+                  <pic:spPr>
+                    <a:xfrm>
+                      <a:off x="0" y="0"/>
+                      <a:ext cx="5943600" cy="2963545"/>
+                    </a:xfrm>
+                    <a:prstGeom prst="rect">
+                      <a:avLst/>
+                    </a:prstGeom>
+                  </pic:spPr>
+                </pic:pic>
+              </a:graphicData>
+            </a:graphic>
+          </wp:inline>
+        </w:drawing>
+      </w:r>
+    </w:p>
+    <w:p>
+      <w:pPr>
+        <w:ind w:left="0" w:firstLine="0"/>
+      </w:pPr>
+      <w:r>
+        <w:rPr>
+          <w:noProof/>
+        </w:rPr>
+        <w:drawing>
+          <wp:inline distT="0" distB="0" distL="0" distR="0" wp14:anchorId="7ADA8716" wp14:editId="7AB29E36">
+            <wp:extent cx="5943600" cy="3331210"/>
+            <wp:effectExtent l="0" t="0" r="0" b="2540"/>
+            <wp:docPr id="1789527655" name="Picture 1"/>
+            <wp:cNvGraphicFramePr>
+              <a:graphicFrameLocks xmlns:a="http://schemas.openxmlformats.org/drawingml/2006/main" noChangeAspect="1"/>
+            </wp:cNvGraphicFramePr>
+            <a:graphic xmlns:a="http://schemas.openxmlformats.org/drawingml/2006/main">
+              <a:graphicData uri="http://schemas.openxmlformats.org/drawingml/2006/picture">
+                <pic:pic xmlns:pic="http://schemas.openxmlformats.org/drawingml/2006/picture">
+                  <pic:nvPicPr>
+                    <pic:cNvPr id="1789527655" name=""/>
+                    <pic:cNvPicPr/>
+                  </pic:nvPicPr>
+                  <pic:blipFill>
+                    <a:blip r:embed="rId22"/>
+                    <a:stretch>
+                      <a:fillRect/>
+                    </a:stretch>
+                  </pic:blipFill>
+                  <pic:spPr>
+                    <a:xfrm>
+                      <a:off x="0" y="0"/>
+                      <a:ext cx="5943600" cy="3331210"/>
+                    </a:xfrm>
+                    <a:prstGeom prst="rect">
+                      <a:avLst/>
+                    </a:prstGeom>
+                  </pic:spPr>
+                </pic:pic>
+              </a:graphicData>
+            </a:graphic>
+          </wp:inline>
+        </w:drawing>
+      </w:r>
+    </w:p>
+    <w:p>
+      <w:pPr>
+        <w:ind w:left="0" w:firstLine="0"/>
+      </w:pPr>
+      <w:r>
+        <w:rPr>
+          <w:noProof/>
+        </w:rPr>
+        <w:lastRenderedPageBreak/>
+        <w:drawing>
+          <wp:inline distT="0" distB="0" distL="0" distR="0" wp14:anchorId="3C3C9035" wp14:editId="1E796B84">
+            <wp:extent cx="5943600" cy="3307080"/>
+            <wp:effectExtent l="0" t="0" r="0" b="7620"/>
+            <wp:docPr id="1430716151" name="Picture 1"/>
+            <wp:cNvGraphicFramePr>
+              <a:graphicFrameLocks xmlns:a="http://schemas.openxmlformats.org/drawingml/2006/main" noChangeAspect="1"/>
+            </wp:cNvGraphicFramePr>
+            <a:graphic xmlns:a="http://schemas.openxmlformats.org/drawingml/2006/main">
+              <a:graphicData uri="http://schemas.openxmlformats.org/drawingml/2006/picture">
+                <pic:pic xmlns:pic="http://schemas.openxmlformats.org/drawingml/2006/picture">
+                  <pic:nvPicPr>
+                    <pic:cNvPr id="1430716151" name=""/>
+                    <pic:cNvPicPr/>
+                  </pic:nvPicPr>
+                  <pic:blipFill>
+                    <a:blip r:embed="rId23"/>
+                    <a:stretch>
+                      <a:fillRect/>
+                    </a:stretch>
+                  </pic:blipFill>
+                  <pic:spPr>
+                    <a:xfrm>
+                      <a:off x="0" y="0"/>
+                      <a:ext cx="5943600" cy="3307080"/>
+                    </a:xfrm>
+                    <a:prstGeom prst="rect">
+                      <a:avLst/>
+                    </a:prstGeom>
+                  </pic:spPr>
+                </pic:pic>
+              </a:graphicData>
+            </a:graphic>
+          </wp:inline>
+        </w:drawing>
+      </w:r>
+    </w:p>
+    <w:p>
+      <w:pPr>
+        <w:ind w:left="0" w:firstLine="0"/>
+      </w:pPr>
+      <w:r>
+        <w:rPr>
+          <w:highlight w:val="yellow"/>
+        </w:rPr>
+        <w:t>Abstraction:</w:t>
+      </w:r>
+      <w:r>
+        <w:t xml:space="preserve"> It hides the unnecessary details from the client and shows only the necessary details so that client doesn’t need to modify their code</w:t>
+      </w:r>
+    </w:p>
+    <w:p>
+      <w:pPr>
+        <w:ind w:left="0" w:firstLine="0"/>
+      </w:pPr>
+      <w:r>
+        <w:t>You can achieve abstraction in 2 ways</w:t>
+      </w:r>
+    </w:p>
+    <w:p>
+      <w:pPr>
+        <w:pStyle w:val="ListParagraph"/>
+        <w:numPr>
+          <w:ilvl w:val="0"/>
+          <w:numId w:val="9"/>
+        </w:numPr>
+      </w:pPr>
+      <w:r>
+        <w:t>interface - complete abstraction</w:t>
+      </w:r>
+    </w:p>
+    <w:p>
+      <w:pPr>
+        <w:pStyle w:val="ListParagraph"/>
+        <w:numPr>
+          <w:ilvl w:val="0"/>
+          <w:numId w:val="9"/>
+        </w:numPr>
+      </w:pPr>
+      <w:r>
+        <w:t>abstract class - partial abstraction</w:t>
+      </w:r>
+    </w:p>
+    <w:p>
+      <w:pPr>
+        <w:ind w:left="0" w:firstLine="0"/>
+      </w:pPr>
+      <w:r>
+        <w:t>interface - it is like a contract between two programs</w:t>
+      </w:r>
+    </w:p>
+    <w:p>
+      <w:pPr>
+        <w:ind w:left="0" w:firstLine="0"/>
+      </w:pPr>
+      <w:r>
+        <w:rPr>
+          <w:noProof/>
+        </w:rPr>
+        <w:lastRenderedPageBreak/>
+        <w:drawing>
+          <wp:inline distT="0" distB="0" distL="0" distR="0" wp14:anchorId="7FF5E628" wp14:editId="33131CAA">
+            <wp:extent cx="5943600" cy="4184650"/>
+            <wp:effectExtent l="0" t="0" r="0" b="6350"/>
+            <wp:docPr id="1055811291" name="Picture 1"/>
+            <wp:cNvGraphicFramePr>
+              <a:graphicFrameLocks xmlns:a="http://schemas.openxmlformats.org/drawingml/2006/main" noChangeAspect="1"/>
+            </wp:cNvGraphicFramePr>
+            <a:graphic xmlns:a="http://schemas.openxmlformats.org/drawingml/2006/main">
+              <a:graphicData uri="http://schemas.openxmlformats.org/drawingml/2006/picture">
+                <pic:pic xmlns:pic="http://schemas.openxmlformats.org/drawingml/2006/picture">
+                  <pic:nvPicPr>
+                    <pic:cNvPr id="1055811291" name=""/>
+                    <pic:cNvPicPr/>
+                  </pic:nvPicPr>
+                  <pic:blipFill>
+                    <a:blip r:embed="rId24"/>
+                    <a:stretch>
+                      <a:fillRect/>
+                    </a:stretch>
+                  </pic:blipFill>
+                  <pic:spPr>
+                    <a:xfrm>
+                      <a:off x="0" y="0"/>
+                      <a:ext cx="5943600" cy="4184650"/>
+                    </a:xfrm>
+                    <a:prstGeom prst="rect">
+                      <a:avLst/>
+                    </a:prstGeom>
+                  </pic:spPr>
+                </pic:pic>
+              </a:graphicData>
+            </a:graphic>
+          </wp:inline>
+        </w:drawing>
+      </w:r>
+    </w:p>
+    <w:p>
+      <w:pPr>
+        <w:ind w:left="0" w:firstLine="0"/>
+      </w:pPr>
+      <w:r>
+        <w:rPr>
+          <w:highlight w:val="yellow"/>
+        </w:rPr>
+        <w:t>Abstract class:</w:t>
+      </w:r>
+    </w:p>
+    <w:p>
+      <w:pPr>
+        <w:ind w:left="0" w:firstLine="0"/>
+      </w:pPr>
+      <w:r>
+        <w:t>It is used for partial abstraction when you want some methods to be implemented and some methods to be declared</w:t>
+      </w:r>
+      <w:r>
+        <w:t>, the scenario of abstract class occur when a class cannot fully implement all the methods but wants subclasses to have the methods present in the super class or interface</w:t>
+      </w:r>
+    </w:p>
+    <w:p>
+      <w:pPr>
+        <w:ind w:left="0" w:firstLine="0"/>
+      </w:pPr>
+      <w:r>
+        <w:rPr>
+          <w:noProof/>
+        </w:rPr>
+        <w:lastRenderedPageBreak/>
+        <w:drawing>
+          <wp:inline distT="0" distB="0" distL="0" distR="0" wp14:anchorId="61032320" wp14:editId="27B999A6">
+            <wp:extent cx="5943600" cy="5036820"/>
+            <wp:effectExtent l="0" t="0" r="0" b="0"/>
+            <wp:docPr id="1102511086" name="Picture 1"/>
+            <wp:cNvGraphicFramePr>
+              <a:graphicFrameLocks xmlns:a="http://schemas.openxmlformats.org/drawingml/2006/main" noChangeAspect="1"/>
+            </wp:cNvGraphicFramePr>
+            <a:graphic xmlns:a="http://schemas.openxmlformats.org/drawingml/2006/main">
+              <a:graphicData uri="http://schemas.openxmlformats.org/drawingml/2006/picture">
+                <pic:pic xmlns:pic="http://schemas.openxmlformats.org/drawingml/2006/picture">
+                  <pic:nvPicPr>
+                    <pic:cNvPr id="1102511086" name=""/>
+                    <pic:cNvPicPr/>
+                  </pic:nvPicPr>
+                  <pic:blipFill>
+                    <a:blip r:embed="rId25"/>
+                    <a:stretch>
+                      <a:fillRect/>
+                    </a:stretch>
+                  </pic:blipFill>
+                  <pic:spPr>
+                    <a:xfrm>
+                      <a:off x="0" y="0"/>
+                      <a:ext cx="5943600" cy="5036820"/>
+                    </a:xfrm>
+                    <a:prstGeom prst="rect">
+                      <a:avLst/>
+                    </a:prstGeom>
+                  </pic:spPr>
+                </pic:pic>
+              </a:graphicData>
+            </a:graphic>
+          </wp:inline>
+        </w:drawing>
+      </w:r>
+      <w:r>
+        <w:rPr>
+          <w:noProof/>
+        </w:rPr>
+        <w:drawing>
+          <wp:inline distT="0" distB="0" distL="0" distR="0" wp14:anchorId="13DEF1E6" wp14:editId="3EE73FA5">
+            <wp:extent cx="5943600" cy="1415415"/>
+            <wp:effectExtent l="0" t="0" r="0" b="0"/>
+            <wp:docPr id="317967950" name="Picture 1"/>
+            <wp:cNvGraphicFramePr>
+              <a:graphicFrameLocks xmlns:a="http://schemas.openxmlformats.org/drawingml/2006/main" noChangeAspect="1"/>
+            </wp:cNvGraphicFramePr>
+            <a:graphic xmlns:a="http://schemas.openxmlformats.org/drawingml/2006/main">
+              <a:graphicData uri="http://schemas.openxmlformats.org/drawingml/2006/picture">
+                <pic:pic xmlns:pic="http://schemas.openxmlformats.org/drawingml/2006/picture">
+                  <pic:nvPicPr>
+                    <pic:cNvPr id="317967950" name=""/>
+                    <pic:cNvPicPr/>
+                  </pic:nvPicPr>
+                  <pic:blipFill>
+                    <a:blip r:embed="rId26"/>
+                    <a:stretch>
+                      <a:fillRect/>
+                    </a:stretch>
+                  </pic:blipFill>
+                  <pic:spPr>
+                    <a:xfrm>
+                      <a:off x="0" y="0"/>
+                      <a:ext cx="5943600" cy="1415415"/>
+                    </a:xfrm>
+                    <a:prstGeom prst="rect">
+                      <a:avLst/>
+                    </a:prstGeom>
+                  </pic:spPr>
+                </pic:pic>
+              </a:graphicData>
+            </a:graphic>
+          </wp:inline>
+        </w:drawing>
+      </w:r>
+    </w:p>
+    <w:p>
+      <w:pPr>
+        <w:ind w:left="0" w:firstLine="0"/>
+      </w:pPr>
+    </w:p>
+    <w:p>
+      <w:pPr>
+        <w:ind w:left="0" w:firstLine="0"/>
+      </w:pPr>
+    </w:p>
+    <w:p>
+      <w:pPr>
+        <w:ind w:left="0" w:firstLine="0"/>
+      </w:pPr>
+    </w:p>
+    <w:p>
+      <w:pPr>
+        <w:ind w:left="0" w:firstLine="0"/>
+      </w:pPr>
+    </w:p>
+    <w:p>
+      <w:pPr>
+        <w:ind w:left="0" w:firstLine="0"/>
+      </w:pPr>
+      <w:r>
+        <w:rPr>
+          <w:highlight w:val="yellow"/>
+        </w:rPr>
+        <w:lastRenderedPageBreak/>
+        <w:t>Important notes on interfaces &amp; abstract classes</w:t>
+      </w:r>
+    </w:p>
+    <w:tbl>
+      <w:tblPr>
+        <w:tblStyle w:val="TableGrid"/>
+        <w:tblW w:w="0" w:type="auto"/>
+        <w:tblLook w:val="04A0" w:firstRow="1" w:lastRow="0" w:firstColumn="1" w:lastColumn="0" w:noHBand="0" w:noVBand="1"/>
+      </w:tblPr>
+      <w:tblGrid>
+        <w:gridCol w:w="4675"/>
+        <w:gridCol w:w="4675"/>
+      </w:tblGrid>
+      <w:tr>
+        <w:tc>
+          <w:tcPr>
+            <w:tcW w:w="4675" w:type="dxa"/>
+          </w:tcPr>
+          <w:p>
+            <w:pPr>
+              <w:ind w:left="0" w:firstLine="0"/>
+              <w:rPr>
+                <w:highlight w:val="yellow"/>
+              </w:rPr>
+            </w:pPr>
+            <w:r>
+              <w:rPr>
+                <w:highlight w:val="yellow"/>
+              </w:rPr>
+              <w:t>interfaces</w:t>
+            </w:r>
+          </w:p>
+        </w:tc>
+        <w:tc>
+          <w:tcPr>
+            <w:tcW w:w="4675" w:type="dxa"/>
+          </w:tcPr>
+          <w:p>
+            <w:pPr>
+              <w:ind w:left="0" w:firstLine="0"/>
+            </w:pPr>
+            <w:r>
+              <w:rPr>
+                <w:highlight w:val="yellow"/>
+              </w:rPr>
+              <w:t>abstract classes</w:t>
+            </w:r>
+          </w:p>
+        </w:tc>
+      </w:tr>
+      <w:tr>
+        <w:tc>
+          <w:tcPr>
+            <w:tcW w:w="4675" w:type="dxa"/>
+          </w:tcPr>
+          <w:p>
+            <w:pPr>
+              <w:ind w:left="0" w:firstLine="0"/>
+            </w:pPr>
+            <w:r>
+              <w:t>You can’t create object of an interface</w:t>
+            </w:r>
+          </w:p>
+        </w:tc>
+        <w:tc>
+          <w:tcPr>
+            <w:tcW w:w="4675" w:type="dxa"/>
+          </w:tcPr>
+          <w:p>
+            <w:pPr>
+              <w:ind w:left="0" w:firstLine="0"/>
+            </w:pPr>
+            <w:r>
+              <w:t>You can’t create object of an abstract class</w:t>
+            </w:r>
+          </w:p>
+        </w:tc>
+      </w:tr>
+      <w:tr>
+        <w:tc>
+          <w:tcPr>
+            <w:tcW w:w="4675" w:type="dxa"/>
+          </w:tcPr>
+          <w:p>
+            <w:pPr>
+              <w:ind w:left="0" w:firstLine="0"/>
+            </w:pPr>
+            <w:r>
+              <w:t xml:space="preserve">You can’t have constructors </w:t>
+            </w:r>
+          </w:p>
+        </w:tc>
+        <w:tc>
+          <w:tcPr>
+            <w:tcW w:w="4675" w:type="dxa"/>
+          </w:tcPr>
+          <w:p>
+            <w:pPr>
+              <w:ind w:left="0" w:firstLine="0"/>
+            </w:pPr>
+            <w:r>
+              <w:t>You can have constructors</w:t>
+            </w:r>
+          </w:p>
+        </w:tc>
+      </w:tr>
+      <w:tr>
+        <w:tc>
+          <w:tcPr>
+            <w:tcW w:w="4675" w:type="dxa"/>
+          </w:tcPr>
+          <w:p>
+            <w:pPr>
+              <w:ind w:left="0" w:firstLine="0"/>
+            </w:pPr>
+            <w:r>
+              <w:t>All the members are public by default</w:t>
+            </w:r>
+          </w:p>
+        </w:tc>
+        <w:tc>
+          <w:tcPr>
+            <w:tcW w:w="4675" w:type="dxa"/>
+          </w:tcPr>
+          <w:p>
+            <w:pPr>
+              <w:ind w:left="0" w:firstLine="0"/>
+            </w:pPr>
+            <w:r>
+              <w:t>Members need to explicitly have the keywords to specify the visibility</w:t>
+            </w:r>
+          </w:p>
+        </w:tc>
+      </w:tr>
+      <w:tr>
+        <w:tc>
+          <w:tcPr>
+            <w:tcW w:w="4675" w:type="dxa"/>
+          </w:tcPr>
+          <w:p>
+            <w:pPr>
+              <w:ind w:left="0" w:firstLine="0"/>
+            </w:pPr>
+            <w:r>
+              <w:t>Variables are constants by default they automatically become final and static</w:t>
+            </w:r>
+          </w:p>
+        </w:tc>
+        <w:tc>
+          <w:tcPr>
+            <w:tcW w:w="4675" w:type="dxa"/>
+          </w:tcPr>
+          <w:p>
+            <w:pPr>
+              <w:ind w:left="0" w:firstLine="0"/>
+            </w:pPr>
+            <w:r>
+              <w:t>Variables are not constants by default</w:t>
+            </w:r>
+          </w:p>
+        </w:tc>
+      </w:tr>
+      <w:tr>
+        <w:tc>
+          <w:tcPr>
+            <w:tcW w:w="4675" w:type="dxa"/>
+          </w:tcPr>
+          <w:p>
+            <w:pPr>
+              <w:ind w:left="0" w:firstLine="0"/>
+            </w:pPr>
+            <w:r>
+              <w:t>Methods are abstract by default</w:t>
+            </w:r>
+          </w:p>
+        </w:tc>
+        <w:tc>
+          <w:tcPr>
+            <w:tcW w:w="4675" w:type="dxa"/>
+          </w:tcPr>
+          <w:p>
+            <w:pPr>
+              <w:ind w:left="0" w:firstLine="0"/>
+            </w:pPr>
+            <w:r>
+              <w:t>Methods are not abstract by default, you must explicitly use abstract keyword.</w:t>
+            </w:r>
+          </w:p>
+        </w:tc>
+      </w:tr>
+      <w:tr>
+        <w:tc>
+          <w:tcPr>
+            <w:tcW w:w="4675" w:type="dxa"/>
+          </w:tcPr>
+          <w:p>
+            <w:pPr>
+              <w:ind w:left="0" w:firstLine="0"/>
+            </w:pPr>
+            <w:r>
+              <w:t>Full abstraction</w:t>
+            </w:r>
+          </w:p>
+        </w:tc>
+        <w:tc>
+          <w:tcPr>
+            <w:tcW w:w="4675" w:type="dxa"/>
+          </w:tcPr>
+          <w:p>
+            <w:pPr>
+              <w:ind w:left="0" w:firstLine="0"/>
+            </w:pPr>
+            <w:r>
+              <w:t>Partial abstraction</w:t>
+            </w:r>
+          </w:p>
+        </w:tc>
+      </w:tr>
+      <w:tr>
+        <w:tc>
+          <w:tcPr>
+            <w:tcW w:w="4675" w:type="dxa"/>
+          </w:tcPr>
+          <w:p>
+            <w:pPr>
+              <w:ind w:left="0" w:firstLine="0"/>
+            </w:pPr>
+            <w:r>
+              <w:t>Used basically to define the contract</w:t>
+            </w:r>
+          </w:p>
+        </w:tc>
+        <w:tc>
+          <w:tcPr>
+            <w:tcW w:w="4675" w:type="dxa"/>
+          </w:tcPr>
+          <w:p>
+            <w:pPr>
+              <w:ind w:left="0" w:firstLine="0"/>
+            </w:pPr>
+            <w:r>
+              <w:t>Not used for contracts</w:t>
+            </w:r>
+          </w:p>
+        </w:tc>
+      </w:tr>
+      <w:tr>
+        <w:tc>
+          <w:tcPr>
+            <w:tcW w:w="4675" w:type="dxa"/>
+          </w:tcPr>
+          <w:p>
+            <w:pPr>
+              <w:ind w:left="0" w:firstLine="0"/>
+            </w:pPr>
+            <w:r>
+              <w:t>interface can extend more than one interfaces - multiple inheritance</w:t>
+            </w:r>
+          </w:p>
+        </w:tc>
+        <w:tc>
+          <w:tcPr>
+            <w:tcW w:w="4675" w:type="dxa"/>
+          </w:tcPr>
+          <w:p>
+            <w:pPr>
+              <w:ind w:left="0" w:firstLine="0"/>
+            </w:pPr>
+            <w:r>
+              <w:t>abstract class can maximum extend one class but it can implement multiple interfaces</w:t>
+            </w:r>
+          </w:p>
+        </w:tc>
+      </w:tr>
+    </w:tbl>
+    <w:p>
+      <w:pPr>
+        <w:ind w:left="0" w:firstLine="0"/>
+      </w:pPr>
+    </w:p>
+    <w:p>
+      <w:pPr>
+        <w:ind w:left="0" w:firstLine="0"/>
+      </w:pPr>
+      <w:r>
+        <w:rPr>
+          <w:highlight w:val="yellow"/>
+        </w:rPr>
+        <w:t>Built-in classes</w:t>
+      </w:r>
+    </w:p>
+    <w:p>
+      <w:pPr>
+        <w:pStyle w:val="ListParagraph"/>
+        <w:numPr>
+          <w:ilvl w:val="0"/>
+          <w:numId w:val="10"/>
+        </w:numPr>
+      </w:pPr>
+      <w:r>
+        <w:t>String</w:t>
+      </w:r>
+    </w:p>
+    <w:p>
+      <w:pPr>
+        <w:pStyle w:val="ListParagraph"/>
+        <w:numPr>
+          <w:ilvl w:val="0"/>
+          <w:numId w:val="10"/>
+        </w:numPr>
+      </w:pPr>
+      <w:r>
+        <w:t>StringBuffer / StringBuilder</w:t>
+      </w:r>
+    </w:p>
+    <w:p>
+      <w:pPr>
+        <w:pStyle w:val="ListParagraph"/>
+        <w:numPr>
+          <w:ilvl w:val="0"/>
+          <w:numId w:val="10"/>
+        </w:numPr>
+      </w:pPr>
+      <w:r>
+        <w:t>Wrapper classes - Byte, Short, Integer, Long, Float, Double, Character, Boolean</w:t>
+      </w:r>
+    </w:p>
+    <w:p>
+      <w:pPr>
+        <w:ind w:left="0" w:firstLine="0"/>
+      </w:pPr>
+      <w:r>
+        <w:rPr>
+          <w:highlight w:val="yellow"/>
+        </w:rPr>
+        <w:t>String creates immutable objects</w:t>
+      </w:r>
+    </w:p>
+    <w:p>
+      <w:pPr>
+        <w:ind w:left="0" w:firstLine="0"/>
+      </w:pPr>
+      <w:r>
+        <w:rPr>
+          <w:noProof/>
+        </w:rPr>
+        <w:lastRenderedPageBreak/>
+        <w:drawing>
+          <wp:inline distT="0" distB="0" distL="0" distR="0" wp14:anchorId="2F55B224" wp14:editId="648AD59A">
+            <wp:extent cx="5943600" cy="4003040"/>
+            <wp:effectExtent l="0" t="0" r="0" b="0"/>
+            <wp:docPr id="52830310" name="Picture 1"/>
+            <wp:cNvGraphicFramePr>
+              <a:graphicFrameLocks xmlns:a="http://schemas.openxmlformats.org/drawingml/2006/main" noChangeAspect="1"/>
+            </wp:cNvGraphicFramePr>
+            <a:graphic xmlns:a="http://schemas.openxmlformats.org/drawingml/2006/main">
+              <a:graphicData uri="http://schemas.openxmlformats.org/drawingml/2006/picture">
+                <pic:pic xmlns:pic="http://schemas.openxmlformats.org/drawingml/2006/picture">
+                  <pic:nvPicPr>
+                    <pic:cNvPr id="52830310" name=""/>
+                    <pic:cNvPicPr/>
+                  </pic:nvPicPr>
+                  <pic:blipFill>
+                    <a:blip r:embed="rId27"/>
+                    <a:stretch>
+                      <a:fillRect/>
+                    </a:stretch>
+                  </pic:blipFill>
+                  <pic:spPr>
+                    <a:xfrm>
+                      <a:off x="0" y="0"/>
+                      <a:ext cx="5943600" cy="4003040"/>
+                    </a:xfrm>
+                    <a:prstGeom prst="rect">
+                      <a:avLst/>
+                    </a:prstGeom>
+                  </pic:spPr>
+                </pic:pic>
+              </a:graphicData>
+            </a:graphic>
+          </wp:inline>
+        </w:drawing>
+      </w:r>
+    </w:p>
+    <w:p>
+      <w:pPr>
+        <w:ind w:left="0" w:firstLine="0"/>
+      </w:pPr>
+      <w:r>
+        <w:rPr>
+          <w:highlight w:val="yellow"/>
+        </w:rPr>
+        <w:t>Project</w:t>
+      </w:r>
+    </w:p>
+    <w:p>
+      <w:pPr>
+        <w:pStyle w:val="ListParagraph"/>
+        <w:numPr>
+          <w:ilvl w:val="0"/>
+          <w:numId w:val="11"/>
+        </w:numPr>
+      </w:pPr>
+      <w:r>
+        <w:t xml:space="preserve">We must able to manage students </w:t>
+      </w:r>
+    </w:p>
+    <w:p>
+      <w:pPr>
+        <w:pStyle w:val="ListParagraph"/>
+        <w:numPr>
+          <w:ilvl w:val="0"/>
+          <w:numId w:val="11"/>
+        </w:numPr>
+      </w:pPr>
+      <w:r>
+        <w:t>Add students</w:t>
+      </w:r>
+    </w:p>
+    <w:p>
+      <w:pPr>
+        <w:pStyle w:val="ListParagraph"/>
+        <w:numPr>
+          <w:ilvl w:val="0"/>
+          <w:numId w:val="11"/>
+        </w:numPr>
+      </w:pPr>
+      <w:r>
+        <w:t>Retrieve student based on id</w:t>
+      </w:r>
+    </w:p>
+    <w:p>
+      <w:pPr>
+        <w:pStyle w:val="ListParagraph"/>
+        <w:numPr>
+          <w:ilvl w:val="0"/>
+          <w:numId w:val="11"/>
+        </w:numPr>
+      </w:pPr>
+      <w:r>
+        <w:t>Retrieve all the students</w:t>
+      </w:r>
+    </w:p>
+    <w:p>
+      <w:pPr>
+        <w:pStyle w:val="ListParagraph"/>
+        <w:numPr>
+          <w:ilvl w:val="0"/>
+          <w:numId w:val="11"/>
+        </w:numPr>
+      </w:pPr>
+      <w:r>
+        <w:t>Update student progress report based on the id</w:t>
+      </w:r>
+    </w:p>
+    <w:p>
+      <w:pPr>
+        <w:pStyle w:val="ListParagraph"/>
+        <w:numPr>
+          <w:ilvl w:val="0"/>
+          <w:numId w:val="11"/>
+        </w:numPr>
+      </w:pPr>
+      <w:r>
+        <w:t>Delete student based on the id</w:t>
+      </w:r>
+    </w:p>
+    <w:p>
+      <w:pPr>
+        <w:pStyle w:val="ListParagraph"/>
+        <w:numPr>
+          <w:ilvl w:val="0"/>
+          <w:numId w:val="11"/>
+        </w:numPr>
+      </w:pPr>
+      <w:r>
+        <w:t>Sort the students based on the report</w:t>
+      </w:r>
+    </w:p>
+    <w:p>
+      <w:pPr>
+        <w:ind w:left="0" w:firstLine="0"/>
+      </w:pPr>
+      <w:r>
+        <w:rPr>
+          <w:noProof/>
+        </w:rPr>
+        <w:lastRenderedPageBreak/>
+        <w:drawing>
+          <wp:inline distT="0" distB="0" distL="0" distR="0" wp14:anchorId="6D50ECC0" wp14:editId="398A95E7">
+            <wp:extent cx="5943600" cy="3509010"/>
+            <wp:effectExtent l="0" t="0" r="0" b="0"/>
+            <wp:docPr id="2059465835" name="Picture 1"/>
+            <wp:cNvGraphicFramePr>
+              <a:graphicFrameLocks xmlns:a="http://schemas.openxmlformats.org/drawingml/2006/main" noChangeAspect="1"/>
+            </wp:cNvGraphicFramePr>
+            <a:graphic xmlns:a="http://schemas.openxmlformats.org/drawingml/2006/main">
+              <a:graphicData uri="http://schemas.openxmlformats.org/drawingml/2006/picture">
+                <pic:pic xmlns:pic="http://schemas.openxmlformats.org/drawingml/2006/picture">
+                  <pic:nvPicPr>
+                    <pic:cNvPr id="2059465835" name=""/>
+                    <pic:cNvPicPr/>
+                  </pic:nvPicPr>
+                  <pic:blipFill>
+                    <a:blip r:embed="rId28"/>
+                    <a:stretch>
+                      <a:fillRect/>
+                    </a:stretch>
+                  </pic:blipFill>
+                  <pic:spPr>
+                    <a:xfrm>
+                      <a:off x="0" y="0"/>
+                      <a:ext cx="5943600" cy="3509010"/>
+                    </a:xfrm>
+                    <a:prstGeom prst="rect">
+                      <a:avLst/>
+                    </a:prstGeom>
+                  </pic:spPr>
+                </pic:pic>
+              </a:graphicData>
+            </a:graphic>
+          </wp:inline>
+        </w:drawing>
+      </w:r>
+    </w:p>
+    <w:p>
+      <w:pPr>
+        <w:ind w:left="0" w:firstLine="0"/>
+      </w:pPr>
+      <w:r>
+        <w:rPr>
+          <w:highlight w:val="yellow"/>
+        </w:rPr>
+        <w:t>Collection Framework</w:t>
+      </w:r>
+    </w:p>
+    <w:p>
+      <w:pPr>
+        <w:ind w:left="0" w:firstLine="0"/>
+      </w:pPr>
+      <w:r>
+        <w:t>It is used to maintain data and it provides built-in implementations to manage the data in various way.</w:t>
+      </w:r>
+    </w:p>
+    <w:p>
+      <w:pPr>
+        <w:pStyle w:val="ListParagraph"/>
+        <w:numPr>
+          <w:ilvl w:val="0"/>
+          <w:numId w:val="13"/>
+        </w:numPr>
+      </w:pPr>
+      <w:r>
+        <w:t>List</w:t>
+      </w:r>
+      <w:r>
+        <w:t xml:space="preserve"> - maintains data based on index and supports duplicate</w:t>
+      </w:r>
+    </w:p>
+    <w:p>
+      <w:pPr>
+        <w:pStyle w:val="ListParagraph"/>
+        <w:numPr>
+          <w:ilvl w:val="0"/>
+          <w:numId w:val="13"/>
+        </w:numPr>
+      </w:pPr>
+      <w:r>
+        <w:t>Set</w:t>
+      </w:r>
+      <w:r>
+        <w:t xml:space="preserve"> - maintains only unique data</w:t>
+      </w:r>
+    </w:p>
+    <w:p>
+      <w:pPr>
+        <w:ind w:left="0" w:firstLine="0"/>
+        <w:rPr>
+          <w:color w:val="EE0000"/>
+        </w:rPr>
+      </w:pPr>
+      <w:r>
+        <w:t xml:space="preserve">List &amp; Set are the interfaces that extend Collection, it has methods like </w:t>
+      </w:r>
+      <w:r>
+        <w:rPr>
+          <w:color w:val="EE0000"/>
+        </w:rPr>
+        <w:t>- add(), remove(), iterator(), size(), clear(), isEmpty()</w:t>
+      </w:r>
+    </w:p>
+    <w:p>
+      <w:pPr>
+        <w:ind w:left="0" w:firstLine="0"/>
+      </w:pPr>
+      <w:r>
+        <w:t xml:space="preserve">List has following implementations </w:t>
+      </w:r>
+    </w:p>
+    <w:p>
+      <w:pPr>
+        <w:pStyle w:val="ListParagraph"/>
+        <w:numPr>
+          <w:ilvl w:val="0"/>
+          <w:numId w:val="14"/>
+        </w:numPr>
+      </w:pPr>
+      <w:r>
+        <w:t>ArrayList</w:t>
+      </w:r>
+    </w:p>
+    <w:p>
+      <w:pPr>
+        <w:pStyle w:val="ListParagraph"/>
+        <w:numPr>
+          <w:ilvl w:val="0"/>
+          <w:numId w:val="14"/>
+        </w:numPr>
+      </w:pPr>
+      <w:r>
+        <w:t>LinkedList</w:t>
+      </w:r>
+    </w:p>
+    <w:p>
+      <w:pPr>
+        <w:ind w:left="0" w:firstLine="0"/>
+      </w:pPr>
+      <w:r>
+        <w:t>Set has following implementations</w:t>
+      </w:r>
+    </w:p>
+    <w:p>
+      <w:pPr>
+        <w:pStyle w:val="ListParagraph"/>
+        <w:numPr>
+          <w:ilvl w:val="0"/>
+          <w:numId w:val="15"/>
+        </w:numPr>
+      </w:pPr>
+      <w:r>
+        <w:t>HashSet</w:t>
+      </w:r>
+    </w:p>
+    <w:p>
+      <w:pPr>
+        <w:pStyle w:val="ListParagraph"/>
+        <w:numPr>
+          <w:ilvl w:val="0"/>
+          <w:numId w:val="15"/>
+        </w:numPr>
+      </w:pPr>
+      <w:r>
+        <w:t>TreeSet</w:t>
+      </w:r>
+    </w:p>
+    <w:p>
+      <w:pPr>
+        <w:pStyle w:val="ListParagraph"/>
+        <w:numPr>
+          <w:ilvl w:val="0"/>
+          <w:numId w:val="15"/>
+        </w:numPr>
+      </w:pPr>
+      <w:r>
+        <w:t>LinkedHashSet</w:t>
+      </w:r>
+    </w:p>
+    <w:p>
+      <w:pPr>
+        <w:ind w:left="0" w:firstLine="0"/>
+      </w:pPr>
+      <w:r>
+        <w:rPr>
+          <w:highlight w:val="yellow"/>
+        </w:rPr>
+        <w:lastRenderedPageBreak/>
+        <w:t>Iterator</w:t>
+      </w:r>
+      <w:r>
+        <w:rPr>
+          <w:highlight w:val="yellow"/>
+        </w:rPr>
+        <w:t>&lt;T&gt;</w:t>
+      </w:r>
+      <w:r>
+        <w:rPr>
+          <w:highlight w:val="yellow"/>
+        </w:rPr>
+        <w:t>:</w:t>
+      </w:r>
+      <w:r>
+        <w:t xml:space="preserve"> It is special type of interface that can iterate the collection and provides methods to remove the data present in the collection, it has 3 methods</w:t>
+      </w:r>
+    </w:p>
+    <w:p>
+      <w:pPr>
+        <w:pStyle w:val="ListParagraph"/>
+        <w:numPr>
+          <w:ilvl w:val="0"/>
+          <w:numId w:val="16"/>
+        </w:numPr>
+      </w:pPr>
+      <w:r>
+        <w:t>hasNext(): checks if element is present to iterate</w:t>
+      </w:r>
+    </w:p>
+    <w:p>
+      <w:pPr>
+        <w:pStyle w:val="ListParagraph"/>
+        <w:numPr>
+          <w:ilvl w:val="0"/>
+          <w:numId w:val="16"/>
+        </w:numPr>
+      </w:pPr>
+      <w:r>
+        <w:t>next(): returns the iterated element</w:t>
+      </w:r>
+    </w:p>
+    <w:p>
+      <w:pPr>
+        <w:pStyle w:val="ListParagraph"/>
+        <w:numPr>
+          <w:ilvl w:val="0"/>
+          <w:numId w:val="16"/>
+        </w:numPr>
+      </w:pPr>
+      <w:r>
+        <w:t>remove(): removes the iterated element</w:t>
+      </w:r>
+    </w:p>
+    <w:p>
+      <w:pPr>
+        <w:ind w:left="0" w:firstLine="0"/>
+      </w:pPr>
+    </w:p>
+    <w:p>
+      <w:pPr>
+        <w:ind w:left="0" w:firstLine="0"/>
+      </w:pPr>
+      <w:r>
+        <w:rPr>
+          <w:highlight w:val="yellow"/>
+        </w:rPr>
+        <w:t>StudentRepo</w:t>
+      </w:r>
+    </w:p>
+    <w:p>
+      <w:pPr>
+        <w:ind w:left="0" w:firstLine="0"/>
+      </w:pPr>
+      <w:r>
+        <w:rPr>
+          <w:noProof/>
+        </w:rPr>
+        <w:drawing>
+          <wp:inline distT="0" distB="0" distL="0" distR="0" wp14:anchorId="34B8847F" wp14:editId="25BFBAB4">
+            <wp:extent cx="4816257" cy="3703641"/>
+            <wp:effectExtent l="0" t="0" r="3810" b="0"/>
+            <wp:docPr id="1703504189" name="Picture 1"/>
+            <wp:cNvGraphicFramePr>
+              <a:graphicFrameLocks xmlns:a="http://schemas.openxmlformats.org/drawingml/2006/main" noChangeAspect="1"/>
+            </wp:cNvGraphicFramePr>
+            <a:graphic xmlns:a="http://schemas.openxmlformats.org/drawingml/2006/main">
+              <a:graphicData uri="http://schemas.openxmlformats.org/drawingml/2006/picture">
+                <pic:pic xmlns:pic="http://schemas.openxmlformats.org/drawingml/2006/picture">
+                  <pic:nvPicPr>
+                    <pic:cNvPr id="1703504189" name=""/>
+                    <pic:cNvPicPr/>
+                  </pic:nvPicPr>
+                  <pic:blipFill>
+                    <a:blip r:embed="rId29"/>
+                    <a:stretch>
+                      <a:fillRect/>
+                    </a:stretch>
+                  </pic:blipFill>
+                  <pic:spPr>
+                    <a:xfrm>
+                      <a:off x="0" y="0"/>
+                      <a:ext cx="4816257" cy="3703641"/>
+                    </a:xfrm>
+                    <a:prstGeom prst="rect">
+                      <a:avLst/>
+                    </a:prstGeom>
+                  </pic:spPr>
+                </pic:pic>
+              </a:graphicData>
+            </a:graphic>
+          </wp:inline>
+        </w:drawing>
+      </w:r>
+    </w:p>
+    <w:p>
+      <w:pPr>
+        <w:ind w:left="0" w:firstLine="0"/>
+      </w:pPr>
+      <w:r>
+        <w:rPr>
+          <w:highlight w:val="yellow"/>
+        </w:rPr>
+        <w:t>List Implementation</w:t>
+      </w:r>
+    </w:p>
+    <w:p>
+      <w:pPr>
+        <w:ind w:left="0" w:firstLine="0"/>
+      </w:pPr>
+      <w:r>
+        <w:rPr>
+          <w:noProof/>
+        </w:rPr>
+        <w:lastRenderedPageBreak/>
+        <w:drawing>
+          <wp:inline distT="0" distB="0" distL="0" distR="0" wp14:anchorId="540B7AEB" wp14:editId="3F999DD9">
+            <wp:extent cx="5943600" cy="4850765"/>
+            <wp:effectExtent l="0" t="0" r="0" b="6985"/>
+            <wp:docPr id="1923910218" name="Picture 1"/>
+            <wp:cNvGraphicFramePr>
+              <a:graphicFrameLocks xmlns:a="http://schemas.openxmlformats.org/drawingml/2006/main" noChangeAspect="1"/>
+            </wp:cNvGraphicFramePr>
+            <a:graphic xmlns:a="http://schemas.openxmlformats.org/drawingml/2006/main">
+              <a:graphicData uri="http://schemas.openxmlformats.org/drawingml/2006/picture">
+                <pic:pic xmlns:pic="http://schemas.openxmlformats.org/drawingml/2006/picture">
+                  <pic:nvPicPr>
+                    <pic:cNvPr id="1923910218" name=""/>
+                    <pic:cNvPicPr/>
+                  </pic:nvPicPr>
+                  <pic:blipFill>
+                    <a:blip r:embed="rId30"/>
+                    <a:stretch>
+                      <a:fillRect/>
+                    </a:stretch>
+                  </pic:blipFill>
+                  <pic:spPr>
+                    <a:xfrm>
+                      <a:off x="0" y="0"/>
+                      <a:ext cx="5943600" cy="4850765"/>
+                    </a:xfrm>
+                    <a:prstGeom prst="rect">
+                      <a:avLst/>
+                    </a:prstGeom>
+                  </pic:spPr>
+                </pic:pic>
+              </a:graphicData>
+            </a:graphic>
+          </wp:inline>
+        </w:drawing>
+      </w:r>
+    </w:p>
+    <w:p>
+      <w:pPr>
+        <w:ind w:left="0" w:firstLine="0"/>
+      </w:pPr>
+    </w:p>
+    <w:p>
+      <w:pPr>
+        <w:ind w:left="0" w:firstLine="0"/>
+      </w:pPr>
+      <w:r>
+        <w:rPr>
+          <w:highlight w:val="yellow"/>
+        </w:rPr>
+        <w:t>Set:</w:t>
+      </w:r>
+      <w:r>
+        <w:t xml:space="preserve"> Allows only unique elements, it has 3 implementations</w:t>
+      </w:r>
+    </w:p>
+    <w:p>
+      <w:pPr>
+        <w:pStyle w:val="ListParagraph"/>
+        <w:numPr>
+          <w:ilvl w:val="0"/>
+          <w:numId w:val="17"/>
+        </w:numPr>
+      </w:pPr>
+      <w:r>
+        <w:t>HashSet: Doesn’t maintain the order but retrieval is faster</w:t>
+      </w:r>
+    </w:p>
+    <w:p>
+      <w:pPr>
+        <w:pStyle w:val="ListParagraph"/>
+        <w:numPr>
+          <w:ilvl w:val="0"/>
+          <w:numId w:val="17"/>
+        </w:numPr>
+      </w:pPr>
+      <w:r>
+        <w:t>LinkedHashSet: It maintains the elements in insertion order</w:t>
+      </w:r>
+    </w:p>
+    <w:p>
+      <w:pPr>
+        <w:pStyle w:val="ListParagraph"/>
+        <w:numPr>
+          <w:ilvl w:val="0"/>
+          <w:numId w:val="17"/>
+        </w:numPr>
+      </w:pPr>
+      <w:r>
+        <w:t>TreeSet: It maintains the element in sorted order</w:t>
+      </w:r>
+    </w:p>
+    <w:p>
+      <w:pPr>
+        <w:ind w:left="0" w:firstLine="0"/>
+      </w:pPr>
+      <w:r>
+        <w:rPr>
+          <w:highlight w:val="yellow"/>
+        </w:rPr>
+        <w:t>Exception Handling:</w:t>
+      </w:r>
+      <w:r>
+        <w:t xml:space="preserve"> It handles the runtime errors.</w:t>
+      </w:r>
+    </w:p>
+    <w:p>
+      <w:pPr>
+        <w:ind w:left="0" w:firstLine="0"/>
+      </w:pPr>
+      <w:r>
+        <w:t>We have try, catch, finally, throw &amp; throws</w:t>
+      </w:r>
+    </w:p>
+    <w:p>
+      <w:pPr>
+        <w:ind w:left="0" w:firstLine="0"/>
+      </w:pPr>
+      <w:r>
+        <w:t xml:space="preserve">throws: It propagates the exception from the method to the caller, so that caller knows how to handle the exception </w:t>
+      </w:r>
+    </w:p>
+    <w:p>
+      <w:pPr>
+        <w:ind w:left="0" w:firstLine="0"/>
+      </w:pPr>
+      <w:r>
+        <w:lastRenderedPageBreak/>
+        <w:t xml:space="preserve">throw: it manually generates the exception which could be predefined or custom exception </w:t>
+      </w:r>
+    </w:p>
+    <w:p>
+      <w:pPr>
+        <w:ind w:left="0" w:firstLine="0"/>
+      </w:pPr>
+    </w:p>
+    <w:p>
+      <w:pPr>
+        <w:ind w:left="0" w:firstLine="0"/>
+      </w:pPr>
+      <w:r>
+        <w:rPr>
+          <w:highlight w:val="yellow"/>
+        </w:rPr>
+        <w:t>Map:</w:t>
+      </w:r>
+      <w:r>
+        <w:t xml:space="preserve"> </w:t>
+      </w:r>
+      <w:r>
+        <w:t xml:space="preserve">put(key, value), remove(key), </w:t>
+      </w:r>
+      <w:r>
+        <w:t xml:space="preserve">replace(key, value), </w:t>
+      </w:r>
+      <w:r>
+        <w:t xml:space="preserve">get(key), </w:t>
+      </w:r>
+      <w:r>
+        <w:t xml:space="preserve">keySet(), </w:t>
+      </w:r>
+      <w:r>
+        <w:t>values()</w:t>
+      </w:r>
+    </w:p>
+    <w:p>
+      <w:pPr>
+        <w:ind w:left="0" w:firstLine="0"/>
+      </w:pPr>
+      <w:r>
+        <w:t>It maintains the data in key value pairs, key should be unique but value can be duplicate.</w:t>
+      </w:r>
+    </w:p>
+    <w:p>
+      <w:pPr>
+        <w:ind w:left="0" w:firstLine="0"/>
+      </w:pPr>
+      <w:r>
+        <w:t>It has 3 implementations</w:t>
+      </w:r>
+    </w:p>
+    <w:p>
+      <w:pPr>
+        <w:pStyle w:val="ListParagraph"/>
+        <w:numPr>
+          <w:ilvl w:val="0"/>
+          <w:numId w:val="18"/>
+        </w:numPr>
+      </w:pPr>
+      <w:r>
+        <w:t>HashMap - doesn’t maintain the order</w:t>
+      </w:r>
+    </w:p>
+    <w:p>
+      <w:pPr>
+        <w:pStyle w:val="ListParagraph"/>
+        <w:numPr>
+          <w:ilvl w:val="0"/>
+          <w:numId w:val="18"/>
+        </w:numPr>
+      </w:pPr>
+      <w:r>
+        <w:t>LinkedHashMap - maintains the insertion order</w:t>
+      </w:r>
+    </w:p>
+    <w:p>
+      <w:pPr>
+        <w:pStyle w:val="ListParagraph"/>
+        <w:numPr>
+          <w:ilvl w:val="0"/>
+          <w:numId w:val="18"/>
+        </w:numPr>
+      </w:pPr>
+      <w:r>
+        <w:t>TreeMap - maintains the sorted order</w:t>
+      </w:r>
+      <w:r>
+        <w:t xml:space="preserve"> of key</w:t>
+      </w:r>
+    </w:p>
+    <w:p>
+      <w:pPr>
+        <w:ind w:left="0" w:firstLine="0"/>
+      </w:pPr>
+      <w:r>
+        <w:t>put: it is to add the data</w:t>
+      </w:r>
+    </w:p>
+    <w:p>
+      <w:pPr>
+        <w:ind w:left="0" w:firstLine="0"/>
+      </w:pPr>
+      <w:r>
+        <w:t>get: it is to retrieve</w:t>
+      </w:r>
+    </w:p>
+    <w:p>
+      <w:pPr>
+        <w:ind w:left="0" w:firstLine="0"/>
+      </w:pPr>
+      <w:r>
+        <w:t>remove: it is to remove</w:t>
+      </w:r>
+    </w:p>
+    <w:p>
+      <w:pPr>
+        <w:ind w:left="0" w:firstLine="0"/>
+      </w:pPr>
+      <w:r>
+        <w:t>replace: it is to update</w:t>
+      </w:r>
+    </w:p>
+    <w:p>
+      <w:pPr>
+        <w:ind w:left="0" w:firstLine="0"/>
+      </w:pPr>
+      <w:r>
+        <w:t>keySet: it is to retrieve all the keys</w:t>
+      </w:r>
+    </w:p>
+    <w:p>
+      <w:pPr>
+        <w:ind w:left="0" w:firstLine="0"/>
+      </w:pPr>
+      <w:r>
+        <w:t>values: it is to retrieve all the values</w:t>
+      </w:r>
+    </w:p>
+    <w:p>
+      <w:pPr>
+        <w:ind w:left="0" w:firstLine="0"/>
+      </w:pPr>
+    </w:p>
+    <w:p>
+      <w:pPr>
+        <w:ind w:left="0" w:firstLine="0"/>
+      </w:pPr>
+      <w:r>
+        <w:t>ArrayList: data is managed in contiguous memory address</w:t>
+      </w:r>
+    </w:p>
+    <w:p>
+      <w:pPr>
+        <w:ind w:left="0" w:firstLine="0"/>
+      </w:pPr>
+      <w:r>
+        <w:t>LinkedList: data is managed in non-contiguous memory address</w:t>
+      </w:r>
+    </w:p>
+    <w:p>
+      <w:pPr>
+        <w:ind w:left="0" w:firstLine="0"/>
+      </w:pPr>
+      <w:r>
+        <w:t>HashSet: order is not maintained but retrieval will be faster</w:t>
+      </w:r>
+    </w:p>
+    <w:p>
+      <w:pPr>
+        <w:ind w:left="0" w:firstLine="0"/>
+      </w:pPr>
+      <w:r>
+        <w:t>TreeSet: sorted order</w:t>
+      </w:r>
+    </w:p>
+    <w:p>
+      <w:pPr>
+        <w:ind w:left="0" w:firstLine="0"/>
+      </w:pPr>
+      <w:r>
+        <w:t>LinkedHashSet: maintains the data in insertion order</w:t>
+      </w:r>
+    </w:p>
+    <w:p>
+      <w:pPr>
+        <w:ind w:left="0" w:firstLine="0"/>
+      </w:pPr>
+    </w:p>
+    <w:p>
+      <w:pPr>
+        <w:ind w:left="0" w:firstLine="0"/>
+      </w:pPr>
+    </w:p>
+    <w:p>
+      <w:pPr>
+        <w:ind w:left="0" w:firstLine="0"/>
+      </w:pPr>
+      <w:r>
+        <w:lastRenderedPageBreak/>
+        <w:t>Comparable: It is for natural ordering</w:t>
+      </w:r>
+    </w:p>
+    <w:p>
+      <w:pPr>
+        <w:ind w:left="0" w:firstLine="0"/>
+      </w:pPr>
+      <w:r>
+        <w:t>Comparator: it is to customize the sorting  to use multiple parameters</w:t>
+      </w:r>
+    </w:p>
+    <w:p>
+      <w:pPr>
+        <w:ind w:left="0" w:firstLine="0"/>
+      </w:pPr>
+      <w:r>
+        <w:t>ex: sorting based on percentage, based on name, in ascending order or descending order</w:t>
+      </w:r>
+    </w:p>
+    <w:p>
+      <w:pPr>
+        <w:ind w:left="0" w:firstLine="0"/>
+      </w:pPr>
+      <w:r>
+        <w:rPr>
+          <w:noProof/>
+        </w:rPr>
+        <w:drawing>
+          <wp:inline distT="0" distB="0" distL="0" distR="0" wp14:anchorId="2EAA5B4C" wp14:editId="13E98FFC">
+            <wp:extent cx="5943600" cy="3336925"/>
+            <wp:effectExtent l="0" t="0" r="0" b="0"/>
+            <wp:docPr id="607957772" name="Picture 1"/>
+            <wp:cNvGraphicFramePr>
+              <a:graphicFrameLocks xmlns:a="http://schemas.openxmlformats.org/drawingml/2006/main" noChangeAspect="1"/>
+            </wp:cNvGraphicFramePr>
+            <a:graphic xmlns:a="http://schemas.openxmlformats.org/drawingml/2006/main">
+              <a:graphicData uri="http://schemas.openxmlformats.org/drawingml/2006/picture">
+                <pic:pic xmlns:pic="http://schemas.openxmlformats.org/drawingml/2006/picture">
+                  <pic:nvPicPr>
+                    <pic:cNvPr id="607957772" name=""/>
+                    <pic:cNvPicPr/>
+                  </pic:nvPicPr>
+                  <pic:blipFill>
+                    <a:blip r:embed="rId31"/>
+                    <a:stretch>
+                      <a:fillRect/>
+                    </a:stretch>
+                  </pic:blipFill>
+                  <pic:spPr>
+                    <a:xfrm>
+                      <a:off x="0" y="0"/>
+                      <a:ext cx="5943600" cy="3336925"/>
+                    </a:xfrm>
+                    <a:prstGeom prst="rect">
+                      <a:avLst/>
+                    </a:prstGeom>
+                  </pic:spPr>
+                </pic:pic>
+              </a:graphicData>
+            </a:graphic>
+          </wp:inline>
+        </w:drawing>
+      </w:r>
+    </w:p>
+    <w:p>
+      <w:pPr>
+        <w:ind w:left="0" w:firstLine="0"/>
+      </w:pPr>
+    </w:p>
+    <w:p>
+      <w:pPr>
+        <w:ind w:left="0" w:firstLine="0"/>
+      </w:pPr>
+      <w:r>
+        <w:rPr>
+          <w:highlight w:val="yellow"/>
+        </w:rPr>
+        <w:t>IO Streams:</w:t>
+      </w:r>
+    </w:p>
+    <w:p>
+      <w:pPr>
+        <w:ind w:left="0" w:firstLine="0"/>
+      </w:pPr>
+      <w:r>
+        <w:t>Helps to perform Read/Write operations on various resources like memory, files, input or output sources</w:t>
+      </w:r>
+    </w:p>
+    <w:p>
+      <w:pPr>
+        <w:ind w:left="0" w:firstLine="0"/>
+      </w:pPr>
+      <w:r>
+        <w:t>Byte Streams: Handles binary data</w:t>
+      </w:r>
+    </w:p>
+    <w:p>
+      <w:pPr>
+        <w:ind w:left="0" w:firstLine="0"/>
+      </w:pPr>
+      <w:r>
+        <w:t>Character Streams: Handles text data</w:t>
+      </w:r>
+    </w:p>
+    <w:p>
+      <w:pPr>
+        <w:ind w:left="0" w:firstLine="0"/>
+      </w:pPr>
+      <w:r>
+        <w:rPr>
+          <w:highlight w:val="yellow"/>
+        </w:rPr>
+        <w:t>Byte Stream classes:</w:t>
+      </w:r>
+    </w:p>
+    <w:p>
+      <w:pPr>
+        <w:pStyle w:val="ListParagraph"/>
+        <w:numPr>
+          <w:ilvl w:val="0"/>
+          <w:numId w:val="19"/>
+        </w:numPr>
+      </w:pPr>
+      <w:r>
+        <w:t>FileInputStream &amp; FileOutputStream</w:t>
+      </w:r>
+    </w:p>
+    <w:p>
+      <w:pPr>
+        <w:pStyle w:val="ListParagraph"/>
+        <w:numPr>
+          <w:ilvl w:val="0"/>
+          <w:numId w:val="19"/>
+        </w:numPr>
+      </w:pPr>
+      <w:r>
+        <w:t>ObjectInputStream &amp; ObjectOutputStream</w:t>
+      </w:r>
+    </w:p>
+    <w:p>
+      <w:pPr>
+        <w:ind w:left="0" w:firstLine="0"/>
+      </w:pPr>
+      <w:r>
+        <w:rPr>
+          <w:highlight w:val="yellow"/>
+        </w:rPr>
+        <w:t>Character Stream classes:</w:t>
+      </w:r>
+    </w:p>
+    <w:p>
+      <w:pPr>
+        <w:pStyle w:val="ListParagraph"/>
+        <w:numPr>
+          <w:ilvl w:val="0"/>
+          <w:numId w:val="20"/>
+        </w:numPr>
+      </w:pPr>
+      <w:r>
+        <w:lastRenderedPageBreak/>
+        <w:t>FileReader &amp; FileWriter</w:t>
+      </w:r>
+    </w:p>
+    <w:p>
+      <w:pPr>
+        <w:pStyle w:val="ListParagraph"/>
+        <w:numPr>
+          <w:ilvl w:val="0"/>
+          <w:numId w:val="20"/>
+        </w:numPr>
+      </w:pPr>
+      <w:r>
+        <w:t>BufferedReader &amp; BufferedWriter</w:t>
+      </w:r>
+    </w:p>
+    <w:p>
+      <w:pPr>
+        <w:ind w:left="0" w:firstLine="0"/>
+      </w:pPr>
+      <w:r>
+        <w:rPr>
+          <w:highlight w:val="yellow"/>
+        </w:rPr>
+        <w:t>Serialization:</w:t>
+      </w:r>
+      <w:r>
+        <w:t xml:space="preserve"> A process of writing an object to the file, however the objects must implement Serializable interface</w:t>
+      </w:r>
+    </w:p>
+    <w:p>
+      <w:pPr>
+        <w:ind w:left="0" w:firstLine="0"/>
+      </w:pPr>
+      <w:r>
+        <w:t>Serializable interface is a marker interface &amp; it doesn’t have any methods</w:t>
+      </w:r>
+    </w:p>
+    <w:p>
+      <w:pPr>
+        <w:ind w:left="0" w:firstLine="0"/>
+      </w:pPr>
+      <w:r>
+        <w:rPr>
+          <w:highlight w:val="yellow"/>
+        </w:rPr>
+        <w:t>ObjectOutputStream &amp; ObjectInputStream</w:t>
+      </w:r>
+    </w:p>
+    <w:p>
+      <w:pPr>
+        <w:ind w:left="0" w:firstLine="0"/>
+      </w:pPr>
+      <w:r>
+        <w:t>They help to serialize and deserialize objects, serialize means storing the object in the file and deserialize reads the object from file.</w:t>
+      </w:r>
+    </w:p>
+    <w:p>
+      <w:pPr>
+        <w:ind w:left="0" w:firstLine="0"/>
+      </w:pPr>
+      <w:r>
+        <w:rPr>
+          <w:highlight w:val="yellow"/>
+        </w:rPr>
+        <w:t>Note:</w:t>
+      </w:r>
+      <w:r>
+        <w:t xml:space="preserve"> Any object you want to serialize must by marked with marker interface</w:t>
+      </w:r>
+      <w:r>
+        <w:t xml:space="preserve"> called Serializable, a marker interface doesn’t have any abstract methods</w:t>
+      </w:r>
+    </w:p>
+    <w:p>
+      <w:pPr>
+        <w:ind w:left="0" w:firstLine="0"/>
+      </w:pPr>
+      <w:r>
+        <w:t xml:space="preserve">class Student implements Serializable { </w:t>
+      </w:r>
+      <w:r>
+        <w:br/>
+      </w:r>
+      <w:r>
+        <w:br/>
+        <w:t xml:space="preserve">} </w:t>
+      </w:r>
+      <w:r>
+        <w:br/>
+        <w:t>// write the object</w:t>
+      </w:r>
+      <w:r>
+        <w:br/>
+        <w:t>FileInputStream fileInput = new FileInputStream(“student.ser”);</w:t>
+      </w:r>
+      <w:r>
+        <w:br/>
+        <w:t>FileOutputStream fileOutput = new FileOutputStream(“student.ser”);</w:t>
+      </w:r>
+    </w:p>
+    <w:p>
+      <w:pPr>
+        <w:ind w:left="0" w:firstLine="0"/>
+      </w:pPr>
+      <w:r>
+        <w:t>ObjectOutputStream oos = new ObjectOutputStream(fileOutput);</w:t>
+      </w:r>
+      <w:r>
+        <w:br/>
+        <w:t>obj = new Student(101, “Raj”, 56.0);</w:t>
+      </w:r>
+      <w:r>
+        <w:br/>
+        <w:t>oos.writeObject(obj); =&gt; checks the obj is Serializable &amp; stores in the file else throws exception</w:t>
+      </w:r>
+    </w:p>
+    <w:p>
+      <w:pPr>
+        <w:ind w:left="0" w:firstLine="0"/>
+      </w:pPr>
+      <w:r>
+        <w:t>// read the object</w:t>
+      </w:r>
+    </w:p>
+    <w:p>
+      <w:pPr>
+        <w:ind w:left="0" w:firstLine="0"/>
+      </w:pPr>
+      <w:r>
+        <w:t>ObjectInputStream ois = new ObjectInputStream(fileInput);</w:t>
+      </w:r>
+      <w:r>
+        <w:br/>
+        <w:t>oos.readObject() -&gt; returns the object present in the file</w:t>
+      </w:r>
+    </w:p>
+    <w:p>
+      <w:pPr>
+        <w:ind w:left="0" w:firstLine="0"/>
+      </w:pPr>
+      <w:r>
+        <w:rPr>
+          <w:highlight w:val="yellow"/>
+        </w:rPr>
+        <w:t>Note:</w:t>
+      </w:r>
+      <w:r>
+        <w:t xml:space="preserve"> You can maximum store only one instance of java object in a file</w:t>
+      </w:r>
+    </w:p>
+    <w:p>
+      <w:pPr>
+        <w:ind w:left="0" w:firstLine="0"/>
+      </w:pPr>
+    </w:p>
+    <w:p>
+      <w:pPr>
+        <w:ind w:left="0" w:firstLine="0"/>
+      </w:pPr>
+    </w:p>
+    <w:p>
+      <w:pPr>
+        <w:ind w:left="0" w:firstLine="0"/>
+      </w:pPr>
+      <w:r>
+        <w:rPr>
+          <w:highlight w:val="yellow"/>
+        </w:rPr>
+        <w:lastRenderedPageBreak/>
+        <w:t>Java 8 Features</w:t>
+      </w:r>
+    </w:p>
+    <w:p>
+      <w:pPr>
+        <w:pStyle w:val="ListParagraph"/>
+        <w:numPr>
+          <w:ilvl w:val="0"/>
+          <w:numId w:val="21"/>
+        </w:numPr>
+      </w:pPr>
+      <w:r>
+        <w:t>From Java 8 onwards you can have default &amp; static methods in interface</w:t>
+      </w:r>
+    </w:p>
+    <w:p>
+      <w:pPr>
+        <w:pStyle w:val="ListParagraph"/>
+        <w:numPr>
+          <w:ilvl w:val="0"/>
+          <w:numId w:val="21"/>
+        </w:numPr>
+      </w:pPr>
+      <w:r>
+        <w:t>Functional interface - an interface which will have only one abstract method, to support functional programming</w:t>
+      </w:r>
+    </w:p>
+    <w:p>
+      <w:pPr>
+        <w:pStyle w:val="ListParagraph"/>
+        <w:numPr>
+          <w:ilvl w:val="0"/>
+          <w:numId w:val="21"/>
+        </w:numPr>
+      </w:pPr>
+      <w:r>
+        <w:t>New Date &amp; Time classes - LocalDate, LocalDateTime, LocalTime</w:t>
+      </w:r>
+    </w:p>
+    <w:p>
+      <w:pPr>
+        <w:pStyle w:val="ListParagraph"/>
+        <w:numPr>
+          <w:ilvl w:val="0"/>
+          <w:numId w:val="21"/>
+        </w:numPr>
+      </w:pPr>
+      <w:r>
+        <w:t>Stream API’s - to manipulate the collection data without changing the original collection like filtering, sorting, transforming, reducing and so on.</w:t>
+      </w:r>
+    </w:p>
+    <w:p>
+      <w:pPr>
+        <w:ind w:left="0" w:firstLine="0"/>
+      </w:pPr>
+      <w:r>
+        <w:t>Java has provided built in functional interfaces</w:t>
+      </w:r>
+    </w:p>
+    <w:p>
+      <w:pPr>
+        <w:pStyle w:val="ListParagraph"/>
+        <w:numPr>
+          <w:ilvl w:val="0"/>
+          <w:numId w:val="22"/>
+        </w:numPr>
+      </w:pPr>
+      <w:r>
+        <w:t>Predicate</w:t>
+      </w:r>
+      <w:r>
+        <w:t xml:space="preserve">: </w:t>
+      </w:r>
+      <w:r>
+        <w:rPr>
+          <w:b/>
+          <w:bCs/>
+        </w:rPr>
+        <w:t>boolean</w:t>
+      </w:r>
+      <w:r>
+        <w:t xml:space="preserve"> test(T t);</w:t>
+      </w:r>
+      <w:r>
+        <w:t xml:space="preserve">  (data) -&gt; data % 2 == 0</w:t>
+      </w:r>
+    </w:p>
+    <w:p>
+      <w:pPr>
+        <w:pStyle w:val="ListParagraph"/>
+        <w:numPr>
+          <w:ilvl w:val="0"/>
+          <w:numId w:val="22"/>
+        </w:numPr>
+      </w:pPr>
+      <w:r>
+        <w:t>Consumer</w:t>
+      </w:r>
+      <w:r>
+        <w:t xml:space="preserve">: </w:t>
+      </w:r>
+      <w:r>
+        <w:rPr>
+          <w:b/>
+          <w:bCs/>
+        </w:rPr>
+        <w:t>void</w:t>
+      </w:r>
+      <w:r>
+        <w:t xml:space="preserve"> accept(T t);</w:t>
+      </w:r>
+      <w:r>
+        <w:t xml:space="preserve"> (data) -&gt; System.out.print</w:t>
+      </w:r>
+      <w:r>
+        <w:t>ln</w:t>
+      </w:r>
+      <w:r>
+        <w:t>(data)</w:t>
+      </w:r>
+    </w:p>
+    <w:p>
+      <w:pPr>
+        <w:pStyle w:val="ListParagraph"/>
+        <w:numPr>
+          <w:ilvl w:val="0"/>
+          <w:numId w:val="22"/>
+        </w:numPr>
+      </w:pPr>
+      <w:r>
+        <w:t>Supplier</w:t>
+      </w:r>
+      <w:r>
+        <w:t xml:space="preserve">: </w:t>
+      </w:r>
+      <w:r>
+        <w:t>T get();</w:t>
+      </w:r>
+      <w:r>
+        <w:t xml:space="preserve"> () -&gt; data</w:t>
+      </w:r>
+    </w:p>
+    <w:p>
+      <w:pPr>
+        <w:pStyle w:val="ListParagraph"/>
+        <w:numPr>
+          <w:ilvl w:val="0"/>
+          <w:numId w:val="22"/>
+        </w:numPr>
+      </w:pPr>
+      <w:r>
+        <w:t>Function</w:t>
+      </w:r>
+      <w:r>
+        <w:t xml:space="preserve">: </w:t>
+      </w:r>
+      <w:r>
+        <w:t>R apply(T t);</w:t>
+      </w:r>
+      <w:r>
+        <w:t xml:space="preserve"> (data) -&gt; someData</w:t>
+      </w:r>
+    </w:p>
+    <w:p>
+      <w:pPr>
+        <w:pStyle w:val="ListParagraph"/>
+        <w:numPr>
+          <w:ilvl w:val="0"/>
+          <w:numId w:val="22"/>
+        </w:numPr>
+      </w:pPr>
+      <w:r>
+        <w:t xml:space="preserve">Comparator: </w:t>
+      </w:r>
+      <w:r>
+        <w:rPr>
+          <w:b/>
+          <w:bCs/>
+        </w:rPr>
+        <w:t>int</w:t>
+      </w:r>
+      <w:r>
+        <w:t xml:space="preserve"> compare(T o1, T o2);</w:t>
+      </w:r>
+      <w:r>
+        <w:t xml:space="preserve"> (o1, o2) -&gt; value;</w:t>
       </w:r>
     </w:p>
     <w:sectPr>
@@ -818,6 +3592,95 @@
 <file path=word/numbering.xml><?xml version="1.0" encoding="utf-8"?>
 <w:numbering xmlns:wpc="http://schemas.microsoft.com/office/word/2010/wordprocessingCanvas" xmlns:cx="http://schemas.microsoft.com/office/drawing/2014/chartex" xmlns:cx1="http://schemas.microsoft.com/office/drawing/2015/9/8/chartex" xmlns:cx2="http://schemas.microsoft.com/office/drawing/2015/10/21/chartex" xmlns:cx3="http://schemas.microsoft.com/office/drawing/2016/5/9/chartex" xmlns:cx4="http://schemas.microsoft.com/office/drawing/2016/5/10/chartex" xmlns:cx5="http://schemas.microsoft.com/office/drawing/2016/5/11/chartex" xmlns:cx6="http://schemas.microsoft.com/office/drawing/2016/5/12/chartex" xmlns:cx7="http://schemas.microsoft.com/office/drawing/2016/5/13/chartex" xmlns:cx8="http://schemas.microsoft.com/office/drawing/2016/5/14/chartex" xmlns:mc="http://schemas.openxmlformats.org/markup-compatibility/2006" xmlns:aink="http://schemas.microsoft.com/office/drawing/2016/ink" xmlns:am3d="http://schemas.microsoft.com/office/drawing/2017/model3d" xmlns:o="urn:schemas-microsoft-com:office:office" xmlns:oel="http://schemas.microsoft.com/office/2019/extlst" xmlns:r="http://schemas.openxmlformats.org/officeDocument/2006/relationships" xmlns:m="http://schemas.openxmlformats.org/officeDocument/2006/math" xmlns:v="urn:schemas-microsoft-com:vml" xmlns:wp14="http://schemas.microsoft.com/office/word/2010/wordprocessingDrawing" xmlns:wp="http://schemas.openxmlformats.org/drawingml/2006/wordprocessingDrawing" xmlns:w10="urn:schemas-microsoft-com:office:word" xmlns:w="http://schemas.openxmlformats.org/wordprocessingml/2006/main" xmlns:w14="http://schemas.microsoft.com/office/word/2010/wordml" xmlns:w15="http://schemas.microsoft.com/office/word/2012/wordml" xmlns:w16cex="http://schemas.microsoft.com/office/word/2018/wordml/cex" xmlns:w16cid="http://schemas.microsoft.com/office/word/2016/wordml/cid" xmlns:w16="http://schemas.microsoft.com/office/word/2018/wordml" xmlns:w16du="http://schemas.microsoft.com/office/word/2023/wordml/word16du" xmlns:w16sdtdh="http://schemas.microsoft.com/office/word/2020/wordml/sdtdatahash" xmlns:w16sdtfl="http://schemas.microsoft.com/office/word/2024/wordml/sdtformatlock" xmlns:w16se="http://schemas.microsoft.com/office/word/2015/wordml/symex" xmlns:wpg="http://schemas.microsoft.com/office/word/2010/wordprocessingGroup" xmlns:wpi="http://schemas.microsoft.com/office/word/2010/wordprocessingInk" xmlns:wne="http://schemas.microsoft.com/office/word/2006/wordml" xmlns:wps="http://schemas.microsoft.com/office/word/2010/wordprocessingShape" mc:Ignorable="w14 w15 w16se w16cid w16 w16cex w16sdtdh w16sdtfl w16du wp14">
   <w:abstractNum w:abstractNumId="0" w15:restartNumberingAfterBreak="0">
+    <w:nsid w:val="00074597"/>
+    <w:multiLevelType w:val="hybridMultilevel"/>
+    <w:tmpl w:val="9D2897C8"/>
+    <w:lvl w:ilvl="0" w:tplc="0409000F">
+      <w:start w:val="1"/>
+      <w:numFmt w:val="decimal"/>
+      <w:lvlText w:val="%1."/>
+      <w:lvlJc w:val="left"/>
+      <w:pPr>
+        <w:ind w:left="720" w:hanging="360"/>
+      </w:pPr>
+      <w:rPr>
+        <w:rFonts w:hint="default"/>
+      </w:rPr>
+    </w:lvl>
+    <w:lvl w:ilvl="1" w:tplc="04090019" w:tentative="1">
+      <w:start w:val="1"/>
+      <w:numFmt w:val="lowerLetter"/>
+      <w:lvlText w:val="%2."/>
+      <w:lvlJc w:val="left"/>
+      <w:pPr>
+        <w:ind w:left="1440" w:hanging="360"/>
+      </w:pPr>
+    </w:lvl>
+    <w:lvl w:ilvl="2" w:tplc="0409001B" w:tentative="1">
+      <w:start w:val="1"/>
+      <w:numFmt w:val="lowerRoman"/>
+      <w:lvlText w:val="%3."/>
+      <w:lvlJc w:val="right"/>
+      <w:pPr>
+        <w:ind w:left="2160" w:hanging="180"/>
+      </w:pPr>
+    </w:lvl>
+    <w:lvl w:ilvl="3" w:tplc="0409000F" w:tentative="1">
+      <w:start w:val="1"/>
+      <w:numFmt w:val="decimal"/>
+      <w:lvlText w:val="%4."/>
+      <w:lvlJc w:val="left"/>
+      <w:pPr>
+        <w:ind w:left="2880" w:hanging="360"/>
+      </w:pPr>
+    </w:lvl>
+    <w:lvl w:ilvl="4" w:tplc="04090019" w:tentative="1">
+      <w:start w:val="1"/>
+      <w:numFmt w:val="lowerLetter"/>
+      <w:lvlText w:val="%5."/>
+      <w:lvlJc w:val="left"/>
+      <w:pPr>
+        <w:ind w:left="3600" w:hanging="360"/>
+      </w:pPr>
+    </w:lvl>
+    <w:lvl w:ilvl="5" w:tplc="0409001B" w:tentative="1">
+      <w:start w:val="1"/>
+      <w:numFmt w:val="lowerRoman"/>
+      <w:lvlText w:val="%6."/>
+      <w:lvlJc w:val="right"/>
+      <w:pPr>
+        <w:ind w:left="4320" w:hanging="180"/>
+      </w:pPr>
+    </w:lvl>
+    <w:lvl w:ilvl="6" w:tplc="0409000F" w:tentative="1">
+      <w:start w:val="1"/>
+      <w:numFmt w:val="decimal"/>
+      <w:lvlText w:val="%7."/>
+      <w:lvlJc w:val="left"/>
+      <w:pPr>
+        <w:ind w:left="5040" w:hanging="360"/>
+      </w:pPr>
+    </w:lvl>
+    <w:lvl w:ilvl="7" w:tplc="04090019" w:tentative="1">
+      <w:start w:val="1"/>
+      <w:numFmt w:val="lowerLetter"/>
+      <w:lvlText w:val="%8."/>
+      <w:lvlJc w:val="left"/>
+      <w:pPr>
+        <w:ind w:left="5760" w:hanging="360"/>
+      </w:pPr>
+    </w:lvl>
+    <w:lvl w:ilvl="8" w:tplc="0409001B" w:tentative="1">
+      <w:start w:val="1"/>
+      <w:numFmt w:val="lowerRoman"/>
+      <w:lvlText w:val="%9."/>
+      <w:lvlJc w:val="right"/>
+      <w:pPr>
+        <w:ind w:left="6480" w:hanging="180"/>
+      </w:pPr>
+    </w:lvl>
+  </w:abstractNum>
+  <w:abstractNum w:abstractNumId="1" w15:restartNumberingAfterBreak="0">
     <w:nsid w:val="08597C95"/>
     <w:multiLevelType w:val="hybridMultilevel"/>
     <w:tmpl w:val="07385308"/>
@@ -906,7 +3769,7 @@
       </w:pPr>
     </w:lvl>
   </w:abstractNum>
-  <w:abstractNum w:abstractNumId="1" w15:restartNumberingAfterBreak="0">
+  <w:abstractNum w:abstractNumId="2" w15:restartNumberingAfterBreak="0">
     <w:nsid w:val="0CB51F87"/>
     <w:multiLevelType w:val="hybridMultilevel"/>
     <w:tmpl w:val="BB7AC91A"/>
@@ -995,7 +3858,185 @@
       </w:pPr>
     </w:lvl>
   </w:abstractNum>
-  <w:abstractNum w:abstractNumId="2" w15:restartNumberingAfterBreak="0">
+  <w:abstractNum w:abstractNumId="3" w15:restartNumberingAfterBreak="0">
+    <w:nsid w:val="0F544EF7"/>
+    <w:multiLevelType w:val="hybridMultilevel"/>
+    <w:tmpl w:val="ED00C47A"/>
+    <w:lvl w:ilvl="0" w:tplc="0409000F">
+      <w:start w:val="1"/>
+      <w:numFmt w:val="decimal"/>
+      <w:lvlText w:val="%1."/>
+      <w:lvlJc w:val="left"/>
+      <w:pPr>
+        <w:ind w:left="720" w:hanging="360"/>
+      </w:pPr>
+      <w:rPr>
+        <w:rFonts w:hint="default"/>
+      </w:rPr>
+    </w:lvl>
+    <w:lvl w:ilvl="1" w:tplc="04090019" w:tentative="1">
+      <w:start w:val="1"/>
+      <w:numFmt w:val="lowerLetter"/>
+      <w:lvlText w:val="%2."/>
+      <w:lvlJc w:val="left"/>
+      <w:pPr>
+        <w:ind w:left="1440" w:hanging="360"/>
+      </w:pPr>
+    </w:lvl>
+    <w:lvl w:ilvl="2" w:tplc="0409001B" w:tentative="1">
+      <w:start w:val="1"/>
+      <w:numFmt w:val="lowerRoman"/>
+      <w:lvlText w:val="%3."/>
+      <w:lvlJc w:val="right"/>
+      <w:pPr>
+        <w:ind w:left="2160" w:hanging="180"/>
+      </w:pPr>
+    </w:lvl>
+    <w:lvl w:ilvl="3" w:tplc="0409000F" w:tentative="1">
+      <w:start w:val="1"/>
+      <w:numFmt w:val="decimal"/>
+      <w:lvlText w:val="%4."/>
+      <w:lvlJc w:val="left"/>
+      <w:pPr>
+        <w:ind w:left="2880" w:hanging="360"/>
+      </w:pPr>
+    </w:lvl>
+    <w:lvl w:ilvl="4" w:tplc="04090019" w:tentative="1">
+      <w:start w:val="1"/>
+      <w:numFmt w:val="lowerLetter"/>
+      <w:lvlText w:val="%5."/>
+      <w:lvlJc w:val="left"/>
+      <w:pPr>
+        <w:ind w:left="3600" w:hanging="360"/>
+      </w:pPr>
+    </w:lvl>
+    <w:lvl w:ilvl="5" w:tplc="0409001B" w:tentative="1">
+      <w:start w:val="1"/>
+      <w:numFmt w:val="lowerRoman"/>
+      <w:lvlText w:val="%6."/>
+      <w:lvlJc w:val="right"/>
+      <w:pPr>
+        <w:ind w:left="4320" w:hanging="180"/>
+      </w:pPr>
+    </w:lvl>
+    <w:lvl w:ilvl="6" w:tplc="0409000F" w:tentative="1">
+      <w:start w:val="1"/>
+      <w:numFmt w:val="decimal"/>
+      <w:lvlText w:val="%7."/>
+      <w:lvlJc w:val="left"/>
+      <w:pPr>
+        <w:ind w:left="5040" w:hanging="360"/>
+      </w:pPr>
+    </w:lvl>
+    <w:lvl w:ilvl="7" w:tplc="04090019" w:tentative="1">
+      <w:start w:val="1"/>
+      <w:numFmt w:val="lowerLetter"/>
+      <w:lvlText w:val="%8."/>
+      <w:lvlJc w:val="left"/>
+      <w:pPr>
+        <w:ind w:left="5760" w:hanging="360"/>
+      </w:pPr>
+    </w:lvl>
+    <w:lvl w:ilvl="8" w:tplc="0409001B" w:tentative="1">
+      <w:start w:val="1"/>
+      <w:numFmt w:val="lowerRoman"/>
+      <w:lvlText w:val="%9."/>
+      <w:lvlJc w:val="right"/>
+      <w:pPr>
+        <w:ind w:left="6480" w:hanging="180"/>
+      </w:pPr>
+    </w:lvl>
+  </w:abstractNum>
+  <w:abstractNum w:abstractNumId="4" w15:restartNumberingAfterBreak="0">
+    <w:nsid w:val="14280995"/>
+    <w:multiLevelType w:val="hybridMultilevel"/>
+    <w:tmpl w:val="966AE394"/>
+    <w:lvl w:ilvl="0" w:tplc="0409000F">
+      <w:start w:val="1"/>
+      <w:numFmt w:val="decimal"/>
+      <w:lvlText w:val="%1."/>
+      <w:lvlJc w:val="left"/>
+      <w:pPr>
+        <w:ind w:left="720" w:hanging="360"/>
+      </w:pPr>
+      <w:rPr>
+        <w:rFonts w:hint="default"/>
+      </w:rPr>
+    </w:lvl>
+    <w:lvl w:ilvl="1" w:tplc="04090019" w:tentative="1">
+      <w:start w:val="1"/>
+      <w:numFmt w:val="lowerLetter"/>
+      <w:lvlText w:val="%2."/>
+      <w:lvlJc w:val="left"/>
+      <w:pPr>
+        <w:ind w:left="1440" w:hanging="360"/>
+      </w:pPr>
+    </w:lvl>
+    <w:lvl w:ilvl="2" w:tplc="0409001B" w:tentative="1">
+      <w:start w:val="1"/>
+      <w:numFmt w:val="lowerRoman"/>
+      <w:lvlText w:val="%3."/>
+      <w:lvlJc w:val="right"/>
+      <w:pPr>
+        <w:ind w:left="2160" w:hanging="180"/>
+      </w:pPr>
+    </w:lvl>
+    <w:lvl w:ilvl="3" w:tplc="0409000F" w:tentative="1">
+      <w:start w:val="1"/>
+      <w:numFmt w:val="decimal"/>
+      <w:lvlText w:val="%4."/>
+      <w:lvlJc w:val="left"/>
+      <w:pPr>
+        <w:ind w:left="2880" w:hanging="360"/>
+      </w:pPr>
+    </w:lvl>
+    <w:lvl w:ilvl="4" w:tplc="04090019" w:tentative="1">
+      <w:start w:val="1"/>
+      <w:numFmt w:val="lowerLetter"/>
+      <w:lvlText w:val="%5."/>
+      <w:lvlJc w:val="left"/>
+      <w:pPr>
+        <w:ind w:left="3600" w:hanging="360"/>
+      </w:pPr>
+    </w:lvl>
+    <w:lvl w:ilvl="5" w:tplc="0409001B" w:tentative="1">
+      <w:start w:val="1"/>
+      <w:numFmt w:val="lowerRoman"/>
+      <w:lvlText w:val="%6."/>
+      <w:lvlJc w:val="right"/>
+      <w:pPr>
+        <w:ind w:left="4320" w:hanging="180"/>
+      </w:pPr>
+    </w:lvl>
+    <w:lvl w:ilvl="6" w:tplc="0409000F" w:tentative="1">
+      <w:start w:val="1"/>
+      <w:numFmt w:val="decimal"/>
+      <w:lvlText w:val="%7."/>
+      <w:lvlJc w:val="left"/>
+      <w:pPr>
+        <w:ind w:left="5040" w:hanging="360"/>
+      </w:pPr>
+    </w:lvl>
+    <w:lvl w:ilvl="7" w:tplc="04090019" w:tentative="1">
+      <w:start w:val="1"/>
+      <w:numFmt w:val="lowerLetter"/>
+      <w:lvlText w:val="%8."/>
+      <w:lvlJc w:val="left"/>
+      <w:pPr>
+        <w:ind w:left="5760" w:hanging="360"/>
+      </w:pPr>
+    </w:lvl>
+    <w:lvl w:ilvl="8" w:tplc="0409001B" w:tentative="1">
+      <w:start w:val="1"/>
+      <w:numFmt w:val="lowerRoman"/>
+      <w:lvlText w:val="%9."/>
+      <w:lvlJc w:val="right"/>
+      <w:pPr>
+        <w:ind w:left="6480" w:hanging="180"/>
+      </w:pPr>
+    </w:lvl>
+  </w:abstractNum>
+  <w:abstractNum w:abstractNumId="5" w15:restartNumberingAfterBreak="0">
     <w:nsid w:val="14EC6323"/>
     <w:multiLevelType w:val="hybridMultilevel"/>
     <w:tmpl w:val="32F0784E"/>
@@ -1108,7 +4149,274 @@
       </w:rPr>
     </w:lvl>
   </w:abstractNum>
-  <w:abstractNum w:abstractNumId="3" w15:restartNumberingAfterBreak="0">
+  <w:abstractNum w:abstractNumId="6" w15:restartNumberingAfterBreak="0">
+    <w:nsid w:val="1A5444C1"/>
+    <w:multiLevelType w:val="hybridMultilevel"/>
+    <w:tmpl w:val="ADCAB732"/>
+    <w:lvl w:ilvl="0" w:tplc="0409000F">
+      <w:start w:val="1"/>
+      <w:numFmt w:val="decimal"/>
+      <w:lvlText w:val="%1."/>
+      <w:lvlJc w:val="left"/>
+      <w:pPr>
+        <w:ind w:left="720" w:hanging="360"/>
+      </w:pPr>
+      <w:rPr>
+        <w:rFonts w:hint="default"/>
+      </w:rPr>
+    </w:lvl>
+    <w:lvl w:ilvl="1" w:tplc="04090019" w:tentative="1">
+      <w:start w:val="1"/>
+      <w:numFmt w:val="lowerLetter"/>
+      <w:lvlText w:val="%2."/>
+      <w:lvlJc w:val="left"/>
+      <w:pPr>
+        <w:ind w:left="1440" w:hanging="360"/>
+      </w:pPr>
+    </w:lvl>
+    <w:lvl w:ilvl="2" w:tplc="0409001B" w:tentative="1">
+      <w:start w:val="1"/>
+      <w:numFmt w:val="lowerRoman"/>
+      <w:lvlText w:val="%3."/>
+      <w:lvlJc w:val="right"/>
+      <w:pPr>
+        <w:ind w:left="2160" w:hanging="180"/>
+      </w:pPr>
+    </w:lvl>
+    <w:lvl w:ilvl="3" w:tplc="0409000F" w:tentative="1">
+      <w:start w:val="1"/>
+      <w:numFmt w:val="decimal"/>
+      <w:lvlText w:val="%4."/>
+      <w:lvlJc w:val="left"/>
+      <w:pPr>
+        <w:ind w:left="2880" w:hanging="360"/>
+      </w:pPr>
+    </w:lvl>
+    <w:lvl w:ilvl="4" w:tplc="04090019" w:tentative="1">
+      <w:start w:val="1"/>
+      <w:numFmt w:val="lowerLetter"/>
+      <w:lvlText w:val="%5."/>
+      <w:lvlJc w:val="left"/>
+      <w:pPr>
+        <w:ind w:left="3600" w:hanging="360"/>
+      </w:pPr>
+    </w:lvl>
+    <w:lvl w:ilvl="5" w:tplc="0409001B" w:tentative="1">
+      <w:start w:val="1"/>
+      <w:numFmt w:val="lowerRoman"/>
+      <w:lvlText w:val="%6."/>
+      <w:lvlJc w:val="right"/>
+      <w:pPr>
+        <w:ind w:left="4320" w:hanging="180"/>
+      </w:pPr>
+    </w:lvl>
+    <w:lvl w:ilvl="6" w:tplc="0409000F" w:tentative="1">
+      <w:start w:val="1"/>
+      <w:numFmt w:val="decimal"/>
+      <w:lvlText w:val="%7."/>
+      <w:lvlJc w:val="left"/>
+      <w:pPr>
+        <w:ind w:left="5040" w:hanging="360"/>
+      </w:pPr>
+    </w:lvl>
+    <w:lvl w:ilvl="7" w:tplc="04090019" w:tentative="1">
+      <w:start w:val="1"/>
+      <w:numFmt w:val="lowerLetter"/>
+      <w:lvlText w:val="%8."/>
+      <w:lvlJc w:val="left"/>
+      <w:pPr>
+        <w:ind w:left="5760" w:hanging="360"/>
+      </w:pPr>
+    </w:lvl>
+    <w:lvl w:ilvl="8" w:tplc="0409001B" w:tentative="1">
+      <w:start w:val="1"/>
+      <w:numFmt w:val="lowerRoman"/>
+      <w:lvlText w:val="%9."/>
+      <w:lvlJc w:val="right"/>
+      <w:pPr>
+        <w:ind w:left="6480" w:hanging="180"/>
+      </w:pPr>
+    </w:lvl>
+  </w:abstractNum>
+  <w:abstractNum w:abstractNumId="7" w15:restartNumberingAfterBreak="0">
+    <w:nsid w:val="1D0F7A06"/>
+    <w:multiLevelType w:val="hybridMultilevel"/>
+    <w:tmpl w:val="A6629502"/>
+    <w:lvl w:ilvl="0" w:tplc="0409000F">
+      <w:start w:val="1"/>
+      <w:numFmt w:val="decimal"/>
+      <w:lvlText w:val="%1."/>
+      <w:lvlJc w:val="left"/>
+      <w:pPr>
+        <w:ind w:left="720" w:hanging="360"/>
+      </w:pPr>
+      <w:rPr>
+        <w:rFonts w:hint="default"/>
+      </w:rPr>
+    </w:lvl>
+    <w:lvl w:ilvl="1" w:tplc="04090019" w:tentative="1">
+      <w:start w:val="1"/>
+      <w:numFmt w:val="lowerLetter"/>
+      <w:lvlText w:val="%2."/>
+      <w:lvlJc w:val="left"/>
+      <w:pPr>
+        <w:ind w:left="1440" w:hanging="360"/>
+      </w:pPr>
+    </w:lvl>
+    <w:lvl w:ilvl="2" w:tplc="0409001B" w:tentative="1">
+      <w:start w:val="1"/>
+      <w:numFmt w:val="lowerRoman"/>
+      <w:lvlText w:val="%3."/>
+      <w:lvlJc w:val="right"/>
+      <w:pPr>
+        <w:ind w:left="2160" w:hanging="180"/>
+      </w:pPr>
+    </w:lvl>
+    <w:lvl w:ilvl="3" w:tplc="0409000F" w:tentative="1">
+      <w:start w:val="1"/>
+      <w:numFmt w:val="decimal"/>
+      <w:lvlText w:val="%4."/>
+      <w:lvlJc w:val="left"/>
+      <w:pPr>
+        <w:ind w:left="2880" w:hanging="360"/>
+      </w:pPr>
+    </w:lvl>
+    <w:lvl w:ilvl="4" w:tplc="04090019" w:tentative="1">
+      <w:start w:val="1"/>
+      <w:numFmt w:val="lowerLetter"/>
+      <w:lvlText w:val="%5."/>
+      <w:lvlJc w:val="left"/>
+      <w:pPr>
+        <w:ind w:left="3600" w:hanging="360"/>
+      </w:pPr>
+    </w:lvl>
+    <w:lvl w:ilvl="5" w:tplc="0409001B" w:tentative="1">
+      <w:start w:val="1"/>
+      <w:numFmt w:val="lowerRoman"/>
+      <w:lvlText w:val="%6."/>
+      <w:lvlJc w:val="right"/>
+      <w:pPr>
+        <w:ind w:left="4320" w:hanging="180"/>
+      </w:pPr>
+    </w:lvl>
+    <w:lvl w:ilvl="6" w:tplc="0409000F" w:tentative="1">
+      <w:start w:val="1"/>
+      <w:numFmt w:val="decimal"/>
+      <w:lvlText w:val="%7."/>
+      <w:lvlJc w:val="left"/>
+      <w:pPr>
+        <w:ind w:left="5040" w:hanging="360"/>
+      </w:pPr>
+    </w:lvl>
+    <w:lvl w:ilvl="7" w:tplc="04090019" w:tentative="1">
+      <w:start w:val="1"/>
+      <w:numFmt w:val="lowerLetter"/>
+      <w:lvlText w:val="%8."/>
+      <w:lvlJc w:val="left"/>
+      <w:pPr>
+        <w:ind w:left="5760" w:hanging="360"/>
+      </w:pPr>
+    </w:lvl>
+    <w:lvl w:ilvl="8" w:tplc="0409001B" w:tentative="1">
+      <w:start w:val="1"/>
+      <w:numFmt w:val="lowerRoman"/>
+      <w:lvlText w:val="%9."/>
+      <w:lvlJc w:val="right"/>
+      <w:pPr>
+        <w:ind w:left="6480" w:hanging="180"/>
+      </w:pPr>
+    </w:lvl>
+  </w:abstractNum>
+  <w:abstractNum w:abstractNumId="8" w15:restartNumberingAfterBreak="0">
+    <w:nsid w:val="2101597C"/>
+    <w:multiLevelType w:val="hybridMultilevel"/>
+    <w:tmpl w:val="270A1FE0"/>
+    <w:lvl w:ilvl="0" w:tplc="0409000F">
+      <w:start w:val="1"/>
+      <w:numFmt w:val="decimal"/>
+      <w:lvlText w:val="%1."/>
+      <w:lvlJc w:val="left"/>
+      <w:pPr>
+        <w:ind w:left="720" w:hanging="360"/>
+      </w:pPr>
+      <w:rPr>
+        <w:rFonts w:hint="default"/>
+      </w:rPr>
+    </w:lvl>
+    <w:lvl w:ilvl="1" w:tplc="04090019" w:tentative="1">
+      <w:start w:val="1"/>
+      <w:numFmt w:val="lowerLetter"/>
+      <w:lvlText w:val="%2."/>
+      <w:lvlJc w:val="left"/>
+      <w:pPr>
+        <w:ind w:left="1440" w:hanging="360"/>
+      </w:pPr>
+    </w:lvl>
+    <w:lvl w:ilvl="2" w:tplc="0409001B" w:tentative="1">
+      <w:start w:val="1"/>
+      <w:numFmt w:val="lowerRoman"/>
+      <w:lvlText w:val="%3."/>
+      <w:lvlJc w:val="right"/>
+      <w:pPr>
+        <w:ind w:left="2160" w:hanging="180"/>
+      </w:pPr>
+    </w:lvl>
+    <w:lvl w:ilvl="3" w:tplc="0409000F" w:tentative="1">
+      <w:start w:val="1"/>
+      <w:numFmt w:val="decimal"/>
+      <w:lvlText w:val="%4."/>
+      <w:lvlJc w:val="left"/>
+      <w:pPr>
+        <w:ind w:left="2880" w:hanging="360"/>
+      </w:pPr>
+    </w:lvl>
+    <w:lvl w:ilvl="4" w:tplc="04090019" w:tentative="1">
+      <w:start w:val="1"/>
+      <w:numFmt w:val="lowerLetter"/>
+      <w:lvlText w:val="%5."/>
+      <w:lvlJc w:val="left"/>
+      <w:pPr>
+        <w:ind w:left="3600" w:hanging="360"/>
+      </w:pPr>
+    </w:lvl>
+    <w:lvl w:ilvl="5" w:tplc="0409001B" w:tentative="1">
+      <w:start w:val="1"/>
+      <w:numFmt w:val="lowerRoman"/>
+      <w:lvlText w:val="%6."/>
+      <w:lvlJc w:val="right"/>
+      <w:pPr>
+        <w:ind w:left="4320" w:hanging="180"/>
+      </w:pPr>
+    </w:lvl>
+    <w:lvl w:ilvl="6" w:tplc="0409000F" w:tentative="1">
+      <w:start w:val="1"/>
+      <w:numFmt w:val="decimal"/>
+      <w:lvlText w:val="%7."/>
+      <w:lvlJc w:val="left"/>
+      <w:pPr>
+        <w:ind w:left="5040" w:hanging="360"/>
+      </w:pPr>
+    </w:lvl>
+    <w:lvl w:ilvl="7" w:tplc="04090019" w:tentative="1">
+      <w:start w:val="1"/>
+      <w:numFmt w:val="lowerLetter"/>
+      <w:lvlText w:val="%8."/>
+      <w:lvlJc w:val="left"/>
+      <w:pPr>
+        <w:ind w:left="5760" w:hanging="360"/>
+      </w:pPr>
+    </w:lvl>
+    <w:lvl w:ilvl="8" w:tplc="0409001B" w:tentative="1">
+      <w:start w:val="1"/>
+      <w:numFmt w:val="lowerRoman"/>
+      <w:lvlText w:val="%9."/>
+      <w:lvlJc w:val="right"/>
+      <w:pPr>
+        <w:ind w:left="6480" w:hanging="180"/>
+      </w:pPr>
+    </w:lvl>
+  </w:abstractNum>
+  <w:abstractNum w:abstractNumId="9" w15:restartNumberingAfterBreak="0">
     <w:nsid w:val="25875411"/>
     <w:multiLevelType w:val="hybridMultilevel"/>
     <w:tmpl w:val="10226456"/>
@@ -1197,7 +4505,7 @@
       </w:pPr>
     </w:lvl>
   </w:abstractNum>
-  <w:abstractNum w:abstractNumId="4" w15:restartNumberingAfterBreak="0">
+  <w:abstractNum w:abstractNumId="10" w15:restartNumberingAfterBreak="0">
     <w:nsid w:val="268D3485"/>
     <w:multiLevelType w:val="hybridMultilevel"/>
     <w:tmpl w:val="B8A2CAC8"/>
@@ -1286,7 +4594,7 @@
       </w:pPr>
     </w:lvl>
   </w:abstractNum>
-  <w:abstractNum w:abstractNumId="5" w15:restartNumberingAfterBreak="0">
+  <w:abstractNum w:abstractNumId="11" w15:restartNumberingAfterBreak="0">
     <w:nsid w:val="41E951E7"/>
     <w:multiLevelType w:val="hybridMultilevel"/>
     <w:tmpl w:val="D728C5AA"/>
@@ -1375,7 +4683,7 @@
       </w:pPr>
     </w:lvl>
   </w:abstractNum>
-  <w:abstractNum w:abstractNumId="6" w15:restartNumberingAfterBreak="0">
+  <w:abstractNum w:abstractNumId="12" w15:restartNumberingAfterBreak="0">
     <w:nsid w:val="46E86CF1"/>
     <w:multiLevelType w:val="hybridMultilevel"/>
     <w:tmpl w:val="9732DEEA"/>
@@ -1464,26 +4772,872 @@
       </w:pPr>
     </w:lvl>
   </w:abstractNum>
+  <w:abstractNum w:abstractNumId="13" w15:restartNumberingAfterBreak="0">
+    <w:nsid w:val="477216CB"/>
+    <w:multiLevelType w:val="hybridMultilevel"/>
+    <w:tmpl w:val="D638C09E"/>
+    <w:lvl w:ilvl="0" w:tplc="0409000F">
+      <w:start w:val="1"/>
+      <w:numFmt w:val="decimal"/>
+      <w:lvlText w:val="%1."/>
+      <w:lvlJc w:val="left"/>
+      <w:pPr>
+        <w:ind w:left="720" w:hanging="360"/>
+      </w:pPr>
+      <w:rPr>
+        <w:rFonts w:hint="default"/>
+      </w:rPr>
+    </w:lvl>
+    <w:lvl w:ilvl="1" w:tplc="04090019" w:tentative="1">
+      <w:start w:val="1"/>
+      <w:numFmt w:val="lowerLetter"/>
+      <w:lvlText w:val="%2."/>
+      <w:lvlJc w:val="left"/>
+      <w:pPr>
+        <w:ind w:left="1440" w:hanging="360"/>
+      </w:pPr>
+    </w:lvl>
+    <w:lvl w:ilvl="2" w:tplc="0409001B" w:tentative="1">
+      <w:start w:val="1"/>
+      <w:numFmt w:val="lowerRoman"/>
+      <w:lvlText w:val="%3."/>
+      <w:lvlJc w:val="right"/>
+      <w:pPr>
+        <w:ind w:left="2160" w:hanging="180"/>
+      </w:pPr>
+    </w:lvl>
+    <w:lvl w:ilvl="3" w:tplc="0409000F" w:tentative="1">
+      <w:start w:val="1"/>
+      <w:numFmt w:val="decimal"/>
+      <w:lvlText w:val="%4."/>
+      <w:lvlJc w:val="left"/>
+      <w:pPr>
+        <w:ind w:left="2880" w:hanging="360"/>
+      </w:pPr>
+    </w:lvl>
+    <w:lvl w:ilvl="4" w:tplc="04090019" w:tentative="1">
+      <w:start w:val="1"/>
+      <w:numFmt w:val="lowerLetter"/>
+      <w:lvlText w:val="%5."/>
+      <w:lvlJc w:val="left"/>
+      <w:pPr>
+        <w:ind w:left="3600" w:hanging="360"/>
+      </w:pPr>
+    </w:lvl>
+    <w:lvl w:ilvl="5" w:tplc="0409001B" w:tentative="1">
+      <w:start w:val="1"/>
+      <w:numFmt w:val="lowerRoman"/>
+      <w:lvlText w:val="%6."/>
+      <w:lvlJc w:val="right"/>
+      <w:pPr>
+        <w:ind w:left="4320" w:hanging="180"/>
+      </w:pPr>
+    </w:lvl>
+    <w:lvl w:ilvl="6" w:tplc="0409000F" w:tentative="1">
+      <w:start w:val="1"/>
+      <w:numFmt w:val="decimal"/>
+      <w:lvlText w:val="%7."/>
+      <w:lvlJc w:val="left"/>
+      <w:pPr>
+        <w:ind w:left="5040" w:hanging="360"/>
+      </w:pPr>
+    </w:lvl>
+    <w:lvl w:ilvl="7" w:tplc="04090019" w:tentative="1">
+      <w:start w:val="1"/>
+      <w:numFmt w:val="lowerLetter"/>
+      <w:lvlText w:val="%8."/>
+      <w:lvlJc w:val="left"/>
+      <w:pPr>
+        <w:ind w:left="5760" w:hanging="360"/>
+      </w:pPr>
+    </w:lvl>
+    <w:lvl w:ilvl="8" w:tplc="0409001B" w:tentative="1">
+      <w:start w:val="1"/>
+      <w:numFmt w:val="lowerRoman"/>
+      <w:lvlText w:val="%9."/>
+      <w:lvlJc w:val="right"/>
+      <w:pPr>
+        <w:ind w:left="6480" w:hanging="180"/>
+      </w:pPr>
+    </w:lvl>
+  </w:abstractNum>
+  <w:abstractNum w:abstractNumId="14" w15:restartNumberingAfterBreak="0">
+    <w:nsid w:val="53F774DD"/>
+    <w:multiLevelType w:val="hybridMultilevel"/>
+    <w:tmpl w:val="8BBE88B6"/>
+    <w:lvl w:ilvl="0" w:tplc="0409000F">
+      <w:start w:val="1"/>
+      <w:numFmt w:val="decimal"/>
+      <w:lvlText w:val="%1."/>
+      <w:lvlJc w:val="left"/>
+      <w:pPr>
+        <w:ind w:left="720" w:hanging="360"/>
+      </w:pPr>
+      <w:rPr>
+        <w:rFonts w:hint="default"/>
+      </w:rPr>
+    </w:lvl>
+    <w:lvl w:ilvl="1" w:tplc="04090019" w:tentative="1">
+      <w:start w:val="1"/>
+      <w:numFmt w:val="lowerLetter"/>
+      <w:lvlText w:val="%2."/>
+      <w:lvlJc w:val="left"/>
+      <w:pPr>
+        <w:ind w:left="1440" w:hanging="360"/>
+      </w:pPr>
+    </w:lvl>
+    <w:lvl w:ilvl="2" w:tplc="0409001B" w:tentative="1">
+      <w:start w:val="1"/>
+      <w:numFmt w:val="lowerRoman"/>
+      <w:lvlText w:val="%3."/>
+      <w:lvlJc w:val="right"/>
+      <w:pPr>
+        <w:ind w:left="2160" w:hanging="180"/>
+      </w:pPr>
+    </w:lvl>
+    <w:lvl w:ilvl="3" w:tplc="0409000F" w:tentative="1">
+      <w:start w:val="1"/>
+      <w:numFmt w:val="decimal"/>
+      <w:lvlText w:val="%4."/>
+      <w:lvlJc w:val="left"/>
+      <w:pPr>
+        <w:ind w:left="2880" w:hanging="360"/>
+      </w:pPr>
+    </w:lvl>
+    <w:lvl w:ilvl="4" w:tplc="04090019" w:tentative="1">
+      <w:start w:val="1"/>
+      <w:numFmt w:val="lowerLetter"/>
+      <w:lvlText w:val="%5."/>
+      <w:lvlJc w:val="left"/>
+      <w:pPr>
+        <w:ind w:left="3600" w:hanging="360"/>
+      </w:pPr>
+    </w:lvl>
+    <w:lvl w:ilvl="5" w:tplc="0409001B" w:tentative="1">
+      <w:start w:val="1"/>
+      <w:numFmt w:val="lowerRoman"/>
+      <w:lvlText w:val="%6."/>
+      <w:lvlJc w:val="right"/>
+      <w:pPr>
+        <w:ind w:left="4320" w:hanging="180"/>
+      </w:pPr>
+    </w:lvl>
+    <w:lvl w:ilvl="6" w:tplc="0409000F" w:tentative="1">
+      <w:start w:val="1"/>
+      <w:numFmt w:val="decimal"/>
+      <w:lvlText w:val="%7."/>
+      <w:lvlJc w:val="left"/>
+      <w:pPr>
+        <w:ind w:left="5040" w:hanging="360"/>
+      </w:pPr>
+    </w:lvl>
+    <w:lvl w:ilvl="7" w:tplc="04090019" w:tentative="1">
+      <w:start w:val="1"/>
+      <w:numFmt w:val="lowerLetter"/>
+      <w:lvlText w:val="%8."/>
+      <w:lvlJc w:val="left"/>
+      <w:pPr>
+        <w:ind w:left="5760" w:hanging="360"/>
+      </w:pPr>
+    </w:lvl>
+    <w:lvl w:ilvl="8" w:tplc="0409001B" w:tentative="1">
+      <w:start w:val="1"/>
+      <w:numFmt w:val="lowerRoman"/>
+      <w:lvlText w:val="%9."/>
+      <w:lvlJc w:val="right"/>
+      <w:pPr>
+        <w:ind w:left="6480" w:hanging="180"/>
+      </w:pPr>
+    </w:lvl>
+  </w:abstractNum>
+  <w:abstractNum w:abstractNumId="15" w15:restartNumberingAfterBreak="0">
+    <w:nsid w:val="59FC6119"/>
+    <w:multiLevelType w:val="hybridMultilevel"/>
+    <w:tmpl w:val="9B046A14"/>
+    <w:lvl w:ilvl="0" w:tplc="0409000F">
+      <w:start w:val="1"/>
+      <w:numFmt w:val="decimal"/>
+      <w:lvlText w:val="%1."/>
+      <w:lvlJc w:val="left"/>
+      <w:pPr>
+        <w:ind w:left="720" w:hanging="360"/>
+      </w:pPr>
+      <w:rPr>
+        <w:rFonts w:hint="default"/>
+      </w:rPr>
+    </w:lvl>
+    <w:lvl w:ilvl="1" w:tplc="04090019" w:tentative="1">
+      <w:start w:val="1"/>
+      <w:numFmt w:val="lowerLetter"/>
+      <w:lvlText w:val="%2."/>
+      <w:lvlJc w:val="left"/>
+      <w:pPr>
+        <w:ind w:left="1440" w:hanging="360"/>
+      </w:pPr>
+    </w:lvl>
+    <w:lvl w:ilvl="2" w:tplc="0409001B" w:tentative="1">
+      <w:start w:val="1"/>
+      <w:numFmt w:val="lowerRoman"/>
+      <w:lvlText w:val="%3."/>
+      <w:lvlJc w:val="right"/>
+      <w:pPr>
+        <w:ind w:left="2160" w:hanging="180"/>
+      </w:pPr>
+    </w:lvl>
+    <w:lvl w:ilvl="3" w:tplc="0409000F" w:tentative="1">
+      <w:start w:val="1"/>
+      <w:numFmt w:val="decimal"/>
+      <w:lvlText w:val="%4."/>
+      <w:lvlJc w:val="left"/>
+      <w:pPr>
+        <w:ind w:left="2880" w:hanging="360"/>
+      </w:pPr>
+    </w:lvl>
+    <w:lvl w:ilvl="4" w:tplc="04090019" w:tentative="1">
+      <w:start w:val="1"/>
+      <w:numFmt w:val="lowerLetter"/>
+      <w:lvlText w:val="%5."/>
+      <w:lvlJc w:val="left"/>
+      <w:pPr>
+        <w:ind w:left="3600" w:hanging="360"/>
+      </w:pPr>
+    </w:lvl>
+    <w:lvl w:ilvl="5" w:tplc="0409001B" w:tentative="1">
+      <w:start w:val="1"/>
+      <w:numFmt w:val="lowerRoman"/>
+      <w:lvlText w:val="%6."/>
+      <w:lvlJc w:val="right"/>
+      <w:pPr>
+        <w:ind w:left="4320" w:hanging="180"/>
+      </w:pPr>
+    </w:lvl>
+    <w:lvl w:ilvl="6" w:tplc="0409000F" w:tentative="1">
+      <w:start w:val="1"/>
+      <w:numFmt w:val="decimal"/>
+      <w:lvlText w:val="%7."/>
+      <w:lvlJc w:val="left"/>
+      <w:pPr>
+        <w:ind w:left="5040" w:hanging="360"/>
+      </w:pPr>
+    </w:lvl>
+    <w:lvl w:ilvl="7" w:tplc="04090019" w:tentative="1">
+      <w:start w:val="1"/>
+      <w:numFmt w:val="lowerLetter"/>
+      <w:lvlText w:val="%8."/>
+      <w:lvlJc w:val="left"/>
+      <w:pPr>
+        <w:ind w:left="5760" w:hanging="360"/>
+      </w:pPr>
+    </w:lvl>
+    <w:lvl w:ilvl="8" w:tplc="0409001B" w:tentative="1">
+      <w:start w:val="1"/>
+      <w:numFmt w:val="lowerRoman"/>
+      <w:lvlText w:val="%9."/>
+      <w:lvlJc w:val="right"/>
+      <w:pPr>
+        <w:ind w:left="6480" w:hanging="180"/>
+      </w:pPr>
+    </w:lvl>
+  </w:abstractNum>
+  <w:abstractNum w:abstractNumId="16" w15:restartNumberingAfterBreak="0">
+    <w:nsid w:val="5E2041C4"/>
+    <w:multiLevelType w:val="hybridMultilevel"/>
+    <w:tmpl w:val="F5CA0346"/>
+    <w:lvl w:ilvl="0" w:tplc="0409000F">
+      <w:start w:val="1"/>
+      <w:numFmt w:val="decimal"/>
+      <w:lvlText w:val="%1."/>
+      <w:lvlJc w:val="left"/>
+      <w:pPr>
+        <w:ind w:left="720" w:hanging="360"/>
+      </w:pPr>
+      <w:rPr>
+        <w:rFonts w:hint="default"/>
+      </w:rPr>
+    </w:lvl>
+    <w:lvl w:ilvl="1" w:tplc="04090019" w:tentative="1">
+      <w:start w:val="1"/>
+      <w:numFmt w:val="lowerLetter"/>
+      <w:lvlText w:val="%2."/>
+      <w:lvlJc w:val="left"/>
+      <w:pPr>
+        <w:ind w:left="1440" w:hanging="360"/>
+      </w:pPr>
+    </w:lvl>
+    <w:lvl w:ilvl="2" w:tplc="0409001B" w:tentative="1">
+      <w:start w:val="1"/>
+      <w:numFmt w:val="lowerRoman"/>
+      <w:lvlText w:val="%3."/>
+      <w:lvlJc w:val="right"/>
+      <w:pPr>
+        <w:ind w:left="2160" w:hanging="180"/>
+      </w:pPr>
+    </w:lvl>
+    <w:lvl w:ilvl="3" w:tplc="0409000F" w:tentative="1">
+      <w:start w:val="1"/>
+      <w:numFmt w:val="decimal"/>
+      <w:lvlText w:val="%4."/>
+      <w:lvlJc w:val="left"/>
+      <w:pPr>
+        <w:ind w:left="2880" w:hanging="360"/>
+      </w:pPr>
+    </w:lvl>
+    <w:lvl w:ilvl="4" w:tplc="04090019" w:tentative="1">
+      <w:start w:val="1"/>
+      <w:numFmt w:val="lowerLetter"/>
+      <w:lvlText w:val="%5."/>
+      <w:lvlJc w:val="left"/>
+      <w:pPr>
+        <w:ind w:left="3600" w:hanging="360"/>
+      </w:pPr>
+    </w:lvl>
+    <w:lvl w:ilvl="5" w:tplc="0409001B" w:tentative="1">
+      <w:start w:val="1"/>
+      <w:numFmt w:val="lowerRoman"/>
+      <w:lvlText w:val="%6."/>
+      <w:lvlJc w:val="right"/>
+      <w:pPr>
+        <w:ind w:left="4320" w:hanging="180"/>
+      </w:pPr>
+    </w:lvl>
+    <w:lvl w:ilvl="6" w:tplc="0409000F" w:tentative="1">
+      <w:start w:val="1"/>
+      <w:numFmt w:val="decimal"/>
+      <w:lvlText w:val="%7."/>
+      <w:lvlJc w:val="left"/>
+      <w:pPr>
+        <w:ind w:left="5040" w:hanging="360"/>
+      </w:pPr>
+    </w:lvl>
+    <w:lvl w:ilvl="7" w:tplc="04090019" w:tentative="1">
+      <w:start w:val="1"/>
+      <w:numFmt w:val="lowerLetter"/>
+      <w:lvlText w:val="%8."/>
+      <w:lvlJc w:val="left"/>
+      <w:pPr>
+        <w:ind w:left="5760" w:hanging="360"/>
+      </w:pPr>
+    </w:lvl>
+    <w:lvl w:ilvl="8" w:tplc="0409001B" w:tentative="1">
+      <w:start w:val="1"/>
+      <w:numFmt w:val="lowerRoman"/>
+      <w:lvlText w:val="%9."/>
+      <w:lvlJc w:val="right"/>
+      <w:pPr>
+        <w:ind w:left="6480" w:hanging="180"/>
+      </w:pPr>
+    </w:lvl>
+  </w:abstractNum>
+  <w:abstractNum w:abstractNumId="17" w15:restartNumberingAfterBreak="0">
+    <w:nsid w:val="6EB614C1"/>
+    <w:multiLevelType w:val="hybridMultilevel"/>
+    <w:tmpl w:val="B11AD8B4"/>
+    <w:lvl w:ilvl="0" w:tplc="0409000F">
+      <w:start w:val="1"/>
+      <w:numFmt w:val="decimal"/>
+      <w:lvlText w:val="%1."/>
+      <w:lvlJc w:val="left"/>
+      <w:pPr>
+        <w:ind w:left="720" w:hanging="360"/>
+      </w:pPr>
+      <w:rPr>
+        <w:rFonts w:hint="default"/>
+      </w:rPr>
+    </w:lvl>
+    <w:lvl w:ilvl="1" w:tplc="04090019" w:tentative="1">
+      <w:start w:val="1"/>
+      <w:numFmt w:val="lowerLetter"/>
+      <w:lvlText w:val="%2."/>
+      <w:lvlJc w:val="left"/>
+      <w:pPr>
+        <w:ind w:left="1440" w:hanging="360"/>
+      </w:pPr>
+    </w:lvl>
+    <w:lvl w:ilvl="2" w:tplc="0409001B" w:tentative="1">
+      <w:start w:val="1"/>
+      <w:numFmt w:val="lowerRoman"/>
+      <w:lvlText w:val="%3."/>
+      <w:lvlJc w:val="right"/>
+      <w:pPr>
+        <w:ind w:left="2160" w:hanging="180"/>
+      </w:pPr>
+    </w:lvl>
+    <w:lvl w:ilvl="3" w:tplc="0409000F" w:tentative="1">
+      <w:start w:val="1"/>
+      <w:numFmt w:val="decimal"/>
+      <w:lvlText w:val="%4."/>
+      <w:lvlJc w:val="left"/>
+      <w:pPr>
+        <w:ind w:left="2880" w:hanging="360"/>
+      </w:pPr>
+    </w:lvl>
+    <w:lvl w:ilvl="4" w:tplc="04090019" w:tentative="1">
+      <w:start w:val="1"/>
+      <w:numFmt w:val="lowerLetter"/>
+      <w:lvlText w:val="%5."/>
+      <w:lvlJc w:val="left"/>
+      <w:pPr>
+        <w:ind w:left="3600" w:hanging="360"/>
+      </w:pPr>
+    </w:lvl>
+    <w:lvl w:ilvl="5" w:tplc="0409001B" w:tentative="1">
+      <w:start w:val="1"/>
+      <w:numFmt w:val="lowerRoman"/>
+      <w:lvlText w:val="%6."/>
+      <w:lvlJc w:val="right"/>
+      <w:pPr>
+        <w:ind w:left="4320" w:hanging="180"/>
+      </w:pPr>
+    </w:lvl>
+    <w:lvl w:ilvl="6" w:tplc="0409000F" w:tentative="1">
+      <w:start w:val="1"/>
+      <w:numFmt w:val="decimal"/>
+      <w:lvlText w:val="%7."/>
+      <w:lvlJc w:val="left"/>
+      <w:pPr>
+        <w:ind w:left="5040" w:hanging="360"/>
+      </w:pPr>
+    </w:lvl>
+    <w:lvl w:ilvl="7" w:tplc="04090019" w:tentative="1">
+      <w:start w:val="1"/>
+      <w:numFmt w:val="lowerLetter"/>
+      <w:lvlText w:val="%8."/>
+      <w:lvlJc w:val="left"/>
+      <w:pPr>
+        <w:ind w:left="5760" w:hanging="360"/>
+      </w:pPr>
+    </w:lvl>
+    <w:lvl w:ilvl="8" w:tplc="0409001B" w:tentative="1">
+      <w:start w:val="1"/>
+      <w:numFmt w:val="lowerRoman"/>
+      <w:lvlText w:val="%9."/>
+      <w:lvlJc w:val="right"/>
+      <w:pPr>
+        <w:ind w:left="6480" w:hanging="180"/>
+      </w:pPr>
+    </w:lvl>
+  </w:abstractNum>
+  <w:abstractNum w:abstractNumId="18" w15:restartNumberingAfterBreak="0">
+    <w:nsid w:val="6F8B0254"/>
+    <w:multiLevelType w:val="hybridMultilevel"/>
+    <w:tmpl w:val="36C0CDAE"/>
+    <w:lvl w:ilvl="0" w:tplc="0409000F">
+      <w:start w:val="1"/>
+      <w:numFmt w:val="decimal"/>
+      <w:lvlText w:val="%1."/>
+      <w:lvlJc w:val="left"/>
+      <w:pPr>
+        <w:ind w:left="720" w:hanging="360"/>
+      </w:pPr>
+      <w:rPr>
+        <w:rFonts w:hint="default"/>
+      </w:rPr>
+    </w:lvl>
+    <w:lvl w:ilvl="1" w:tplc="04090019" w:tentative="1">
+      <w:start w:val="1"/>
+      <w:numFmt w:val="lowerLetter"/>
+      <w:lvlText w:val="%2."/>
+      <w:lvlJc w:val="left"/>
+      <w:pPr>
+        <w:ind w:left="1440" w:hanging="360"/>
+      </w:pPr>
+    </w:lvl>
+    <w:lvl w:ilvl="2" w:tplc="0409001B" w:tentative="1">
+      <w:start w:val="1"/>
+      <w:numFmt w:val="lowerRoman"/>
+      <w:lvlText w:val="%3."/>
+      <w:lvlJc w:val="right"/>
+      <w:pPr>
+        <w:ind w:left="2160" w:hanging="180"/>
+      </w:pPr>
+    </w:lvl>
+    <w:lvl w:ilvl="3" w:tplc="0409000F" w:tentative="1">
+      <w:start w:val="1"/>
+      <w:numFmt w:val="decimal"/>
+      <w:lvlText w:val="%4."/>
+      <w:lvlJc w:val="left"/>
+      <w:pPr>
+        <w:ind w:left="2880" w:hanging="360"/>
+      </w:pPr>
+    </w:lvl>
+    <w:lvl w:ilvl="4" w:tplc="04090019" w:tentative="1">
+      <w:start w:val="1"/>
+      <w:numFmt w:val="lowerLetter"/>
+      <w:lvlText w:val="%5."/>
+      <w:lvlJc w:val="left"/>
+      <w:pPr>
+        <w:ind w:left="3600" w:hanging="360"/>
+      </w:pPr>
+    </w:lvl>
+    <w:lvl w:ilvl="5" w:tplc="0409001B" w:tentative="1">
+      <w:start w:val="1"/>
+      <w:numFmt w:val="lowerRoman"/>
+      <w:lvlText w:val="%6."/>
+      <w:lvlJc w:val="right"/>
+      <w:pPr>
+        <w:ind w:left="4320" w:hanging="180"/>
+      </w:pPr>
+    </w:lvl>
+    <w:lvl w:ilvl="6" w:tplc="0409000F" w:tentative="1">
+      <w:start w:val="1"/>
+      <w:numFmt w:val="decimal"/>
+      <w:lvlText w:val="%7."/>
+      <w:lvlJc w:val="left"/>
+      <w:pPr>
+        <w:ind w:left="5040" w:hanging="360"/>
+      </w:pPr>
+    </w:lvl>
+    <w:lvl w:ilvl="7" w:tplc="04090019" w:tentative="1">
+      <w:start w:val="1"/>
+      <w:numFmt w:val="lowerLetter"/>
+      <w:lvlText w:val="%8."/>
+      <w:lvlJc w:val="left"/>
+      <w:pPr>
+        <w:ind w:left="5760" w:hanging="360"/>
+      </w:pPr>
+    </w:lvl>
+    <w:lvl w:ilvl="8" w:tplc="0409001B" w:tentative="1">
+      <w:start w:val="1"/>
+      <w:numFmt w:val="lowerRoman"/>
+      <w:lvlText w:val="%9."/>
+      <w:lvlJc w:val="right"/>
+      <w:pPr>
+        <w:ind w:left="6480" w:hanging="180"/>
+      </w:pPr>
+    </w:lvl>
+  </w:abstractNum>
+  <w:abstractNum w:abstractNumId="19" w15:restartNumberingAfterBreak="0">
+    <w:nsid w:val="74970E84"/>
+    <w:multiLevelType w:val="hybridMultilevel"/>
+    <w:tmpl w:val="9FC49330"/>
+    <w:lvl w:ilvl="0" w:tplc="0409000F">
+      <w:start w:val="1"/>
+      <w:numFmt w:val="decimal"/>
+      <w:lvlText w:val="%1."/>
+      <w:lvlJc w:val="left"/>
+      <w:pPr>
+        <w:ind w:left="720" w:hanging="360"/>
+      </w:pPr>
+      <w:rPr>
+        <w:rFonts w:hint="default"/>
+      </w:rPr>
+    </w:lvl>
+    <w:lvl w:ilvl="1" w:tplc="04090019" w:tentative="1">
+      <w:start w:val="1"/>
+      <w:numFmt w:val="lowerLetter"/>
+      <w:lvlText w:val="%2."/>
+      <w:lvlJc w:val="left"/>
+      <w:pPr>
+        <w:ind w:left="1440" w:hanging="360"/>
+      </w:pPr>
+    </w:lvl>
+    <w:lvl w:ilvl="2" w:tplc="0409001B" w:tentative="1">
+      <w:start w:val="1"/>
+      <w:numFmt w:val="lowerRoman"/>
+      <w:lvlText w:val="%3."/>
+      <w:lvlJc w:val="right"/>
+      <w:pPr>
+        <w:ind w:left="2160" w:hanging="180"/>
+      </w:pPr>
+    </w:lvl>
+    <w:lvl w:ilvl="3" w:tplc="0409000F" w:tentative="1">
+      <w:start w:val="1"/>
+      <w:numFmt w:val="decimal"/>
+      <w:lvlText w:val="%4."/>
+      <w:lvlJc w:val="left"/>
+      <w:pPr>
+        <w:ind w:left="2880" w:hanging="360"/>
+      </w:pPr>
+    </w:lvl>
+    <w:lvl w:ilvl="4" w:tplc="04090019" w:tentative="1">
+      <w:start w:val="1"/>
+      <w:numFmt w:val="lowerLetter"/>
+      <w:lvlText w:val="%5."/>
+      <w:lvlJc w:val="left"/>
+      <w:pPr>
+        <w:ind w:left="3600" w:hanging="360"/>
+      </w:pPr>
+    </w:lvl>
+    <w:lvl w:ilvl="5" w:tplc="0409001B" w:tentative="1">
+      <w:start w:val="1"/>
+      <w:numFmt w:val="lowerRoman"/>
+      <w:lvlText w:val="%6."/>
+      <w:lvlJc w:val="right"/>
+      <w:pPr>
+        <w:ind w:left="4320" w:hanging="180"/>
+      </w:pPr>
+    </w:lvl>
+    <w:lvl w:ilvl="6" w:tplc="0409000F" w:tentative="1">
+      <w:start w:val="1"/>
+      <w:numFmt w:val="decimal"/>
+      <w:lvlText w:val="%7."/>
+      <w:lvlJc w:val="left"/>
+      <w:pPr>
+        <w:ind w:left="5040" w:hanging="360"/>
+      </w:pPr>
+    </w:lvl>
+    <w:lvl w:ilvl="7" w:tplc="04090019" w:tentative="1">
+      <w:start w:val="1"/>
+      <w:numFmt w:val="lowerLetter"/>
+      <w:lvlText w:val="%8."/>
+      <w:lvlJc w:val="left"/>
+      <w:pPr>
+        <w:ind w:left="5760" w:hanging="360"/>
+      </w:pPr>
+    </w:lvl>
+    <w:lvl w:ilvl="8" w:tplc="0409001B" w:tentative="1">
+      <w:start w:val="1"/>
+      <w:numFmt w:val="lowerRoman"/>
+      <w:lvlText w:val="%9."/>
+      <w:lvlJc w:val="right"/>
+      <w:pPr>
+        <w:ind w:left="6480" w:hanging="180"/>
+      </w:pPr>
+    </w:lvl>
+  </w:abstractNum>
+  <w:abstractNum w:abstractNumId="20" w15:restartNumberingAfterBreak="0">
+    <w:nsid w:val="78C43BBF"/>
+    <w:multiLevelType w:val="hybridMultilevel"/>
+    <w:tmpl w:val="8BB63548"/>
+    <w:lvl w:ilvl="0" w:tplc="0409000F">
+      <w:start w:val="1"/>
+      <w:numFmt w:val="decimal"/>
+      <w:lvlText w:val="%1."/>
+      <w:lvlJc w:val="left"/>
+      <w:pPr>
+        <w:ind w:left="720" w:hanging="360"/>
+      </w:pPr>
+      <w:rPr>
+        <w:rFonts w:hint="default"/>
+      </w:rPr>
+    </w:lvl>
+    <w:lvl w:ilvl="1" w:tplc="04090019" w:tentative="1">
+      <w:start w:val="1"/>
+      <w:numFmt w:val="lowerLetter"/>
+      <w:lvlText w:val="%2."/>
+      <w:lvlJc w:val="left"/>
+      <w:pPr>
+        <w:ind w:left="1440" w:hanging="360"/>
+      </w:pPr>
+    </w:lvl>
+    <w:lvl w:ilvl="2" w:tplc="0409001B" w:tentative="1">
+      <w:start w:val="1"/>
+      <w:numFmt w:val="lowerRoman"/>
+      <w:lvlText w:val="%3."/>
+      <w:lvlJc w:val="right"/>
+      <w:pPr>
+        <w:ind w:left="2160" w:hanging="180"/>
+      </w:pPr>
+    </w:lvl>
+    <w:lvl w:ilvl="3" w:tplc="0409000F" w:tentative="1">
+      <w:start w:val="1"/>
+      <w:numFmt w:val="decimal"/>
+      <w:lvlText w:val="%4."/>
+      <w:lvlJc w:val="left"/>
+      <w:pPr>
+        <w:ind w:left="2880" w:hanging="360"/>
+      </w:pPr>
+    </w:lvl>
+    <w:lvl w:ilvl="4" w:tplc="04090019" w:tentative="1">
+      <w:start w:val="1"/>
+      <w:numFmt w:val="lowerLetter"/>
+      <w:lvlText w:val="%5."/>
+      <w:lvlJc w:val="left"/>
+      <w:pPr>
+        <w:ind w:left="3600" w:hanging="360"/>
+      </w:pPr>
+    </w:lvl>
+    <w:lvl w:ilvl="5" w:tplc="0409001B" w:tentative="1">
+      <w:start w:val="1"/>
+      <w:numFmt w:val="lowerRoman"/>
+      <w:lvlText w:val="%6."/>
+      <w:lvlJc w:val="right"/>
+      <w:pPr>
+        <w:ind w:left="4320" w:hanging="180"/>
+      </w:pPr>
+    </w:lvl>
+    <w:lvl w:ilvl="6" w:tplc="0409000F" w:tentative="1">
+      <w:start w:val="1"/>
+      <w:numFmt w:val="decimal"/>
+      <w:lvlText w:val="%7."/>
+      <w:lvlJc w:val="left"/>
+      <w:pPr>
+        <w:ind w:left="5040" w:hanging="360"/>
+      </w:pPr>
+    </w:lvl>
+    <w:lvl w:ilvl="7" w:tplc="04090019" w:tentative="1">
+      <w:start w:val="1"/>
+      <w:numFmt w:val="lowerLetter"/>
+      <w:lvlText w:val="%8."/>
+      <w:lvlJc w:val="left"/>
+      <w:pPr>
+        <w:ind w:left="5760" w:hanging="360"/>
+      </w:pPr>
+    </w:lvl>
+    <w:lvl w:ilvl="8" w:tplc="0409001B" w:tentative="1">
+      <w:start w:val="1"/>
+      <w:numFmt w:val="lowerRoman"/>
+      <w:lvlText w:val="%9."/>
+      <w:lvlJc w:val="right"/>
+      <w:pPr>
+        <w:ind w:left="6480" w:hanging="180"/>
+      </w:pPr>
+    </w:lvl>
+  </w:abstractNum>
+  <w:abstractNum w:abstractNumId="21" w15:restartNumberingAfterBreak="0">
+    <w:nsid w:val="7CBB7824"/>
+    <w:multiLevelType w:val="hybridMultilevel"/>
+    <w:tmpl w:val="54047810"/>
+    <w:lvl w:ilvl="0" w:tplc="0409000F">
+      <w:start w:val="1"/>
+      <w:numFmt w:val="decimal"/>
+      <w:lvlText w:val="%1."/>
+      <w:lvlJc w:val="left"/>
+      <w:pPr>
+        <w:ind w:left="720" w:hanging="360"/>
+      </w:pPr>
+      <w:rPr>
+        <w:rFonts w:hint="default"/>
+      </w:rPr>
+    </w:lvl>
+    <w:lvl w:ilvl="1" w:tplc="04090019" w:tentative="1">
+      <w:start w:val="1"/>
+      <w:numFmt w:val="lowerLetter"/>
+      <w:lvlText w:val="%2."/>
+      <w:lvlJc w:val="left"/>
+      <w:pPr>
+        <w:ind w:left="1440" w:hanging="360"/>
+      </w:pPr>
+    </w:lvl>
+    <w:lvl w:ilvl="2" w:tplc="0409001B" w:tentative="1">
+      <w:start w:val="1"/>
+      <w:numFmt w:val="lowerRoman"/>
+      <w:lvlText w:val="%3."/>
+      <w:lvlJc w:val="right"/>
+      <w:pPr>
+        <w:ind w:left="2160" w:hanging="180"/>
+      </w:pPr>
+    </w:lvl>
+    <w:lvl w:ilvl="3" w:tplc="0409000F" w:tentative="1">
+      <w:start w:val="1"/>
+      <w:numFmt w:val="decimal"/>
+      <w:lvlText w:val="%4."/>
+      <w:lvlJc w:val="left"/>
+      <w:pPr>
+        <w:ind w:left="2880" w:hanging="360"/>
+      </w:pPr>
+    </w:lvl>
+    <w:lvl w:ilvl="4" w:tplc="04090019" w:tentative="1">
+      <w:start w:val="1"/>
+      <w:numFmt w:val="lowerLetter"/>
+      <w:lvlText w:val="%5."/>
+      <w:lvlJc w:val="left"/>
+      <w:pPr>
+        <w:ind w:left="3600" w:hanging="360"/>
+      </w:pPr>
+    </w:lvl>
+    <w:lvl w:ilvl="5" w:tplc="0409001B" w:tentative="1">
+      <w:start w:val="1"/>
+      <w:numFmt w:val="lowerRoman"/>
+      <w:lvlText w:val="%6."/>
+      <w:lvlJc w:val="right"/>
+      <w:pPr>
+        <w:ind w:left="4320" w:hanging="180"/>
+      </w:pPr>
+    </w:lvl>
+    <w:lvl w:ilvl="6" w:tplc="0409000F" w:tentative="1">
+      <w:start w:val="1"/>
+      <w:numFmt w:val="decimal"/>
+      <w:lvlText w:val="%7."/>
+      <w:lvlJc w:val="left"/>
+      <w:pPr>
+        <w:ind w:left="5040" w:hanging="360"/>
+      </w:pPr>
+    </w:lvl>
+    <w:lvl w:ilvl="7" w:tplc="04090019" w:tentative="1">
+      <w:start w:val="1"/>
+      <w:numFmt w:val="lowerLetter"/>
+      <w:lvlText w:val="%8."/>
+      <w:lvlJc w:val="left"/>
+      <w:pPr>
+        <w:ind w:left="5760" w:hanging="360"/>
+      </w:pPr>
+    </w:lvl>
+    <w:lvl w:ilvl="8" w:tplc="0409001B" w:tentative="1">
+      <w:start w:val="1"/>
+      <w:numFmt w:val="lowerRoman"/>
+      <w:lvlText w:val="%9."/>
+      <w:lvlJc w:val="right"/>
+      <w:pPr>
+        <w:ind w:left="6480" w:hanging="180"/>
+      </w:pPr>
+    </w:lvl>
+  </w:abstractNum>
   <w:num w:numId="1" w16cid:durableId="1277978649">
+    <w:abstractNumId w:val="2"/>
+  </w:num>
+  <w:num w:numId="2" w16cid:durableId="1569879146">
+    <w:abstractNumId w:val="10"/>
+  </w:num>
+  <w:num w:numId="3" w16cid:durableId="2035567955">
+    <w:abstractNumId w:val="5"/>
+  </w:num>
+  <w:num w:numId="4" w16cid:durableId="1783576402">
+    <w:abstractNumId w:val="9"/>
+  </w:num>
+  <w:num w:numId="5" w16cid:durableId="1096361739">
     <w:abstractNumId w:val="1"/>
   </w:num>
-  <w:num w:numId="2" w16cid:durableId="1569879146">
+  <w:num w:numId="6" w16cid:durableId="777987303">
+    <w:abstractNumId w:val="11"/>
+  </w:num>
+  <w:num w:numId="7" w16cid:durableId="769394706">
+    <w:abstractNumId w:val="12"/>
+  </w:num>
+  <w:num w:numId="8" w16cid:durableId="823862055">
     <w:abstractNumId w:val="4"/>
   </w:num>
-  <w:num w:numId="3" w16cid:durableId="2035567955">
-    <w:abstractNumId w:val="2"/>
+  <w:num w:numId="9" w16cid:durableId="1179539560">
+    <w:abstractNumId w:val="17"/>
   </w:num>
-  <w:num w:numId="4" w16cid:durableId="1783576402">
+  <w:num w:numId="10" w16cid:durableId="887767792">
+    <w:abstractNumId w:val="14"/>
+  </w:num>
+  <w:num w:numId="11" w16cid:durableId="869293645">
+    <w:abstractNumId w:val="16"/>
+  </w:num>
+  <w:num w:numId="12" w16cid:durableId="42406734">
+    <w:abstractNumId w:val="19"/>
+  </w:num>
+  <w:num w:numId="13" w16cid:durableId="999120446">
+    <w:abstractNumId w:val="15"/>
+  </w:num>
+  <w:num w:numId="14" w16cid:durableId="1562791856">
+    <w:abstractNumId w:val="6"/>
+  </w:num>
+  <w:num w:numId="15" w16cid:durableId="1582332008">
     <w:abstractNumId w:val="3"/>
   </w:num>
-  <w:num w:numId="5" w16cid:durableId="1096361739">
+  <w:num w:numId="16" w16cid:durableId="1419135015">
+    <w:abstractNumId w:val="7"/>
+  </w:num>
+  <w:num w:numId="17" w16cid:durableId="897058677">
+    <w:abstractNumId w:val="20"/>
+  </w:num>
+  <w:num w:numId="18" w16cid:durableId="1750082258">
+    <w:abstractNumId w:val="8"/>
+  </w:num>
+  <w:num w:numId="19" w16cid:durableId="1237132301">
     <w:abstractNumId w:val="0"/>
   </w:num>
-  <w:num w:numId="6" w16cid:durableId="777987303">
-    <w:abstractNumId w:val="5"/>
+  <w:num w:numId="20" w16cid:durableId="393628986">
+    <w:abstractNumId w:val="13"/>
   </w:num>
-  <w:num w:numId="7" w16cid:durableId="769394706">
-    <w:abstractNumId w:val="6"/>
+  <w:num w:numId="21" w16cid:durableId="368993634">
+    <w:abstractNumId w:val="18"/>
+  </w:num>
+  <w:num w:numId="22" w16cid:durableId="2023697524">
+    <w:abstractNumId w:val="21"/>
   </w:num>
 </w:numbering>
 </file>
@@ -2092,7 +6246,6 @@
   <w:style w:type="character" w:default="1" w:styleId="DefaultParagraphFont">
     <w:name w:val="Default Paragraph Font"/>
     <w:uiPriority w:val="1"/>
-    <w:semiHidden/>
     <w:unhideWhenUsed/>
   </w:style>
   <w:style w:type="table" w:default="1" w:styleId="TableNormal">
@@ -2408,6 +6561,25 @@
       <w:spacing w:val="5"/>
     </w:rPr>
   </w:style>
+  <w:style w:type="table" w:styleId="TableGrid">
+    <w:name w:val="Table Grid"/>
+    <w:basedOn w:val="TableNormal"/>
+    <w:uiPriority w:val="39"/>
+    <w:rsid w:val="00E91230"/>
+    <w:pPr>
+      <w:spacing w:after="0" w:line="240" w:lineRule="auto"/>
+    </w:pPr>
+    <w:tblPr>
+      <w:tblBorders>
+        <w:top w:val="single" w:sz="4" w:space="0" w:color="auto"/>
+        <w:left w:val="single" w:sz="4" w:space="0" w:color="auto"/>
+        <w:bottom w:val="single" w:sz="4" w:space="0" w:color="auto"/>
+        <w:right w:val="single" w:sz="4" w:space="0" w:color="auto"/>
+        <w:insideH w:val="single" w:sz="4" w:space="0" w:color="auto"/>
+        <w:insideV w:val="single" w:sz="4" w:space="0" w:color="auto"/>
+      </w:tblBorders>
+    </w:tblPr>
+  </w:style>
 </w:styles>
 </file>
 

</xml_diff>

<commit_message>
jdbc examples and notes
</commit_message>
<xml_diff>
--- a/Java Full Stack Notes.docx
+++ b/Java Full Stack Notes.docx
@@ -283,7 +283,63 @@
         </w:numPr>
       </w:pPr>
       <w:r>
-        <w:t>Primitive datatypes - byte(1), short(2), int(4), long(8), float(4), double(8), boolean, char(2)</w:t>
+        <w:t xml:space="preserve">Primitive datatypes - </w:t>
+      </w:r>
+      <w:proofErr w:type="gramStart"/>
+      <w:r>
+        <w:t>byte(</w:t>
+      </w:r>
+      <w:proofErr w:type="gramEnd"/>
+      <w:r>
+        <w:t xml:space="preserve">1), </w:t>
+      </w:r>
+      <w:proofErr w:type="gramStart"/>
+      <w:r>
+        <w:t>short(</w:t>
+      </w:r>
+      <w:proofErr w:type="gramEnd"/>
+      <w:r>
+        <w:t xml:space="preserve">2), </w:t>
+      </w:r>
+      <w:proofErr w:type="gramStart"/>
+      <w:r>
+        <w:t>int(</w:t>
+      </w:r>
+      <w:proofErr w:type="gramEnd"/>
+      <w:r>
+        <w:t xml:space="preserve">4), </w:t>
+      </w:r>
+      <w:proofErr w:type="gramStart"/>
+      <w:r>
+        <w:t>long(</w:t>
+      </w:r>
+      <w:proofErr w:type="gramEnd"/>
+      <w:r>
+        <w:t xml:space="preserve">8), </w:t>
+      </w:r>
+      <w:proofErr w:type="gramStart"/>
+      <w:r>
+        <w:t>float(</w:t>
+      </w:r>
+      <w:proofErr w:type="gramEnd"/>
+      <w:r>
+        <w:t xml:space="preserve">4), </w:t>
+      </w:r>
+      <w:proofErr w:type="gramStart"/>
+      <w:r>
+        <w:t>double(</w:t>
+      </w:r>
+      <w:proofErr w:type="gramEnd"/>
+      <w:r>
+        <w:t xml:space="preserve">8), boolean, </w:t>
+      </w:r>
+      <w:proofErr w:type="gramStart"/>
+      <w:r>
+        <w:t>char(</w:t>
+      </w:r>
+      <w:proofErr w:type="gramEnd"/>
+      <w:r>
+        <w:t>2)</w:t>
       </w:r>
     </w:p>
     <w:p>
@@ -715,20 +771,39 @@
       <w:r>
         <w:t xml:space="preserve">Enter the size of an array and using scanner accept input and store the values in the array using the syntax </w:t>
       </w:r>
+      <w:proofErr w:type="gramStart"/>
       <w:r>
         <w:rPr>
           <w:color w:val="EE0000"/>
         </w:rPr>
-        <w:t>int[] items = new int[size]</w:t>
-      </w:r>
+        <w:t>int[</w:t>
+      </w:r>
+      <w:proofErr w:type="gramEnd"/>
       <w:r>
         <w:rPr>
           <w:color w:val="EE0000"/>
         </w:rPr>
+        <w:t>] items = new int[size</w:t>
+      </w:r>
+      <w:proofErr w:type="gramStart"/>
+      <w:r>
+        <w:rPr>
+          <w:color w:val="EE0000"/>
+        </w:rPr>
+        <w:t>]</w:t>
+      </w:r>
+      <w:r>
+        <w:rPr>
+          <w:color w:val="EE0000"/>
+        </w:rPr>
         <w:t xml:space="preserve"> </w:t>
       </w:r>
       <w:r>
-        <w:t>, after you store values in the array print min, max and sum of the elements present in the array using single for loop:</w:t>
+        <w:t>,</w:t>
+      </w:r>
+      <w:proofErr w:type="gramEnd"/>
+      <w:r>
+        <w:t xml:space="preserve"> after you store values in the array print min, max and sum of the elements present in the array using single for loop:</w:t>
       </w:r>
     </w:p>
     <w:p>
@@ -1500,7 +1575,15 @@
         <w:ind w:left="0" w:firstLine="0"/>
       </w:pPr>
       <w:r>
-        <w:t>It makes a single method to give multiple result, it is achieved using same method name and signature but different logics in the subclass</w:t>
+        <w:t xml:space="preserve">It makes a single method to give multiple </w:t>
+      </w:r>
+      <w:proofErr w:type="gramStart"/>
+      <w:r>
+        <w:t>result,</w:t>
+      </w:r>
+      <w:proofErr w:type="gramEnd"/>
+      <w:r>
+        <w:t xml:space="preserve"> it is achieved using same method name and signature but different logics in the subclass</w:t>
       </w:r>
     </w:p>
     <w:p>
@@ -2107,7 +2190,15 @@
               <w:ind w:left="0" w:firstLine="0"/>
             </w:pPr>
             <w:r>
-              <w:t>Methods are not abstract by default, you must explicitly use abstract keyword.</w:t>
+              <w:t xml:space="preserve">Methods are not abstract by </w:t>
+            </w:r>
+            <w:proofErr w:type="gramStart"/>
+            <w:r>
+              <w:t>default,</w:t>
+            </w:r>
+            <w:proofErr w:type="gramEnd"/>
+            <w:r>
+              <w:t xml:space="preserve"> you must explicitly use abstract keyword.</w:t>
             </w:r>
           </w:p>
         </w:tc>
@@ -2233,8 +2324,13 @@
           <w:numId w:val="10"/>
         </w:numPr>
       </w:pPr>
-      <w:r>
-        <w:t>StringBuffer / StringBuilder</w:t>
+      <w:proofErr w:type="spellStart"/>
+      <w:r>
+        <w:t>StringBuffer</w:t>
+      </w:r>
+      <w:proofErr w:type="spellEnd"/>
+      <w:r>
+        <w:t xml:space="preserve"> / StringBuilder</w:t>
       </w:r>
     </w:p>
     <w:p>
@@ -2510,7 +2606,91 @@
         <w:rPr>
           <w:color w:val="EE0000"/>
         </w:rPr>
-        <w:t>- add(), remove(), iterator(), size(), clear(), isEmpty()</w:t>
+        <w:t xml:space="preserve">- </w:t>
+      </w:r>
+      <w:proofErr w:type="gramStart"/>
+      <w:r>
+        <w:rPr>
+          <w:color w:val="EE0000"/>
+        </w:rPr>
+        <w:t>add(</w:t>
+      </w:r>
+      <w:proofErr w:type="gramEnd"/>
+      <w:r>
+        <w:rPr>
+          <w:color w:val="EE0000"/>
+        </w:rPr>
+        <w:t xml:space="preserve">), </w:t>
+      </w:r>
+      <w:proofErr w:type="gramStart"/>
+      <w:r>
+        <w:rPr>
+          <w:color w:val="EE0000"/>
+        </w:rPr>
+        <w:t>remove(</w:t>
+      </w:r>
+      <w:proofErr w:type="gramEnd"/>
+      <w:r>
+        <w:rPr>
+          <w:color w:val="EE0000"/>
+        </w:rPr>
+        <w:t xml:space="preserve">), </w:t>
+      </w:r>
+      <w:proofErr w:type="gramStart"/>
+      <w:r>
+        <w:rPr>
+          <w:color w:val="EE0000"/>
+        </w:rPr>
+        <w:t>iterator(</w:t>
+      </w:r>
+      <w:proofErr w:type="gramEnd"/>
+      <w:r>
+        <w:rPr>
+          <w:color w:val="EE0000"/>
+        </w:rPr>
+        <w:t xml:space="preserve">), </w:t>
+      </w:r>
+      <w:proofErr w:type="gramStart"/>
+      <w:r>
+        <w:rPr>
+          <w:color w:val="EE0000"/>
+        </w:rPr>
+        <w:t>size(</w:t>
+      </w:r>
+      <w:proofErr w:type="gramEnd"/>
+      <w:r>
+        <w:rPr>
+          <w:color w:val="EE0000"/>
+        </w:rPr>
+        <w:t xml:space="preserve">), </w:t>
+      </w:r>
+      <w:proofErr w:type="gramStart"/>
+      <w:r>
+        <w:rPr>
+          <w:color w:val="EE0000"/>
+        </w:rPr>
+        <w:t>clear(</w:t>
+      </w:r>
+      <w:proofErr w:type="gramEnd"/>
+      <w:r>
+        <w:rPr>
+          <w:color w:val="EE0000"/>
+        </w:rPr>
+        <w:t xml:space="preserve">), </w:t>
+      </w:r>
+      <w:proofErr w:type="gramStart"/>
+      <w:r>
+        <w:rPr>
+          <w:color w:val="EE0000"/>
+        </w:rPr>
+        <w:t>isEmpty(</w:t>
+      </w:r>
+      <w:proofErr w:type="gramEnd"/>
+      <w:r>
+        <w:rPr>
+          <w:color w:val="EE0000"/>
+        </w:rPr>
+        <w:t>)</w:t>
       </w:r>
     </w:p>
     <w:p>
@@ -2624,8 +2804,13 @@
           <w:numId w:val="16"/>
         </w:numPr>
       </w:pPr>
-      <w:r>
-        <w:t>hasNext(): checks if element is present to iterate</w:t>
+      <w:proofErr w:type="gramStart"/>
+      <w:r>
+        <w:t>hasNext(</w:t>
+      </w:r>
+      <w:proofErr w:type="gramEnd"/>
+      <w:r>
+        <w:t>): checks if element is present to iterate</w:t>
       </w:r>
     </w:p>
     <w:p>
@@ -2636,8 +2821,13 @@
           <w:numId w:val="16"/>
         </w:numPr>
       </w:pPr>
-      <w:r>
-        <w:t>next(): returns the iterated element</w:t>
+      <w:proofErr w:type="gramStart"/>
+      <w:r>
+        <w:t>next(</w:t>
+      </w:r>
+      <w:proofErr w:type="gramEnd"/>
+      <w:r>
+        <w:t>): returns the iterated element</w:t>
       </w:r>
     </w:p>
     <w:p>
@@ -2648,25 +2838,32 @@
           <w:numId w:val="16"/>
         </w:numPr>
       </w:pPr>
-      <w:r>
-        <w:t>remove(): removes the iterated element</w:t>
-      </w:r>
-    </w:p>
-    <w:p>
-      <w:pPr>
-        <w:ind w:left="0" w:firstLine="0"/>
-      </w:pPr>
-    </w:p>
-    <w:p>
-      <w:pPr>
-        <w:ind w:left="0" w:firstLine="0"/>
-      </w:pPr>
+      <w:proofErr w:type="gramStart"/>
+      <w:r>
+        <w:t>remove(</w:t>
+      </w:r>
+      <w:proofErr w:type="gramEnd"/>
+      <w:r>
+        <w:t>): removes the iterated element</w:t>
+      </w:r>
+    </w:p>
+    <w:p>
+      <w:pPr>
+        <w:ind w:left="0" w:firstLine="0"/>
+      </w:pPr>
+    </w:p>
+    <w:p>
+      <w:pPr>
+        <w:ind w:left="0" w:firstLine="0"/>
+      </w:pPr>
+      <w:proofErr w:type="spellStart"/>
       <w:r>
         <w:rPr>
           <w:highlight w:val="yellow"/>
         </w:rPr>
         <w:t>StudentRepo</w:t>
       </w:r>
+      <w:proofErr w:type="spellEnd"/>
     </w:p>
     <w:p>
       <w:pPr>
@@ -2844,7 +3041,15 @@
         <w:ind w:left="0" w:firstLine="0"/>
       </w:pPr>
       <w:r>
-        <w:t>We have try, catch, finally, throw &amp; throws</w:t>
+        <w:t xml:space="preserve">We have </w:t>
+      </w:r>
+      <w:proofErr w:type="gramStart"/>
+      <w:r>
+        <w:t>try</w:t>
+      </w:r>
+      <w:proofErr w:type="gramEnd"/>
+      <w:r>
+        <w:t>, catch, finally, throw &amp; throws</w:t>
       </w:r>
     </w:p>
     <w:p>
@@ -2882,28 +3087,56 @@
       <w:r>
         <w:t xml:space="preserve"> </w:t>
       </w:r>
-      <w:r>
-        <w:t xml:space="preserve">put(key, value), remove(key), </w:t>
-      </w:r>
-      <w:r>
-        <w:t xml:space="preserve">replace(key, value), </w:t>
+      <w:proofErr w:type="gramStart"/>
+      <w:r>
+        <w:t>put(</w:t>
+      </w:r>
+      <w:proofErr w:type="gramEnd"/>
+      <w:r>
+        <w:t xml:space="preserve">key, value), remove(key), </w:t>
+      </w:r>
+      <w:proofErr w:type="gramStart"/>
+      <w:r>
+        <w:t>replace(</w:t>
+      </w:r>
+      <w:proofErr w:type="gramEnd"/>
+      <w:r>
+        <w:t xml:space="preserve">key, value), </w:t>
       </w:r>
       <w:r>
         <w:t xml:space="preserve">get(key), </w:t>
       </w:r>
-      <w:r>
-        <w:t xml:space="preserve">keySet(), </w:t>
-      </w:r>
-      <w:r>
-        <w:t>values()</w:t>
-      </w:r>
-    </w:p>
-    <w:p>
-      <w:pPr>
-        <w:ind w:left="0" w:firstLine="0"/>
-      </w:pPr>
-      <w:r>
-        <w:t>It maintains the data in key value pairs, key should be unique but value can be duplicate.</w:t>
+      <w:proofErr w:type="gramStart"/>
+      <w:r>
+        <w:t>keySet(</w:t>
+      </w:r>
+      <w:proofErr w:type="gramEnd"/>
+      <w:r>
+        <w:t xml:space="preserve">), </w:t>
+      </w:r>
+      <w:proofErr w:type="gramStart"/>
+      <w:r>
+        <w:t>values(</w:t>
+      </w:r>
+      <w:proofErr w:type="gramEnd"/>
+      <w:r>
+        <w:t>)</w:t>
+      </w:r>
+    </w:p>
+    <w:p>
+      <w:pPr>
+        <w:ind w:left="0" w:firstLine="0"/>
+      </w:pPr>
+      <w:r>
+        <w:t xml:space="preserve">It maintains the data in key value </w:t>
+      </w:r>
+      <w:proofErr w:type="gramStart"/>
+      <w:r>
+        <w:t>pairs,</w:t>
+      </w:r>
+      <w:proofErr w:type="gramEnd"/>
+      <w:r>
+        <w:t xml:space="preserve"> key should be unique but value can be duplicate.</w:t>
       </w:r>
     </w:p>
     <w:p>
@@ -3070,7 +3303,15 @@
         <w:ind w:left="0" w:firstLine="0"/>
       </w:pPr>
       <w:r>
-        <w:t>Comparator: it is to customize the sorting  to use multiple parameters</w:t>
+        <w:t xml:space="preserve">Comparator: it is to customize the </w:t>
+      </w:r>
+      <w:proofErr w:type="gramStart"/>
+      <w:r>
+        <w:t>sorting  to</w:t>
+      </w:r>
+      <w:proofErr w:type="gramEnd"/>
+      <w:r>
+        <w:t xml:space="preserve"> use multiple parameters</w:t>
       </w:r>
     </w:p>
     <w:p>
@@ -3289,7 +3530,15 @@
         <w:t>Note:</w:t>
       </w:r>
       <w:r>
-        <w:t xml:space="preserve"> Any object you want to serialize must by marked with marker interface</w:t>
+        <w:t xml:space="preserve"> Any object you want to serialize must </w:t>
+      </w:r>
+      <w:proofErr w:type="spellStart"/>
+      <w:r>
+        <w:t>by</w:t>
+      </w:r>
+      <w:proofErr w:type="spellEnd"/>
+      <w:r>
+        <w:t xml:space="preserve"> marked with marker interface</w:t>
       </w:r>
       <w:r>
         <w:t xml:space="preserve"> called Serializable, a marker interface doesn’t have any abstract methods</w:t>
@@ -3315,27 +3564,74 @@
       </w:r>
       <w:r>
         <w:br/>
-        <w:t>FileInputStream fileInput = new FileInputStream(“student.ser”);</w:t>
+        <w:t>FileInputStream fileInput = new FileInputStream(“</w:t>
+      </w:r>
+      <w:proofErr w:type="spellStart"/>
+      <w:r>
+        <w:t>student.ser</w:t>
+      </w:r>
+      <w:proofErr w:type="spellEnd"/>
+      <w:r>
+        <w:t>”);</w:t>
       </w:r>
       <w:r>
         <w:br/>
-        <w:t>FileOutputStream fileOutput = new FileOutputStream(“student.ser”);</w:t>
-      </w:r>
-    </w:p>
-    <w:p>
-      <w:pPr>
-        <w:ind w:left="0" w:firstLine="0"/>
-      </w:pPr>
-      <w:r>
-        <w:t>ObjectOutputStream oos = new ObjectOutputStream(fileOutput);</w:t>
+        <w:t xml:space="preserve">FileOutputStream </w:t>
+      </w:r>
+      <w:proofErr w:type="spellStart"/>
+      <w:r>
+        <w:t>fileOutput</w:t>
+      </w:r>
+      <w:proofErr w:type="spellEnd"/>
+      <w:r>
+        <w:t xml:space="preserve"> = new FileOutputStream(“</w:t>
+      </w:r>
+      <w:proofErr w:type="spellStart"/>
+      <w:r>
+        <w:t>student.ser</w:t>
+      </w:r>
+      <w:proofErr w:type="spellEnd"/>
+      <w:r>
+        <w:t>”);</w:t>
+      </w:r>
+    </w:p>
+    <w:p>
+      <w:pPr>
+        <w:ind w:left="0" w:firstLine="0"/>
+      </w:pPr>
+      <w:r>
+        <w:t>ObjectOutputStream oos = new ObjectOutputStream(</w:t>
+      </w:r>
+      <w:proofErr w:type="spellStart"/>
+      <w:r>
+        <w:t>fileOutput</w:t>
+      </w:r>
+      <w:proofErr w:type="spellEnd"/>
+      <w:r>
+        <w:t>);</w:t>
       </w:r>
       <w:r>
         <w:br/>
-        <w:t>obj = new Student(101, “Raj”, 56.0);</w:t>
+        <w:t xml:space="preserve">obj = new </w:t>
+      </w:r>
+      <w:proofErr w:type="gramStart"/>
+      <w:r>
+        <w:t>Student(</w:t>
+      </w:r>
+      <w:proofErr w:type="gramEnd"/>
+      <w:r>
+        <w:t>101, “Raj”, 56.0);</w:t>
       </w:r>
       <w:r>
         <w:br/>
-        <w:t>oos.writeObject(obj); =&gt; checks the obj is Serializable &amp; stores in the file else throws exception</w:t>
+      </w:r>
+      <w:proofErr w:type="gramStart"/>
+      <w:r>
+        <w:t>oos.writeObject</w:t>
+      </w:r>
+      <w:proofErr w:type="gramEnd"/>
+      <w:r>
+        <w:t>(obj); =&gt; checks the obj is Serializable &amp; stores in the file else throws exception</w:t>
       </w:r>
     </w:p>
     <w:p>
@@ -3355,7 +3651,16 @@
       </w:r>
       <w:r>
         <w:br/>
-        <w:t>oos.readObject() -&gt; returns the object present in the file</w:t>
+      </w:r>
+      <w:proofErr w:type="spellStart"/>
+      <w:proofErr w:type="gramStart"/>
+      <w:r>
+        <w:t>oos.readObject</w:t>
+      </w:r>
+      <w:proofErr w:type="spellEnd"/>
+      <w:proofErr w:type="gramEnd"/>
+      <w:r>
+        <w:t>() -&gt; returns the object present in the file</w:t>
       </w:r>
     </w:p>
     <w:p>
@@ -3472,10 +3777,26 @@
         <w:t>boolean</w:t>
       </w:r>
       <w:r>
-        <w:t xml:space="preserve"> test(T t);</w:t>
-      </w:r>
-      <w:r>
-        <w:t xml:space="preserve">  (data) -&gt; data % 2 == 0</w:t>
+        <w:t xml:space="preserve"> </w:t>
+      </w:r>
+      <w:proofErr w:type="gramStart"/>
+      <w:r>
+        <w:t>test(</w:t>
+      </w:r>
+      <w:proofErr w:type="gramEnd"/>
+      <w:r>
+        <w:t>T t</w:t>
+      </w:r>
+      <w:proofErr w:type="gramStart"/>
+      <w:r>
+        <w:t>);</w:t>
+      </w:r>
+      <w:r>
+        <w:t xml:space="preserve">  (</w:t>
+      </w:r>
+      <w:proofErr w:type="gramEnd"/>
+      <w:r>
+        <w:t>data) -&gt; data % 2 == 0</w:t>
       </w:r>
     </w:p>
     <w:p>
@@ -3500,7 +3821,15 @@
         <w:t>void</w:t>
       </w:r>
       <w:r>
-        <w:t xml:space="preserve"> accept(T t);</w:t>
+        <w:t xml:space="preserve"> </w:t>
+      </w:r>
+      <w:proofErr w:type="gramStart"/>
+      <w:r>
+        <w:t>accept(</w:t>
+      </w:r>
+      <w:proofErr w:type="gramEnd"/>
+      <w:r>
+        <w:t>T t);</w:t>
       </w:r>
       <w:r>
         <w:t xml:space="preserve"> (data) -&gt; System.out.print</w:t>
@@ -3527,7 +3856,15 @@
         <w:t xml:space="preserve">: </w:t>
       </w:r>
       <w:r>
-        <w:t>T get();</w:t>
+        <w:t xml:space="preserve">T </w:t>
+      </w:r>
+      <w:proofErr w:type="gramStart"/>
+      <w:r>
+        <w:t>get(</w:t>
+      </w:r>
+      <w:proofErr w:type="gramEnd"/>
+      <w:r>
+        <w:t>);</w:t>
       </w:r>
       <w:r>
         <w:t xml:space="preserve"> () -&gt; data</w:t>
@@ -3548,7 +3885,15 @@
         <w:t xml:space="preserve">: </w:t>
       </w:r>
       <w:r>
-        <w:t>R apply(T t);</w:t>
+        <w:t xml:space="preserve">R </w:t>
+      </w:r>
+      <w:proofErr w:type="gramStart"/>
+      <w:r>
+        <w:t>apply(</w:t>
+      </w:r>
+      <w:proofErr w:type="gramEnd"/>
+      <w:r>
+        <w:t>T t);</w:t>
       </w:r>
       <w:r>
         <w:t xml:space="preserve"> (data) -&gt; someData</w:t>
@@ -3573,11 +3918,823 @@
         <w:t>int</w:t>
       </w:r>
       <w:r>
-        <w:t xml:space="preserve"> compare(T o1, T o2);</w:t>
+        <w:t xml:space="preserve"> </w:t>
+      </w:r>
+      <w:proofErr w:type="gramStart"/>
+      <w:r>
+        <w:t>compare(</w:t>
+      </w:r>
+      <w:proofErr w:type="gramEnd"/>
+      <w:r>
+        <w:t>T o1, T o2);</w:t>
       </w:r>
       <w:r>
         <w:t xml:space="preserve"> (o1, o2) -&gt; value;</w:t>
       </w:r>
+    </w:p>
+    <w:p>
+      <w:pPr>
+        <w:ind w:left="0" w:firstLine="0"/>
+      </w:pPr>
+    </w:p>
+    <w:p>
+      <w:pPr>
+        <w:ind w:left="0" w:firstLine="0"/>
+      </w:pPr>
+      <w:r>
+        <w:rPr>
+          <w:highlight w:val="yellow"/>
+        </w:rPr>
+        <w:t>JDBC with MySQL</w:t>
+      </w:r>
+    </w:p>
+    <w:p>
+      <w:pPr>
+        <w:ind w:left="0" w:firstLine="0"/>
+      </w:pPr>
+      <w:r>
+        <w:drawing>
+          <wp:inline distT="0" distB="0" distL="0" distR="0" wp14:anchorId="2546BC9A" wp14:editId="655A2836">
+            <wp:extent cx="5943600" cy="1162050"/>
+            <wp:effectExtent l="0" t="0" r="0" b="0"/>
+            <wp:docPr id="615301816" name="Picture 1"/>
+            <wp:cNvGraphicFramePr>
+              <a:graphicFrameLocks xmlns:a="http://schemas.openxmlformats.org/drawingml/2006/main" noChangeAspect="1"/>
+            </wp:cNvGraphicFramePr>
+            <a:graphic xmlns:a="http://schemas.openxmlformats.org/drawingml/2006/main">
+              <a:graphicData uri="http://schemas.openxmlformats.org/drawingml/2006/picture">
+                <pic:pic xmlns:pic="http://schemas.openxmlformats.org/drawingml/2006/picture">
+                  <pic:nvPicPr>
+                    <pic:cNvPr id="615301816" name=""/>
+                    <pic:cNvPicPr/>
+                  </pic:nvPicPr>
+                  <pic:blipFill>
+                    <a:blip r:embed="rId32"/>
+                    <a:stretch>
+                      <a:fillRect/>
+                    </a:stretch>
+                  </pic:blipFill>
+                  <pic:spPr>
+                    <a:xfrm>
+                      <a:off x="0" y="0"/>
+                      <a:ext cx="5943600" cy="1162050"/>
+                    </a:xfrm>
+                    <a:prstGeom prst="rect">
+                      <a:avLst/>
+                    </a:prstGeom>
+                  </pic:spPr>
+                </pic:pic>
+              </a:graphicData>
+            </a:graphic>
+          </wp:inline>
+        </w:drawing>
+      </w:r>
+    </w:p>
+    <w:p>
+      <w:pPr>
+        <w:ind w:left="0" w:firstLine="0"/>
+      </w:pPr>
+      <w:r>
+        <w:rPr>
+          <w:highlight w:val="yellow"/>
+        </w:rPr>
+        <w:t>JDBC:</w:t>
+      </w:r>
+      <w:r>
+        <w:t xml:space="preserve"> Java Database Connectivity, it provides set of </w:t>
+      </w:r>
+      <w:proofErr w:type="gramStart"/>
+      <w:r>
+        <w:t>API’s</w:t>
+      </w:r>
+      <w:proofErr w:type="gramEnd"/>
+      <w:r>
+        <w:t xml:space="preserve"> (interfaces &amp; classes) to interact with any Relational Database, the database vendors must implement these interfaces so that a Java application can use common JDBC API’s regardless of the implementation</w:t>
+      </w:r>
+      <w:r>
+        <w:t>.</w:t>
+      </w:r>
+    </w:p>
+    <w:p>
+      <w:pPr>
+        <w:ind w:left="0" w:firstLine="0"/>
+      </w:pPr>
+      <w:r>
+        <w:rPr>
+          <w:highlight w:val="yellow"/>
+        </w:rPr>
+        <w:t>JDBC Drivers:</w:t>
+      </w:r>
+      <w:r>
+        <w:t xml:space="preserve"> These are the classes that implement JDBC API which are provided by database vendors</w:t>
+      </w:r>
+    </w:p>
+    <w:p>
+      <w:pPr>
+        <w:ind w:left="0" w:firstLine="0"/>
+      </w:pPr>
+      <w:r>
+        <w:rPr>
+          <w:highlight w:val="yellow"/>
+        </w:rPr>
+        <w:t>Steps to follow in JDBC</w:t>
+      </w:r>
+    </w:p>
+    <w:p>
+      <w:pPr>
+        <w:pStyle w:val="ListParagraph"/>
+        <w:numPr>
+          <w:ilvl w:val="0"/>
+          <w:numId w:val="23"/>
+        </w:numPr>
+      </w:pPr>
+      <w:r>
+        <w:t>Loading the JDBC driver</w:t>
+      </w:r>
+    </w:p>
+    <w:p>
+      <w:pPr>
+        <w:pStyle w:val="ListParagraph"/>
+        <w:ind w:firstLine="0"/>
+      </w:pPr>
+      <w:r>
+        <w:lastRenderedPageBreak/>
+        <w:t>Class.forName(“</w:t>
+      </w:r>
+      <w:proofErr w:type="gramStart"/>
+      <w:r>
+        <w:t>com.mysql</w:t>
+      </w:r>
+      <w:proofErr w:type="gramEnd"/>
+      <w:r>
+        <w:t>.</w:t>
+      </w:r>
+      <w:proofErr w:type="gramStart"/>
+      <w:r>
+        <w:t>cj.jdbc</w:t>
+      </w:r>
+      <w:proofErr w:type="gramEnd"/>
+      <w:r>
+        <w:t>.Driver”);</w:t>
+      </w:r>
+    </w:p>
+    <w:p>
+      <w:pPr>
+        <w:pStyle w:val="ListParagraph"/>
+        <w:numPr>
+          <w:ilvl w:val="0"/>
+          <w:numId w:val="23"/>
+        </w:numPr>
+      </w:pPr>
+      <w:r>
+        <w:t xml:space="preserve">Establish the Connection </w:t>
+      </w:r>
+    </w:p>
+    <w:p>
+      <w:pPr>
+        <w:pStyle w:val="ListParagraph"/>
+        <w:ind w:firstLine="0"/>
+      </w:pPr>
+      <w:r>
+        <w:rPr>
+          <w:color w:val="EE0000"/>
+        </w:rPr>
+        <w:t>Connection</w:t>
+      </w:r>
+      <w:r>
+        <w:t xml:space="preserve"> </w:t>
+      </w:r>
+      <w:r>
+        <w:rPr>
+          <w:color w:val="7030A0"/>
+        </w:rPr>
+        <w:t>connection</w:t>
+      </w:r>
+      <w:r>
+        <w:t xml:space="preserve"> = </w:t>
+      </w:r>
+      <w:r>
+        <w:rPr>
+          <w:color w:val="EE0000"/>
+        </w:rPr>
+        <w:t>DriverManager</w:t>
+      </w:r>
+      <w:r>
+        <w:t>.getConnection(url, username, password)</w:t>
+      </w:r>
+    </w:p>
+    <w:p>
+      <w:pPr>
+        <w:pStyle w:val="ListParagraph"/>
+        <w:numPr>
+          <w:ilvl w:val="0"/>
+          <w:numId w:val="23"/>
+        </w:numPr>
+      </w:pPr>
+      <w:r>
+        <w:t>Create the Statement</w:t>
+      </w:r>
+    </w:p>
+    <w:p>
+      <w:pPr>
+        <w:pStyle w:val="ListParagraph"/>
+        <w:ind w:firstLine="0"/>
+      </w:pPr>
+      <w:r>
+        <w:rPr>
+          <w:color w:val="EE0000"/>
+        </w:rPr>
+        <w:t xml:space="preserve">PreparedStatement </w:t>
+      </w:r>
+      <w:r>
+        <w:t xml:space="preserve">statement = </w:t>
+      </w:r>
+      <w:proofErr w:type="gramStart"/>
+      <w:r>
+        <w:t>connection.prepareStatement</w:t>
+      </w:r>
+      <w:proofErr w:type="gramEnd"/>
+      <w:r>
+        <w:t>(query);</w:t>
+      </w:r>
+    </w:p>
+    <w:p>
+      <w:pPr>
+        <w:pStyle w:val="ListParagraph"/>
+        <w:ind w:firstLine="0"/>
+      </w:pPr>
+      <w:r>
+        <w:t>query = “insert | select | update | delete”</w:t>
+      </w:r>
+    </w:p>
+    <w:p>
+      <w:pPr>
+        <w:pStyle w:val="ListParagraph"/>
+        <w:numPr>
+          <w:ilvl w:val="0"/>
+          <w:numId w:val="23"/>
+        </w:numPr>
+      </w:pPr>
+      <w:r>
+        <w:t>Execute the Statement</w:t>
+      </w:r>
+    </w:p>
+    <w:p>
+      <w:pPr>
+        <w:pStyle w:val="ListParagraph"/>
+        <w:ind w:firstLine="0"/>
+      </w:pPr>
+      <w:r>
+        <w:t xml:space="preserve">int count = </w:t>
+      </w:r>
+      <w:proofErr w:type="gramStart"/>
+      <w:r>
+        <w:t>statement.executeUpdate</w:t>
+      </w:r>
+      <w:proofErr w:type="gramEnd"/>
+      <w:r>
+        <w:t xml:space="preserve">(); =&gt; </w:t>
+      </w:r>
+      <w:proofErr w:type="spellStart"/>
+      <w:r>
+        <w:t>insert|update|delete</w:t>
+      </w:r>
+      <w:proofErr w:type="spellEnd"/>
+    </w:p>
+    <w:p>
+      <w:pPr>
+        <w:pStyle w:val="ListParagraph"/>
+        <w:ind w:firstLine="0"/>
+      </w:pPr>
+      <w:proofErr w:type="spellStart"/>
+      <w:r>
+        <w:rPr>
+          <w:color w:val="EE0000"/>
+        </w:rPr>
+        <w:t>ResulSet</w:t>
+      </w:r>
+      <w:proofErr w:type="spellEnd"/>
+      <w:r>
+        <w:rPr>
+          <w:color w:val="EE0000"/>
+        </w:rPr>
+        <w:t xml:space="preserve"> </w:t>
+      </w:r>
+      <w:r>
+        <w:t xml:space="preserve">result = </w:t>
+      </w:r>
+      <w:proofErr w:type="gramStart"/>
+      <w:r>
+        <w:t>statement.executeQuery</w:t>
+      </w:r>
+      <w:proofErr w:type="gramEnd"/>
+      <w:r>
+        <w:t>(); =&gt; select</w:t>
+      </w:r>
+    </w:p>
+    <w:p>
+      <w:pPr>
+        <w:pStyle w:val="ListParagraph"/>
+        <w:numPr>
+          <w:ilvl w:val="0"/>
+          <w:numId w:val="23"/>
+        </w:numPr>
+      </w:pPr>
+      <w:r>
+        <w:t>Closing the resources</w:t>
+      </w:r>
+    </w:p>
+    <w:p>
+      <w:pPr>
+        <w:pStyle w:val="ListParagraph"/>
+        <w:ind w:firstLine="0"/>
+      </w:pPr>
+      <w:proofErr w:type="gramStart"/>
+      <w:r>
+        <w:t>result.close</w:t>
+      </w:r>
+      <w:proofErr w:type="gramEnd"/>
+      <w:r>
+        <w:t>();</w:t>
+      </w:r>
+      <w:r>
+        <w:br/>
+      </w:r>
+      <w:proofErr w:type="gramStart"/>
+      <w:r>
+        <w:t>statement.close</w:t>
+      </w:r>
+      <w:proofErr w:type="gramEnd"/>
+      <w:r>
+        <w:t>();</w:t>
+      </w:r>
+      <w:r>
+        <w:br/>
+      </w:r>
+      <w:proofErr w:type="gramStart"/>
+      <w:r>
+        <w:t>connection.close</w:t>
+      </w:r>
+      <w:proofErr w:type="gramEnd"/>
+      <w:r>
+        <w:t>();</w:t>
+      </w:r>
+    </w:p>
+    <w:p>
+      <w:pPr>
+        <w:ind w:left="0" w:firstLine="0"/>
+      </w:pPr>
+    </w:p>
+    <w:p>
+      <w:pPr>
+        <w:ind w:left="0" w:firstLine="0"/>
+      </w:pPr>
+      <w:r>
+        <w:rPr>
+          <w:highlight w:val="yellow"/>
+        </w:rPr>
+        <w:t>Writing the Statement</w:t>
+      </w:r>
+    </w:p>
+    <w:p>
+      <w:pPr>
+        <w:pStyle w:val="ListParagraph"/>
+        <w:numPr>
+          <w:ilvl w:val="0"/>
+          <w:numId w:val="24"/>
+        </w:numPr>
+      </w:pPr>
+      <w:r>
+        <w:t xml:space="preserve">Statement statement = </w:t>
+      </w:r>
+      <w:proofErr w:type="gramStart"/>
+      <w:r>
+        <w:t>connection.createStatement</w:t>
+      </w:r>
+      <w:proofErr w:type="gramEnd"/>
+      <w:r>
+        <w:t>();</w:t>
+      </w:r>
+    </w:p>
+    <w:p>
+      <w:pPr>
+        <w:pStyle w:val="ListParagraph"/>
+        <w:ind w:firstLine="0"/>
+      </w:pPr>
+      <w:proofErr w:type="gramStart"/>
+      <w:r>
+        <w:t>statement.executeUpdate</w:t>
+      </w:r>
+      <w:proofErr w:type="gramEnd"/>
+      <w:r>
+        <w:t xml:space="preserve">(“insert into profile </w:t>
+      </w:r>
+      <w:proofErr w:type="gramStart"/>
+      <w:r>
+        <w:t>values(</w:t>
+      </w:r>
+      <w:proofErr w:type="gramEnd"/>
+      <w:r>
+        <w:t>100, “+</w:t>
+      </w:r>
+      <w:proofErr w:type="gramStart"/>
+      <w:r>
+        <w:t>’”Raj</w:t>
+      </w:r>
+      <w:proofErr w:type="gramEnd"/>
+      <w:r>
+        <w:t>”’+”, 939239</w:t>
+      </w:r>
+      <w:r>
+        <w:t>)”);</w:t>
+      </w:r>
+    </w:p>
+    <w:p>
+      <w:pPr>
+        <w:pStyle w:val="ListParagraph"/>
+        <w:ind w:firstLine="0"/>
+      </w:pPr>
+      <w:r>
+        <w:t xml:space="preserve">ResultSet result = </w:t>
+      </w:r>
+      <w:proofErr w:type="gramStart"/>
+      <w:r>
+        <w:t>statement.executeQuery</w:t>
+      </w:r>
+      <w:proofErr w:type="gramEnd"/>
+      <w:r>
+        <w:t>(“select * from profile”);</w:t>
+      </w:r>
+    </w:p>
+    <w:p>
+      <w:pPr>
+        <w:pStyle w:val="ListParagraph"/>
+        <w:numPr>
+          <w:ilvl w:val="0"/>
+          <w:numId w:val="24"/>
+        </w:numPr>
+      </w:pPr>
+      <w:r>
+        <w:t xml:space="preserve">PreparedStatement statement = </w:t>
+      </w:r>
+      <w:proofErr w:type="gramStart"/>
+      <w:r>
+        <w:t>connection.prepareStatement</w:t>
+      </w:r>
+      <w:proofErr w:type="gramEnd"/>
+      <w:r>
+        <w:t>(“insert into profile values</w:t>
+      </w:r>
+      <w:proofErr w:type="gramStart"/>
+      <w:r>
+        <w:t>(?,?,?</w:t>
+      </w:r>
+      <w:proofErr w:type="gramEnd"/>
+      <w:r>
+        <w:t>)</w:t>
+      </w:r>
+      <w:r>
+        <w:t>”);</w:t>
+      </w:r>
+    </w:p>
+    <w:p>
+      <w:pPr>
+        <w:pStyle w:val="ListParagraph"/>
+        <w:ind w:firstLine="0"/>
+      </w:pPr>
+      <w:proofErr w:type="gramStart"/>
+      <w:r>
+        <w:t>statement.setInt</w:t>
+      </w:r>
+      <w:proofErr w:type="gramEnd"/>
+      <w:r>
+        <w:t>(1, 100</w:t>
+      </w:r>
+      <w:proofErr w:type="gramStart"/>
+      <w:r>
+        <w:t xml:space="preserve">);   </w:t>
+      </w:r>
+      <w:proofErr w:type="gramEnd"/>
+      <w:r>
+        <w:t xml:space="preserve"> </w:t>
+      </w:r>
+      <w:proofErr w:type="gramStart"/>
+      <w:r>
+        <w:t>statement.setString</w:t>
+      </w:r>
+      <w:proofErr w:type="gramEnd"/>
+      <w:r>
+        <w:t xml:space="preserve">(2, “Raj”); </w:t>
+      </w:r>
+      <w:r>
+        <w:br/>
+      </w:r>
+      <w:proofErr w:type="gramStart"/>
+      <w:r>
+        <w:t>statement.setLong</w:t>
+      </w:r>
+      <w:proofErr w:type="gramEnd"/>
+      <w:r>
+        <w:t>(3, 9929329239L);</w:t>
+      </w:r>
+      <w:r>
+        <w:br/>
+      </w:r>
+      <w:proofErr w:type="gramStart"/>
+      <w:r>
+        <w:t>statement.executeUpdate</w:t>
+      </w:r>
+      <w:proofErr w:type="gramEnd"/>
+      <w:r>
+        <w:t>();</w:t>
+      </w:r>
+    </w:p>
+    <w:p>
+      <w:pPr>
+        <w:pStyle w:val="ListParagraph"/>
+        <w:ind w:firstLine="0"/>
+      </w:pPr>
+    </w:p>
+    <w:p>
+      <w:pPr>
+        <w:ind w:left="0" w:firstLine="0"/>
+      </w:pPr>
+      <w:r>
+        <w:rPr>
+          <w:highlight w:val="yellow"/>
+        </w:rPr>
+        <w:t>Note:</w:t>
+      </w:r>
+      <w:r>
+        <w:t xml:space="preserve"> PreparedStatement extends Statement</w:t>
+      </w:r>
+    </w:p>
+    <w:p>
+      <w:pPr>
+        <w:ind w:left="0" w:firstLine="0"/>
+      </w:pPr>
+    </w:p>
+    <w:p>
+      <w:pPr>
+        <w:ind w:left="0" w:firstLine="0"/>
+      </w:pPr>
+    </w:p>
+    <w:p>
+      <w:pPr>
+        <w:ind w:left="0" w:firstLine="0"/>
+      </w:pPr>
+      <w:r>
+        <w:lastRenderedPageBreak/>
+        <w:drawing>
+          <wp:inline distT="0" distB="0" distL="0" distR="0" wp14:anchorId="0BC38EA6" wp14:editId="68C9A327">
+            <wp:extent cx="5943600" cy="3190240"/>
+            <wp:effectExtent l="0" t="0" r="0" b="0"/>
+            <wp:docPr id="1081479380" name="Picture 1"/>
+            <wp:cNvGraphicFramePr>
+              <a:graphicFrameLocks xmlns:a="http://schemas.openxmlformats.org/drawingml/2006/main" noChangeAspect="1"/>
+            </wp:cNvGraphicFramePr>
+            <a:graphic xmlns:a="http://schemas.openxmlformats.org/drawingml/2006/main">
+              <a:graphicData uri="http://schemas.openxmlformats.org/drawingml/2006/picture">
+                <pic:pic xmlns:pic="http://schemas.openxmlformats.org/drawingml/2006/picture">
+                  <pic:nvPicPr>
+                    <pic:cNvPr id="1081479380" name=""/>
+                    <pic:cNvPicPr/>
+                  </pic:nvPicPr>
+                  <pic:blipFill>
+                    <a:blip r:embed="rId33"/>
+                    <a:stretch>
+                      <a:fillRect/>
+                    </a:stretch>
+                  </pic:blipFill>
+                  <pic:spPr>
+                    <a:xfrm>
+                      <a:off x="0" y="0"/>
+                      <a:ext cx="5943600" cy="3190240"/>
+                    </a:xfrm>
+                    <a:prstGeom prst="rect">
+                      <a:avLst/>
+                    </a:prstGeom>
+                  </pic:spPr>
+                </pic:pic>
+              </a:graphicData>
+            </a:graphic>
+          </wp:inline>
+        </w:drawing>
+      </w:r>
+    </w:p>
+    <w:p>
+      <w:pPr>
+        <w:ind w:left="0" w:firstLine="0"/>
+      </w:pPr>
+      <w:r>
+        <w:rPr>
+          <w:highlight w:val="yellow"/>
+        </w:rPr>
+        <w:t>MVC layers</w:t>
+      </w:r>
+    </w:p>
+    <w:p>
+      <w:pPr>
+        <w:ind w:left="0" w:firstLine="0"/>
+      </w:pPr>
+      <w:r>
+        <w:t>Model - DAO and Service</w:t>
+      </w:r>
+    </w:p>
+    <w:p>
+      <w:pPr>
+        <w:ind w:left="0" w:firstLine="0"/>
+      </w:pPr>
+      <w:r>
+        <w:t>View - Mobile UI / Web UI / Devices</w:t>
+      </w:r>
+    </w:p>
+    <w:p>
+      <w:pPr>
+        <w:ind w:left="0" w:firstLine="0"/>
+      </w:pPr>
+      <w:r>
+        <w:t xml:space="preserve">Controller - Handle Request Call Service &amp; Generate Response </w:t>
+      </w:r>
+    </w:p>
+    <w:p>
+      <w:pPr>
+        <w:ind w:left="0" w:firstLine="0"/>
+      </w:pPr>
+      <w:r>
+        <w:drawing>
+          <wp:inline distT="0" distB="0" distL="0" distR="0" wp14:anchorId="2EE9164A" wp14:editId="619FE38B">
+            <wp:extent cx="5943600" cy="2713355"/>
+            <wp:effectExtent l="0" t="0" r="0" b="0"/>
+            <wp:docPr id="354114942" name="Picture 1"/>
+            <wp:cNvGraphicFramePr>
+              <a:graphicFrameLocks xmlns:a="http://schemas.openxmlformats.org/drawingml/2006/main" noChangeAspect="1"/>
+            </wp:cNvGraphicFramePr>
+            <a:graphic xmlns:a="http://schemas.openxmlformats.org/drawingml/2006/main">
+              <a:graphicData uri="http://schemas.openxmlformats.org/drawingml/2006/picture">
+                <pic:pic xmlns:pic="http://schemas.openxmlformats.org/drawingml/2006/picture">
+                  <pic:nvPicPr>
+                    <pic:cNvPr id="354114942" name=""/>
+                    <pic:cNvPicPr/>
+                  </pic:nvPicPr>
+                  <pic:blipFill>
+                    <a:blip r:embed="rId34"/>
+                    <a:stretch>
+                      <a:fillRect/>
+                    </a:stretch>
+                  </pic:blipFill>
+                  <pic:spPr>
+                    <a:xfrm>
+                      <a:off x="0" y="0"/>
+                      <a:ext cx="5943600" cy="2713355"/>
+                    </a:xfrm>
+                    <a:prstGeom prst="rect">
+                      <a:avLst/>
+                    </a:prstGeom>
+                  </pic:spPr>
+                </pic:pic>
+              </a:graphicData>
+            </a:graphic>
+          </wp:inline>
+        </w:drawing>
+      </w:r>
+    </w:p>
+    <w:p>
+      <w:pPr>
+        <w:ind w:left="0" w:firstLine="0"/>
+      </w:pPr>
+      <w:r>
+        <w:t>Main - Client</w:t>
+      </w:r>
+    </w:p>
+    <w:p>
+      <w:pPr>
+        <w:ind w:left="0" w:firstLine="0"/>
+      </w:pPr>
+      <w:r>
+        <w:lastRenderedPageBreak/>
+        <w:t>ProfileDAOJdbc</w:t>
+      </w:r>
+      <w:r>
+        <w:t xml:space="preserve"> implements ProfileDAO</w:t>
+      </w:r>
+      <w:r>
+        <w:t xml:space="preserve"> - DAO</w:t>
+      </w:r>
+    </w:p>
+    <w:p>
+      <w:pPr>
+        <w:ind w:left="0" w:firstLine="0"/>
+      </w:pPr>
+      <w:r>
+        <w:t>Profile - Model to maintain the data from user or DB</w:t>
+      </w:r>
+    </w:p>
+    <w:p>
+      <w:pPr>
+        <w:ind w:left="0" w:firstLine="0"/>
+      </w:pPr>
+    </w:p>
+    <w:p>
+      <w:pPr>
+        <w:ind w:left="0" w:firstLine="0"/>
+      </w:pPr>
+      <w:r>
+        <w:drawing>
+          <wp:inline distT="0" distB="0" distL="0" distR="0" wp14:anchorId="72C28A70" wp14:editId="72F437C9">
+            <wp:extent cx="5943600" cy="3386455"/>
+            <wp:effectExtent l="0" t="0" r="0" b="4445"/>
+            <wp:docPr id="576427955" name="Picture 1"/>
+            <wp:cNvGraphicFramePr>
+              <a:graphicFrameLocks xmlns:a="http://schemas.openxmlformats.org/drawingml/2006/main" noChangeAspect="1"/>
+            </wp:cNvGraphicFramePr>
+            <a:graphic xmlns:a="http://schemas.openxmlformats.org/drawingml/2006/main">
+              <a:graphicData uri="http://schemas.openxmlformats.org/drawingml/2006/picture">
+                <pic:pic xmlns:pic="http://schemas.openxmlformats.org/drawingml/2006/picture">
+                  <pic:nvPicPr>
+                    <pic:cNvPr id="576427955" name=""/>
+                    <pic:cNvPicPr/>
+                  </pic:nvPicPr>
+                  <pic:blipFill>
+                    <a:blip r:embed="rId35"/>
+                    <a:stretch>
+                      <a:fillRect/>
+                    </a:stretch>
+                  </pic:blipFill>
+                  <pic:spPr>
+                    <a:xfrm>
+                      <a:off x="0" y="0"/>
+                      <a:ext cx="5943600" cy="3386455"/>
+                    </a:xfrm>
+                    <a:prstGeom prst="rect">
+                      <a:avLst/>
+                    </a:prstGeom>
+                  </pic:spPr>
+                </pic:pic>
+              </a:graphicData>
+            </a:graphic>
+          </wp:inline>
+        </w:drawing>
+      </w:r>
+    </w:p>
+    <w:p>
+      <w:pPr>
+        <w:ind w:left="0" w:firstLine="0"/>
+      </w:pPr>
+      <w:r>
+        <w:rPr>
+          <w:highlight w:val="yellow"/>
+        </w:rPr>
+        <w:t>ProfileDAO</w:t>
+      </w:r>
+    </w:p>
+    <w:p>
+      <w:pPr>
+        <w:ind w:left="0" w:firstLine="0"/>
+      </w:pPr>
+      <w:r>
+        <w:lastRenderedPageBreak/>
+        <w:drawing>
+          <wp:inline distT="0" distB="0" distL="0" distR="0" wp14:anchorId="22801742" wp14:editId="652115C2">
+            <wp:extent cx="5943600" cy="3589020"/>
+            <wp:effectExtent l="0" t="0" r="0" b="0"/>
+            <wp:docPr id="1917421053" name="Picture 1"/>
+            <wp:cNvGraphicFramePr>
+              <a:graphicFrameLocks xmlns:a="http://schemas.openxmlformats.org/drawingml/2006/main" noChangeAspect="1"/>
+            </wp:cNvGraphicFramePr>
+            <a:graphic xmlns:a="http://schemas.openxmlformats.org/drawingml/2006/main">
+              <a:graphicData uri="http://schemas.openxmlformats.org/drawingml/2006/picture">
+                <pic:pic xmlns:pic="http://schemas.openxmlformats.org/drawingml/2006/picture">
+                  <pic:nvPicPr>
+                    <pic:cNvPr id="1917421053" name=""/>
+                    <pic:cNvPicPr/>
+                  </pic:nvPicPr>
+                  <pic:blipFill>
+                    <a:blip r:embed="rId36"/>
+                    <a:stretch>
+                      <a:fillRect/>
+                    </a:stretch>
+                  </pic:blipFill>
+                  <pic:spPr>
+                    <a:xfrm>
+                      <a:off x="0" y="0"/>
+                      <a:ext cx="5943600" cy="3589020"/>
+                    </a:xfrm>
+                    <a:prstGeom prst="rect">
+                      <a:avLst/>
+                    </a:prstGeom>
+                  </pic:spPr>
+                </pic:pic>
+              </a:graphicData>
+            </a:graphic>
+          </wp:inline>
+        </w:drawing>
+      </w:r>
+    </w:p>
+    <w:p>
+      <w:pPr>
+        <w:ind w:left="0" w:firstLine="0"/>
+      </w:pPr>
     </w:p>
     <w:sectPr>
       <w:pgSz w:w="12240" w:h="15840"/>
@@ -3681,6 +4838,95 @@
     </w:lvl>
   </w:abstractNum>
   <w:abstractNum w:abstractNumId="1" w15:restartNumberingAfterBreak="0">
+    <w:nsid w:val="02104C76"/>
+    <w:multiLevelType w:val="hybridMultilevel"/>
+    <w:tmpl w:val="703E5696"/>
+    <w:lvl w:ilvl="0" w:tplc="0409000F">
+      <w:start w:val="1"/>
+      <w:numFmt w:val="decimal"/>
+      <w:lvlText w:val="%1."/>
+      <w:lvlJc w:val="left"/>
+      <w:pPr>
+        <w:ind w:left="720" w:hanging="360"/>
+      </w:pPr>
+      <w:rPr>
+        <w:rFonts w:hint="default"/>
+      </w:rPr>
+    </w:lvl>
+    <w:lvl w:ilvl="1" w:tplc="04090019" w:tentative="1">
+      <w:start w:val="1"/>
+      <w:numFmt w:val="lowerLetter"/>
+      <w:lvlText w:val="%2."/>
+      <w:lvlJc w:val="left"/>
+      <w:pPr>
+        <w:ind w:left="1440" w:hanging="360"/>
+      </w:pPr>
+    </w:lvl>
+    <w:lvl w:ilvl="2" w:tplc="0409001B" w:tentative="1">
+      <w:start w:val="1"/>
+      <w:numFmt w:val="lowerRoman"/>
+      <w:lvlText w:val="%3."/>
+      <w:lvlJc w:val="right"/>
+      <w:pPr>
+        <w:ind w:left="2160" w:hanging="180"/>
+      </w:pPr>
+    </w:lvl>
+    <w:lvl w:ilvl="3" w:tplc="0409000F" w:tentative="1">
+      <w:start w:val="1"/>
+      <w:numFmt w:val="decimal"/>
+      <w:lvlText w:val="%4."/>
+      <w:lvlJc w:val="left"/>
+      <w:pPr>
+        <w:ind w:left="2880" w:hanging="360"/>
+      </w:pPr>
+    </w:lvl>
+    <w:lvl w:ilvl="4" w:tplc="04090019" w:tentative="1">
+      <w:start w:val="1"/>
+      <w:numFmt w:val="lowerLetter"/>
+      <w:lvlText w:val="%5."/>
+      <w:lvlJc w:val="left"/>
+      <w:pPr>
+        <w:ind w:left="3600" w:hanging="360"/>
+      </w:pPr>
+    </w:lvl>
+    <w:lvl w:ilvl="5" w:tplc="0409001B" w:tentative="1">
+      <w:start w:val="1"/>
+      <w:numFmt w:val="lowerRoman"/>
+      <w:lvlText w:val="%6."/>
+      <w:lvlJc w:val="right"/>
+      <w:pPr>
+        <w:ind w:left="4320" w:hanging="180"/>
+      </w:pPr>
+    </w:lvl>
+    <w:lvl w:ilvl="6" w:tplc="0409000F" w:tentative="1">
+      <w:start w:val="1"/>
+      <w:numFmt w:val="decimal"/>
+      <w:lvlText w:val="%7."/>
+      <w:lvlJc w:val="left"/>
+      <w:pPr>
+        <w:ind w:left="5040" w:hanging="360"/>
+      </w:pPr>
+    </w:lvl>
+    <w:lvl w:ilvl="7" w:tplc="04090019" w:tentative="1">
+      <w:start w:val="1"/>
+      <w:numFmt w:val="lowerLetter"/>
+      <w:lvlText w:val="%8."/>
+      <w:lvlJc w:val="left"/>
+      <w:pPr>
+        <w:ind w:left="5760" w:hanging="360"/>
+      </w:pPr>
+    </w:lvl>
+    <w:lvl w:ilvl="8" w:tplc="0409001B" w:tentative="1">
+      <w:start w:val="1"/>
+      <w:numFmt w:val="lowerRoman"/>
+      <w:lvlText w:val="%9."/>
+      <w:lvlJc w:val="right"/>
+      <w:pPr>
+        <w:ind w:left="6480" w:hanging="180"/>
+      </w:pPr>
+    </w:lvl>
+  </w:abstractNum>
+  <w:abstractNum w:abstractNumId="2" w15:restartNumberingAfterBreak="0">
     <w:nsid w:val="08597C95"/>
     <w:multiLevelType w:val="hybridMultilevel"/>
     <w:tmpl w:val="07385308"/>
@@ -3769,7 +5015,7 @@
       </w:pPr>
     </w:lvl>
   </w:abstractNum>
-  <w:abstractNum w:abstractNumId="2" w15:restartNumberingAfterBreak="0">
+  <w:abstractNum w:abstractNumId="3" w15:restartNumberingAfterBreak="0">
     <w:nsid w:val="0CB51F87"/>
     <w:multiLevelType w:val="hybridMultilevel"/>
     <w:tmpl w:val="BB7AC91A"/>
@@ -3858,7 +5104,7 @@
       </w:pPr>
     </w:lvl>
   </w:abstractNum>
-  <w:abstractNum w:abstractNumId="3" w15:restartNumberingAfterBreak="0">
+  <w:abstractNum w:abstractNumId="4" w15:restartNumberingAfterBreak="0">
     <w:nsid w:val="0F544EF7"/>
     <w:multiLevelType w:val="hybridMultilevel"/>
     <w:tmpl w:val="ED00C47A"/>
@@ -3947,7 +5193,7 @@
       </w:pPr>
     </w:lvl>
   </w:abstractNum>
-  <w:abstractNum w:abstractNumId="4" w15:restartNumberingAfterBreak="0">
+  <w:abstractNum w:abstractNumId="5" w15:restartNumberingAfterBreak="0">
     <w:nsid w:val="14280995"/>
     <w:multiLevelType w:val="hybridMultilevel"/>
     <w:tmpl w:val="966AE394"/>
@@ -4036,7 +5282,7 @@
       </w:pPr>
     </w:lvl>
   </w:abstractNum>
-  <w:abstractNum w:abstractNumId="5" w15:restartNumberingAfterBreak="0">
+  <w:abstractNum w:abstractNumId="6" w15:restartNumberingAfterBreak="0">
     <w:nsid w:val="14EC6323"/>
     <w:multiLevelType w:val="hybridMultilevel"/>
     <w:tmpl w:val="32F0784E"/>
@@ -4149,7 +5395,7 @@
       </w:rPr>
     </w:lvl>
   </w:abstractNum>
-  <w:abstractNum w:abstractNumId="6" w15:restartNumberingAfterBreak="0">
+  <w:abstractNum w:abstractNumId="7" w15:restartNumberingAfterBreak="0">
     <w:nsid w:val="1A5444C1"/>
     <w:multiLevelType w:val="hybridMultilevel"/>
     <w:tmpl w:val="ADCAB732"/>
@@ -4238,7 +5484,7 @@
       </w:pPr>
     </w:lvl>
   </w:abstractNum>
-  <w:abstractNum w:abstractNumId="7" w15:restartNumberingAfterBreak="0">
+  <w:abstractNum w:abstractNumId="8" w15:restartNumberingAfterBreak="0">
     <w:nsid w:val="1D0F7A06"/>
     <w:multiLevelType w:val="hybridMultilevel"/>
     <w:tmpl w:val="A6629502"/>
@@ -4327,7 +5573,7 @@
       </w:pPr>
     </w:lvl>
   </w:abstractNum>
-  <w:abstractNum w:abstractNumId="8" w15:restartNumberingAfterBreak="0">
+  <w:abstractNum w:abstractNumId="9" w15:restartNumberingAfterBreak="0">
     <w:nsid w:val="2101597C"/>
     <w:multiLevelType w:val="hybridMultilevel"/>
     <w:tmpl w:val="270A1FE0"/>
@@ -4416,7 +5662,7 @@
       </w:pPr>
     </w:lvl>
   </w:abstractNum>
-  <w:abstractNum w:abstractNumId="9" w15:restartNumberingAfterBreak="0">
+  <w:abstractNum w:abstractNumId="10" w15:restartNumberingAfterBreak="0">
     <w:nsid w:val="25875411"/>
     <w:multiLevelType w:val="hybridMultilevel"/>
     <w:tmpl w:val="10226456"/>
@@ -4505,7 +5751,7 @@
       </w:pPr>
     </w:lvl>
   </w:abstractNum>
-  <w:abstractNum w:abstractNumId="10" w15:restartNumberingAfterBreak="0">
+  <w:abstractNum w:abstractNumId="11" w15:restartNumberingAfterBreak="0">
     <w:nsid w:val="268D3485"/>
     <w:multiLevelType w:val="hybridMultilevel"/>
     <w:tmpl w:val="B8A2CAC8"/>
@@ -4594,7 +5840,96 @@
       </w:pPr>
     </w:lvl>
   </w:abstractNum>
-  <w:abstractNum w:abstractNumId="11" w15:restartNumberingAfterBreak="0">
+  <w:abstractNum w:abstractNumId="12" w15:restartNumberingAfterBreak="0">
+    <w:nsid w:val="331F7B95"/>
+    <w:multiLevelType w:val="hybridMultilevel"/>
+    <w:tmpl w:val="B8BA5112"/>
+    <w:lvl w:ilvl="0" w:tplc="0409000F">
+      <w:start w:val="1"/>
+      <w:numFmt w:val="decimal"/>
+      <w:lvlText w:val="%1."/>
+      <w:lvlJc w:val="left"/>
+      <w:pPr>
+        <w:ind w:left="720" w:hanging="360"/>
+      </w:pPr>
+      <w:rPr>
+        <w:rFonts w:hint="default"/>
+      </w:rPr>
+    </w:lvl>
+    <w:lvl w:ilvl="1" w:tplc="04090019" w:tentative="1">
+      <w:start w:val="1"/>
+      <w:numFmt w:val="lowerLetter"/>
+      <w:lvlText w:val="%2."/>
+      <w:lvlJc w:val="left"/>
+      <w:pPr>
+        <w:ind w:left="1440" w:hanging="360"/>
+      </w:pPr>
+    </w:lvl>
+    <w:lvl w:ilvl="2" w:tplc="0409001B" w:tentative="1">
+      <w:start w:val="1"/>
+      <w:numFmt w:val="lowerRoman"/>
+      <w:lvlText w:val="%3."/>
+      <w:lvlJc w:val="right"/>
+      <w:pPr>
+        <w:ind w:left="2160" w:hanging="180"/>
+      </w:pPr>
+    </w:lvl>
+    <w:lvl w:ilvl="3" w:tplc="0409000F" w:tentative="1">
+      <w:start w:val="1"/>
+      <w:numFmt w:val="decimal"/>
+      <w:lvlText w:val="%4."/>
+      <w:lvlJc w:val="left"/>
+      <w:pPr>
+        <w:ind w:left="2880" w:hanging="360"/>
+      </w:pPr>
+    </w:lvl>
+    <w:lvl w:ilvl="4" w:tplc="04090019" w:tentative="1">
+      <w:start w:val="1"/>
+      <w:numFmt w:val="lowerLetter"/>
+      <w:lvlText w:val="%5."/>
+      <w:lvlJc w:val="left"/>
+      <w:pPr>
+        <w:ind w:left="3600" w:hanging="360"/>
+      </w:pPr>
+    </w:lvl>
+    <w:lvl w:ilvl="5" w:tplc="0409001B" w:tentative="1">
+      <w:start w:val="1"/>
+      <w:numFmt w:val="lowerRoman"/>
+      <w:lvlText w:val="%6."/>
+      <w:lvlJc w:val="right"/>
+      <w:pPr>
+        <w:ind w:left="4320" w:hanging="180"/>
+      </w:pPr>
+    </w:lvl>
+    <w:lvl w:ilvl="6" w:tplc="0409000F" w:tentative="1">
+      <w:start w:val="1"/>
+      <w:numFmt w:val="decimal"/>
+      <w:lvlText w:val="%7."/>
+      <w:lvlJc w:val="left"/>
+      <w:pPr>
+        <w:ind w:left="5040" w:hanging="360"/>
+      </w:pPr>
+    </w:lvl>
+    <w:lvl w:ilvl="7" w:tplc="04090019" w:tentative="1">
+      <w:start w:val="1"/>
+      <w:numFmt w:val="lowerLetter"/>
+      <w:lvlText w:val="%8."/>
+      <w:lvlJc w:val="left"/>
+      <w:pPr>
+        <w:ind w:left="5760" w:hanging="360"/>
+      </w:pPr>
+    </w:lvl>
+    <w:lvl w:ilvl="8" w:tplc="0409001B" w:tentative="1">
+      <w:start w:val="1"/>
+      <w:numFmt w:val="lowerRoman"/>
+      <w:lvlText w:val="%9."/>
+      <w:lvlJc w:val="right"/>
+      <w:pPr>
+        <w:ind w:left="6480" w:hanging="180"/>
+      </w:pPr>
+    </w:lvl>
+  </w:abstractNum>
+  <w:abstractNum w:abstractNumId="13" w15:restartNumberingAfterBreak="0">
     <w:nsid w:val="41E951E7"/>
     <w:multiLevelType w:val="hybridMultilevel"/>
     <w:tmpl w:val="D728C5AA"/>
@@ -4683,7 +6018,7 @@
       </w:pPr>
     </w:lvl>
   </w:abstractNum>
-  <w:abstractNum w:abstractNumId="12" w15:restartNumberingAfterBreak="0">
+  <w:abstractNum w:abstractNumId="14" w15:restartNumberingAfterBreak="0">
     <w:nsid w:val="46E86CF1"/>
     <w:multiLevelType w:val="hybridMultilevel"/>
     <w:tmpl w:val="9732DEEA"/>
@@ -4772,7 +6107,7 @@
       </w:pPr>
     </w:lvl>
   </w:abstractNum>
-  <w:abstractNum w:abstractNumId="13" w15:restartNumberingAfterBreak="0">
+  <w:abstractNum w:abstractNumId="15" w15:restartNumberingAfterBreak="0">
     <w:nsid w:val="477216CB"/>
     <w:multiLevelType w:val="hybridMultilevel"/>
     <w:tmpl w:val="D638C09E"/>
@@ -4861,7 +6196,7 @@
       </w:pPr>
     </w:lvl>
   </w:abstractNum>
-  <w:abstractNum w:abstractNumId="14" w15:restartNumberingAfterBreak="0">
+  <w:abstractNum w:abstractNumId="16" w15:restartNumberingAfterBreak="0">
     <w:nsid w:val="53F774DD"/>
     <w:multiLevelType w:val="hybridMultilevel"/>
     <w:tmpl w:val="8BBE88B6"/>
@@ -4950,7 +6285,7 @@
       </w:pPr>
     </w:lvl>
   </w:abstractNum>
-  <w:abstractNum w:abstractNumId="15" w15:restartNumberingAfterBreak="0">
+  <w:abstractNum w:abstractNumId="17" w15:restartNumberingAfterBreak="0">
     <w:nsid w:val="59FC6119"/>
     <w:multiLevelType w:val="hybridMultilevel"/>
     <w:tmpl w:val="9B046A14"/>
@@ -5039,7 +6374,7 @@
       </w:pPr>
     </w:lvl>
   </w:abstractNum>
-  <w:abstractNum w:abstractNumId="16" w15:restartNumberingAfterBreak="0">
+  <w:abstractNum w:abstractNumId="18" w15:restartNumberingAfterBreak="0">
     <w:nsid w:val="5E2041C4"/>
     <w:multiLevelType w:val="hybridMultilevel"/>
     <w:tmpl w:val="F5CA0346"/>
@@ -5128,7 +6463,7 @@
       </w:pPr>
     </w:lvl>
   </w:abstractNum>
-  <w:abstractNum w:abstractNumId="17" w15:restartNumberingAfterBreak="0">
+  <w:abstractNum w:abstractNumId="19" w15:restartNumberingAfterBreak="0">
     <w:nsid w:val="6EB614C1"/>
     <w:multiLevelType w:val="hybridMultilevel"/>
     <w:tmpl w:val="B11AD8B4"/>
@@ -5217,7 +6552,7 @@
       </w:pPr>
     </w:lvl>
   </w:abstractNum>
-  <w:abstractNum w:abstractNumId="18" w15:restartNumberingAfterBreak="0">
+  <w:abstractNum w:abstractNumId="20" w15:restartNumberingAfterBreak="0">
     <w:nsid w:val="6F8B0254"/>
     <w:multiLevelType w:val="hybridMultilevel"/>
     <w:tmpl w:val="36C0CDAE"/>
@@ -5306,7 +6641,7 @@
       </w:pPr>
     </w:lvl>
   </w:abstractNum>
-  <w:abstractNum w:abstractNumId="19" w15:restartNumberingAfterBreak="0">
+  <w:abstractNum w:abstractNumId="21" w15:restartNumberingAfterBreak="0">
     <w:nsid w:val="74970E84"/>
     <w:multiLevelType w:val="hybridMultilevel"/>
     <w:tmpl w:val="9FC49330"/>
@@ -5395,7 +6730,7 @@
       </w:pPr>
     </w:lvl>
   </w:abstractNum>
-  <w:abstractNum w:abstractNumId="20" w15:restartNumberingAfterBreak="0">
+  <w:abstractNum w:abstractNumId="22" w15:restartNumberingAfterBreak="0">
     <w:nsid w:val="78C43BBF"/>
     <w:multiLevelType w:val="hybridMultilevel"/>
     <w:tmpl w:val="8BB63548"/>
@@ -5484,7 +6819,7 @@
       </w:pPr>
     </w:lvl>
   </w:abstractNum>
-  <w:abstractNum w:abstractNumId="21" w15:restartNumberingAfterBreak="0">
+  <w:abstractNum w:abstractNumId="23" w15:restartNumberingAfterBreak="0">
     <w:nsid w:val="7CBB7824"/>
     <w:multiLevelType w:val="hybridMultilevel"/>
     <w:tmpl w:val="54047810"/>
@@ -5574,70 +6909,76 @@
     </w:lvl>
   </w:abstractNum>
   <w:num w:numId="1" w16cid:durableId="1277978649">
+    <w:abstractNumId w:val="3"/>
+  </w:num>
+  <w:num w:numId="2" w16cid:durableId="1569879146">
+    <w:abstractNumId w:val="11"/>
+  </w:num>
+  <w:num w:numId="3" w16cid:durableId="2035567955">
+    <w:abstractNumId w:val="6"/>
+  </w:num>
+  <w:num w:numId="4" w16cid:durableId="1783576402">
+    <w:abstractNumId w:val="10"/>
+  </w:num>
+  <w:num w:numId="5" w16cid:durableId="1096361739">
     <w:abstractNumId w:val="2"/>
   </w:num>
-  <w:num w:numId="2" w16cid:durableId="1569879146">
-    <w:abstractNumId w:val="10"/>
+  <w:num w:numId="6" w16cid:durableId="777987303">
+    <w:abstractNumId w:val="13"/>
   </w:num>
-  <w:num w:numId="3" w16cid:durableId="2035567955">
+  <w:num w:numId="7" w16cid:durableId="769394706">
+    <w:abstractNumId w:val="14"/>
+  </w:num>
+  <w:num w:numId="8" w16cid:durableId="823862055">
     <w:abstractNumId w:val="5"/>
   </w:num>
-  <w:num w:numId="4" w16cid:durableId="1783576402">
-    <w:abstractNumId w:val="9"/>
+  <w:num w:numId="9" w16cid:durableId="1179539560">
+    <w:abstractNumId w:val="19"/>
   </w:num>
-  <w:num w:numId="5" w16cid:durableId="1096361739">
-    <w:abstractNumId w:val="1"/>
+  <w:num w:numId="10" w16cid:durableId="887767792">
+    <w:abstractNumId w:val="16"/>
   </w:num>
-  <w:num w:numId="6" w16cid:durableId="777987303">
-    <w:abstractNumId w:val="11"/>
+  <w:num w:numId="11" w16cid:durableId="869293645">
+    <w:abstractNumId w:val="18"/>
   </w:num>
-  <w:num w:numId="7" w16cid:durableId="769394706">
-    <w:abstractNumId w:val="12"/>
+  <w:num w:numId="12" w16cid:durableId="42406734">
+    <w:abstractNumId w:val="21"/>
   </w:num>
-  <w:num w:numId="8" w16cid:durableId="823862055">
+  <w:num w:numId="13" w16cid:durableId="999120446">
+    <w:abstractNumId w:val="17"/>
+  </w:num>
+  <w:num w:numId="14" w16cid:durableId="1562791856">
+    <w:abstractNumId w:val="7"/>
+  </w:num>
+  <w:num w:numId="15" w16cid:durableId="1582332008">
     <w:abstractNumId w:val="4"/>
   </w:num>
-  <w:num w:numId="9" w16cid:durableId="1179539560">
-    <w:abstractNumId w:val="17"/>
-  </w:num>
-  <w:num w:numId="10" w16cid:durableId="887767792">
-    <w:abstractNumId w:val="14"/>
-  </w:num>
-  <w:num w:numId="11" w16cid:durableId="869293645">
-    <w:abstractNumId w:val="16"/>
-  </w:num>
-  <w:num w:numId="12" w16cid:durableId="42406734">
-    <w:abstractNumId w:val="19"/>
-  </w:num>
-  <w:num w:numId="13" w16cid:durableId="999120446">
-    <w:abstractNumId w:val="15"/>
-  </w:num>
-  <w:num w:numId="14" w16cid:durableId="1562791856">
-    <w:abstractNumId w:val="6"/>
-  </w:num>
-  <w:num w:numId="15" w16cid:durableId="1582332008">
-    <w:abstractNumId w:val="3"/>
-  </w:num>
   <w:num w:numId="16" w16cid:durableId="1419135015">
-    <w:abstractNumId w:val="7"/>
+    <w:abstractNumId w:val="8"/>
   </w:num>
   <w:num w:numId="17" w16cid:durableId="897058677">
-    <w:abstractNumId w:val="20"/>
+    <w:abstractNumId w:val="22"/>
   </w:num>
   <w:num w:numId="18" w16cid:durableId="1750082258">
-    <w:abstractNumId w:val="8"/>
+    <w:abstractNumId w:val="9"/>
   </w:num>
   <w:num w:numId="19" w16cid:durableId="1237132301">
     <w:abstractNumId w:val="0"/>
   </w:num>
   <w:num w:numId="20" w16cid:durableId="393628986">
-    <w:abstractNumId w:val="13"/>
+    <w:abstractNumId w:val="15"/>
   </w:num>
   <w:num w:numId="21" w16cid:durableId="368993634">
-    <w:abstractNumId w:val="18"/>
+    <w:abstractNumId w:val="20"/>
   </w:num>
   <w:num w:numId="22" w16cid:durableId="2023697524">
-    <w:abstractNumId w:val="21"/>
+    <w:abstractNumId w:val="23"/>
+  </w:num>
+  <w:num w:numId="23" w16cid:durableId="579406677">
+    <w:abstractNumId w:val="12"/>
+  </w:num>
+  <w:num w:numId="24" w16cid:durableId="621309657">
+    <w:abstractNumId w:val="1"/>
   </w:num>
 </w:numbering>
 </file>
@@ -6246,6 +7587,7 @@
   <w:style w:type="character" w:default="1" w:styleId="DefaultParagraphFont">
     <w:name w:val="Default Paragraph Font"/>
     <w:uiPriority w:val="1"/>
+    <w:semiHidden/>
     <w:unhideWhenUsed/>
   </w:style>
   <w:style w:type="table" w:default="1" w:styleId="TableNormal">

</xml_diff>

<commit_message>
core java and hibernate
</commit_message>
<xml_diff>
--- a/Java Full Stack Notes.docx
+++ b/Java Full Stack Notes.docx
@@ -283,63 +283,7 @@
         </w:numPr>
       </w:pPr>
       <w:r>
-        <w:t xml:space="preserve">Primitive datatypes - </w:t>
-      </w:r>
-      <w:proofErr w:type="gramStart"/>
-      <w:r>
-        <w:t>byte(</w:t>
-      </w:r>
-      <w:proofErr w:type="gramEnd"/>
-      <w:r>
-        <w:t xml:space="preserve">1), </w:t>
-      </w:r>
-      <w:proofErr w:type="gramStart"/>
-      <w:r>
-        <w:t>short(</w:t>
-      </w:r>
-      <w:proofErr w:type="gramEnd"/>
-      <w:r>
-        <w:t xml:space="preserve">2), </w:t>
-      </w:r>
-      <w:proofErr w:type="gramStart"/>
-      <w:r>
-        <w:t>int(</w:t>
-      </w:r>
-      <w:proofErr w:type="gramEnd"/>
-      <w:r>
-        <w:t xml:space="preserve">4), </w:t>
-      </w:r>
-      <w:proofErr w:type="gramStart"/>
-      <w:r>
-        <w:t>long(</w:t>
-      </w:r>
-      <w:proofErr w:type="gramEnd"/>
-      <w:r>
-        <w:t xml:space="preserve">8), </w:t>
-      </w:r>
-      <w:proofErr w:type="gramStart"/>
-      <w:r>
-        <w:t>float(</w:t>
-      </w:r>
-      <w:proofErr w:type="gramEnd"/>
-      <w:r>
-        <w:t xml:space="preserve">4), </w:t>
-      </w:r>
-      <w:proofErr w:type="gramStart"/>
-      <w:r>
-        <w:t>double(</w:t>
-      </w:r>
-      <w:proofErr w:type="gramEnd"/>
-      <w:r>
-        <w:t xml:space="preserve">8), boolean, </w:t>
-      </w:r>
-      <w:proofErr w:type="gramStart"/>
-      <w:r>
-        <w:t>char(</w:t>
-      </w:r>
-      <w:proofErr w:type="gramEnd"/>
-      <w:r>
-        <w:t>2)</w:t>
+        <w:t>Primitive datatypes - byte(1), short(2), int(4), long(8), float(4), double(8), boolean, char(2)</w:t>
       </w:r>
     </w:p>
     <w:p>
@@ -771,39 +715,20 @@
       <w:r>
         <w:t xml:space="preserve">Enter the size of an array and using scanner accept input and store the values in the array using the syntax </w:t>
       </w:r>
-      <w:proofErr w:type="gramStart"/>
       <w:r>
         <w:rPr>
           <w:color w:val="EE0000"/>
         </w:rPr>
-        <w:t>int[</w:t>
-      </w:r>
-      <w:proofErr w:type="gramEnd"/>
+        <w:t>int[] items = new int[size]</w:t>
+      </w:r>
       <w:r>
         <w:rPr>
           <w:color w:val="EE0000"/>
         </w:rPr>
-        <w:t>] items = new int[size</w:t>
-      </w:r>
-      <w:proofErr w:type="gramStart"/>
-      <w:r>
-        <w:rPr>
-          <w:color w:val="EE0000"/>
-        </w:rPr>
-        <w:t>]</w:t>
-      </w:r>
-      <w:r>
-        <w:rPr>
-          <w:color w:val="EE0000"/>
-        </w:rPr>
         <w:t xml:space="preserve"> </w:t>
       </w:r>
       <w:r>
-        <w:t>,</w:t>
-      </w:r>
-      <w:proofErr w:type="gramEnd"/>
-      <w:r>
-        <w:t xml:space="preserve"> after you store values in the array print min, max and sum of the elements present in the array using single for loop:</w:t>
+        <w:t>, after you store values in the array print min, max and sum of the elements present in the array using single for loop:</w:t>
       </w:r>
     </w:p>
     <w:p>
@@ -1575,15 +1500,7 @@
         <w:ind w:left="0" w:firstLine="0"/>
       </w:pPr>
       <w:r>
-        <w:t xml:space="preserve">It makes a single method to give multiple </w:t>
-      </w:r>
-      <w:proofErr w:type="gramStart"/>
-      <w:r>
-        <w:t>result,</w:t>
-      </w:r>
-      <w:proofErr w:type="gramEnd"/>
-      <w:r>
-        <w:t xml:space="preserve"> it is achieved using same method name and signature but different logics in the subclass</w:t>
+        <w:t>It makes a single method to give multiple result, it is achieved using same method name and signature but different logics in the subclass</w:t>
       </w:r>
     </w:p>
     <w:p>
@@ -2190,15 +2107,7 @@
               <w:ind w:left="0" w:firstLine="0"/>
             </w:pPr>
             <w:r>
-              <w:t xml:space="preserve">Methods are not abstract by </w:t>
-            </w:r>
-            <w:proofErr w:type="gramStart"/>
-            <w:r>
-              <w:t>default,</w:t>
-            </w:r>
-            <w:proofErr w:type="gramEnd"/>
-            <w:r>
-              <w:t xml:space="preserve"> you must explicitly use abstract keyword.</w:t>
+              <w:t>Methods are not abstract by default, you must explicitly use abstract keyword.</w:t>
             </w:r>
           </w:p>
         </w:tc>
@@ -2324,13 +2233,8 @@
           <w:numId w:val="10"/>
         </w:numPr>
       </w:pPr>
-      <w:proofErr w:type="spellStart"/>
-      <w:r>
-        <w:t>StringBuffer</w:t>
-      </w:r>
-      <w:proofErr w:type="spellEnd"/>
-      <w:r>
-        <w:t xml:space="preserve"> / StringBuilder</w:t>
+      <w:r>
+        <w:t>StringBuffer / StringBuilder</w:t>
       </w:r>
     </w:p>
     <w:p>
@@ -2606,91 +2510,7 @@
         <w:rPr>
           <w:color w:val="EE0000"/>
         </w:rPr>
-        <w:t xml:space="preserve">- </w:t>
-      </w:r>
-      <w:proofErr w:type="gramStart"/>
-      <w:r>
-        <w:rPr>
-          <w:color w:val="EE0000"/>
-        </w:rPr>
-        <w:t>add(</w:t>
-      </w:r>
-      <w:proofErr w:type="gramEnd"/>
-      <w:r>
-        <w:rPr>
-          <w:color w:val="EE0000"/>
-        </w:rPr>
-        <w:t xml:space="preserve">), </w:t>
-      </w:r>
-      <w:proofErr w:type="gramStart"/>
-      <w:r>
-        <w:rPr>
-          <w:color w:val="EE0000"/>
-        </w:rPr>
-        <w:t>remove(</w:t>
-      </w:r>
-      <w:proofErr w:type="gramEnd"/>
-      <w:r>
-        <w:rPr>
-          <w:color w:val="EE0000"/>
-        </w:rPr>
-        <w:t xml:space="preserve">), </w:t>
-      </w:r>
-      <w:proofErr w:type="gramStart"/>
-      <w:r>
-        <w:rPr>
-          <w:color w:val="EE0000"/>
-        </w:rPr>
-        <w:t>iterator(</w:t>
-      </w:r>
-      <w:proofErr w:type="gramEnd"/>
-      <w:r>
-        <w:rPr>
-          <w:color w:val="EE0000"/>
-        </w:rPr>
-        <w:t xml:space="preserve">), </w:t>
-      </w:r>
-      <w:proofErr w:type="gramStart"/>
-      <w:r>
-        <w:rPr>
-          <w:color w:val="EE0000"/>
-        </w:rPr>
-        <w:t>size(</w:t>
-      </w:r>
-      <w:proofErr w:type="gramEnd"/>
-      <w:r>
-        <w:rPr>
-          <w:color w:val="EE0000"/>
-        </w:rPr>
-        <w:t xml:space="preserve">), </w:t>
-      </w:r>
-      <w:proofErr w:type="gramStart"/>
-      <w:r>
-        <w:rPr>
-          <w:color w:val="EE0000"/>
-        </w:rPr>
-        <w:t>clear(</w:t>
-      </w:r>
-      <w:proofErr w:type="gramEnd"/>
-      <w:r>
-        <w:rPr>
-          <w:color w:val="EE0000"/>
-        </w:rPr>
-        <w:t xml:space="preserve">), </w:t>
-      </w:r>
-      <w:proofErr w:type="gramStart"/>
-      <w:r>
-        <w:rPr>
-          <w:color w:val="EE0000"/>
-        </w:rPr>
-        <w:t>isEmpty(</w:t>
-      </w:r>
-      <w:proofErr w:type="gramEnd"/>
-      <w:r>
-        <w:rPr>
-          <w:color w:val="EE0000"/>
-        </w:rPr>
-        <w:t>)</w:t>
+        <w:t>- add(), remove(), iterator(), size(), clear(), isEmpty()</w:t>
       </w:r>
     </w:p>
     <w:p>
@@ -2804,13 +2624,8 @@
           <w:numId w:val="16"/>
         </w:numPr>
       </w:pPr>
-      <w:proofErr w:type="gramStart"/>
-      <w:r>
-        <w:t>hasNext(</w:t>
-      </w:r>
-      <w:proofErr w:type="gramEnd"/>
-      <w:r>
-        <w:t>): checks if element is present to iterate</w:t>
+      <w:r>
+        <w:t>hasNext(): checks if element is present to iterate</w:t>
       </w:r>
     </w:p>
     <w:p>
@@ -2821,13 +2636,8 @@
           <w:numId w:val="16"/>
         </w:numPr>
       </w:pPr>
-      <w:proofErr w:type="gramStart"/>
-      <w:r>
-        <w:t>next(</w:t>
-      </w:r>
-      <w:proofErr w:type="gramEnd"/>
-      <w:r>
-        <w:t>): returns the iterated element</w:t>
+      <w:r>
+        <w:t>next(): returns the iterated element</w:t>
       </w:r>
     </w:p>
     <w:p>
@@ -2838,32 +2648,25 @@
           <w:numId w:val="16"/>
         </w:numPr>
       </w:pPr>
-      <w:proofErr w:type="gramStart"/>
-      <w:r>
-        <w:t>remove(</w:t>
-      </w:r>
-      <w:proofErr w:type="gramEnd"/>
-      <w:r>
-        <w:t>): removes the iterated element</w:t>
-      </w:r>
-    </w:p>
-    <w:p>
-      <w:pPr>
-        <w:ind w:left="0" w:firstLine="0"/>
-      </w:pPr>
-    </w:p>
-    <w:p>
-      <w:pPr>
-        <w:ind w:left="0" w:firstLine="0"/>
-      </w:pPr>
-      <w:proofErr w:type="spellStart"/>
+      <w:r>
+        <w:t>remove(): removes the iterated element</w:t>
+      </w:r>
+    </w:p>
+    <w:p>
+      <w:pPr>
+        <w:ind w:left="0" w:firstLine="0"/>
+      </w:pPr>
+    </w:p>
+    <w:p>
+      <w:pPr>
+        <w:ind w:left="0" w:firstLine="0"/>
+      </w:pPr>
       <w:r>
         <w:rPr>
           <w:highlight w:val="yellow"/>
         </w:rPr>
         <w:t>StudentRepo</w:t>
       </w:r>
-      <w:proofErr w:type="spellEnd"/>
     </w:p>
     <w:p>
       <w:pPr>
@@ -3041,15 +2844,7 @@
         <w:ind w:left="0" w:firstLine="0"/>
       </w:pPr>
       <w:r>
-        <w:t xml:space="preserve">We have </w:t>
-      </w:r>
-      <w:proofErr w:type="gramStart"/>
-      <w:r>
-        <w:t>try</w:t>
-      </w:r>
-      <w:proofErr w:type="gramEnd"/>
-      <w:r>
-        <w:t>, catch, finally, throw &amp; throws</w:t>
+        <w:t>We have try, catch, finally, throw &amp; throws</w:t>
       </w:r>
     </w:p>
     <w:p>
@@ -3087,56 +2882,28 @@
       <w:r>
         <w:t xml:space="preserve"> </w:t>
       </w:r>
-      <w:proofErr w:type="gramStart"/>
-      <w:r>
-        <w:t>put(</w:t>
-      </w:r>
-      <w:proofErr w:type="gramEnd"/>
-      <w:r>
-        <w:t xml:space="preserve">key, value), remove(key), </w:t>
-      </w:r>
-      <w:proofErr w:type="gramStart"/>
-      <w:r>
-        <w:t>replace(</w:t>
-      </w:r>
-      <w:proofErr w:type="gramEnd"/>
-      <w:r>
-        <w:t xml:space="preserve">key, value), </w:t>
+      <w:r>
+        <w:t xml:space="preserve">put(key, value), remove(key), </w:t>
+      </w:r>
+      <w:r>
+        <w:t xml:space="preserve">replace(key, value), </w:t>
       </w:r>
       <w:r>
         <w:t xml:space="preserve">get(key), </w:t>
       </w:r>
-      <w:proofErr w:type="gramStart"/>
-      <w:r>
-        <w:t>keySet(</w:t>
-      </w:r>
-      <w:proofErr w:type="gramEnd"/>
-      <w:r>
-        <w:t xml:space="preserve">), </w:t>
-      </w:r>
-      <w:proofErr w:type="gramStart"/>
-      <w:r>
-        <w:t>values(</w:t>
-      </w:r>
-      <w:proofErr w:type="gramEnd"/>
-      <w:r>
-        <w:t>)</w:t>
-      </w:r>
-    </w:p>
-    <w:p>
-      <w:pPr>
-        <w:ind w:left="0" w:firstLine="0"/>
-      </w:pPr>
-      <w:r>
-        <w:t xml:space="preserve">It maintains the data in key value </w:t>
-      </w:r>
-      <w:proofErr w:type="gramStart"/>
-      <w:r>
-        <w:t>pairs,</w:t>
-      </w:r>
-      <w:proofErr w:type="gramEnd"/>
-      <w:r>
-        <w:t xml:space="preserve"> key should be unique but value can be duplicate.</w:t>
+      <w:r>
+        <w:t xml:space="preserve">keySet(), </w:t>
+      </w:r>
+      <w:r>
+        <w:t>values()</w:t>
+      </w:r>
+    </w:p>
+    <w:p>
+      <w:pPr>
+        <w:ind w:left="0" w:firstLine="0"/>
+      </w:pPr>
+      <w:r>
+        <w:t>It maintains the data in key value pairs, key should be unique but value can be duplicate.</w:t>
       </w:r>
     </w:p>
     <w:p>
@@ -3303,15 +3070,7 @@
         <w:ind w:left="0" w:firstLine="0"/>
       </w:pPr>
       <w:r>
-        <w:t xml:space="preserve">Comparator: it is to customize the </w:t>
-      </w:r>
-      <w:proofErr w:type="gramStart"/>
-      <w:r>
-        <w:t>sorting  to</w:t>
-      </w:r>
-      <w:proofErr w:type="gramEnd"/>
-      <w:r>
-        <w:t xml:space="preserve"> use multiple parameters</w:t>
+        <w:t>Comparator: it is to customize the sorting  to use multiple parameters</w:t>
       </w:r>
     </w:p>
     <w:p>
@@ -3530,15 +3289,7 @@
         <w:t>Note:</w:t>
       </w:r>
       <w:r>
-        <w:t xml:space="preserve"> Any object you want to serialize must </w:t>
-      </w:r>
-      <w:proofErr w:type="spellStart"/>
-      <w:r>
-        <w:t>by</w:t>
-      </w:r>
-      <w:proofErr w:type="spellEnd"/>
-      <w:r>
-        <w:t xml:space="preserve"> marked with marker interface</w:t>
+        <w:t xml:space="preserve"> Any object you want to serialize must by marked with marker interface</w:t>
       </w:r>
       <w:r>
         <w:t xml:space="preserve"> called Serializable, a marker interface doesn’t have any abstract methods</w:t>
@@ -3564,74 +3315,27 @@
       </w:r>
       <w:r>
         <w:br/>
-        <w:t>FileInputStream fileInput = new FileInputStream(“</w:t>
-      </w:r>
-      <w:proofErr w:type="spellStart"/>
-      <w:r>
-        <w:t>student.ser</w:t>
-      </w:r>
-      <w:proofErr w:type="spellEnd"/>
-      <w:r>
-        <w:t>”);</w:t>
+        <w:t>FileInputStream fileInput = new FileInputStream(“student.ser”);</w:t>
       </w:r>
       <w:r>
         <w:br/>
-        <w:t xml:space="preserve">FileOutputStream </w:t>
-      </w:r>
-      <w:proofErr w:type="spellStart"/>
-      <w:r>
-        <w:t>fileOutput</w:t>
-      </w:r>
-      <w:proofErr w:type="spellEnd"/>
-      <w:r>
-        <w:t xml:space="preserve"> = new FileOutputStream(“</w:t>
-      </w:r>
-      <w:proofErr w:type="spellStart"/>
-      <w:r>
-        <w:t>student.ser</w:t>
-      </w:r>
-      <w:proofErr w:type="spellEnd"/>
-      <w:r>
-        <w:t>”);</w:t>
-      </w:r>
-    </w:p>
-    <w:p>
-      <w:pPr>
-        <w:ind w:left="0" w:firstLine="0"/>
-      </w:pPr>
-      <w:r>
-        <w:t>ObjectOutputStream oos = new ObjectOutputStream(</w:t>
-      </w:r>
-      <w:proofErr w:type="spellStart"/>
-      <w:r>
-        <w:t>fileOutput</w:t>
-      </w:r>
-      <w:proofErr w:type="spellEnd"/>
-      <w:r>
-        <w:t>);</w:t>
+        <w:t>FileOutputStream fileOutput = new FileOutputStream(“student.ser”);</w:t>
+      </w:r>
+    </w:p>
+    <w:p>
+      <w:pPr>
+        <w:ind w:left="0" w:firstLine="0"/>
+      </w:pPr>
+      <w:r>
+        <w:t>ObjectOutputStream oos = new ObjectOutputStream(fileOutput);</w:t>
       </w:r>
       <w:r>
         <w:br/>
-        <w:t xml:space="preserve">obj = new </w:t>
-      </w:r>
-      <w:proofErr w:type="gramStart"/>
-      <w:r>
-        <w:t>Student(</w:t>
-      </w:r>
-      <w:proofErr w:type="gramEnd"/>
-      <w:r>
-        <w:t>101, “Raj”, 56.0);</w:t>
+        <w:t>obj = new Student(101, “Raj”, 56.0);</w:t>
       </w:r>
       <w:r>
         <w:br/>
-      </w:r>
-      <w:proofErr w:type="gramStart"/>
-      <w:r>
-        <w:t>oos.writeObject</w:t>
-      </w:r>
-      <w:proofErr w:type="gramEnd"/>
-      <w:r>
-        <w:t>(obj); =&gt; checks the obj is Serializable &amp; stores in the file else throws exception</w:t>
+        <w:t>oos.writeObject(obj); =&gt; checks the obj is Serializable &amp; stores in the file else throws exception</w:t>
       </w:r>
     </w:p>
     <w:p>
@@ -3651,16 +3355,7 @@
       </w:r>
       <w:r>
         <w:br/>
-      </w:r>
-      <w:proofErr w:type="spellStart"/>
-      <w:proofErr w:type="gramStart"/>
-      <w:r>
-        <w:t>oos.readObject</w:t>
-      </w:r>
-      <w:proofErr w:type="spellEnd"/>
-      <w:proofErr w:type="gramEnd"/>
-      <w:r>
-        <w:t>() -&gt; returns the object present in the file</w:t>
+        <w:t>oos.readObject() -&gt; returns the object present in the file</w:t>
       </w:r>
     </w:p>
     <w:p>
@@ -3777,26 +3472,10 @@
         <w:t>boolean</w:t>
       </w:r>
       <w:r>
-        <w:t xml:space="preserve"> </w:t>
-      </w:r>
-      <w:proofErr w:type="gramStart"/>
-      <w:r>
-        <w:t>test(</w:t>
-      </w:r>
-      <w:proofErr w:type="gramEnd"/>
-      <w:r>
-        <w:t>T t</w:t>
-      </w:r>
-      <w:proofErr w:type="gramStart"/>
-      <w:r>
-        <w:t>);</w:t>
-      </w:r>
-      <w:r>
-        <w:t xml:space="preserve">  (</w:t>
-      </w:r>
-      <w:proofErr w:type="gramEnd"/>
-      <w:r>
-        <w:t>data) -&gt; data % 2 == 0</w:t>
+        <w:t xml:space="preserve"> test(T t);</w:t>
+      </w:r>
+      <w:r>
+        <w:t xml:space="preserve">  (data) -&gt; data % 2 == 0</w:t>
       </w:r>
     </w:p>
     <w:p>
@@ -3821,15 +3500,7 @@
         <w:t>void</w:t>
       </w:r>
       <w:r>
-        <w:t xml:space="preserve"> </w:t>
-      </w:r>
-      <w:proofErr w:type="gramStart"/>
-      <w:r>
-        <w:t>accept(</w:t>
-      </w:r>
-      <w:proofErr w:type="gramEnd"/>
-      <w:r>
-        <w:t>T t);</w:t>
+        <w:t xml:space="preserve"> accept(T t);</w:t>
       </w:r>
       <w:r>
         <w:t xml:space="preserve"> (data) -&gt; System.out.print</w:t>
@@ -3856,15 +3527,7 @@
         <w:t xml:space="preserve">: </w:t>
       </w:r>
       <w:r>
-        <w:t xml:space="preserve">T </w:t>
-      </w:r>
-      <w:proofErr w:type="gramStart"/>
-      <w:r>
-        <w:t>get(</w:t>
-      </w:r>
-      <w:proofErr w:type="gramEnd"/>
-      <w:r>
-        <w:t>);</w:t>
+        <w:t>T get();</w:t>
       </w:r>
       <w:r>
         <w:t xml:space="preserve"> () -&gt; data</w:t>
@@ -3885,15 +3548,7 @@
         <w:t xml:space="preserve">: </w:t>
       </w:r>
       <w:r>
-        <w:t xml:space="preserve">R </w:t>
-      </w:r>
-      <w:proofErr w:type="gramStart"/>
-      <w:r>
-        <w:t>apply(</w:t>
-      </w:r>
-      <w:proofErr w:type="gramEnd"/>
-      <w:r>
-        <w:t>T t);</w:t>
+        <w:t>R apply(T t);</w:t>
       </w:r>
       <w:r>
         <w:t xml:space="preserve"> (data) -&gt; someData</w:t>
@@ -3918,15 +3573,7 @@
         <w:t>int</w:t>
       </w:r>
       <w:r>
-        <w:t xml:space="preserve"> </w:t>
-      </w:r>
-      <w:proofErr w:type="gramStart"/>
-      <w:r>
-        <w:t>compare(</w:t>
-      </w:r>
-      <w:proofErr w:type="gramEnd"/>
-      <w:r>
-        <w:t>T o1, T o2);</w:t>
+        <w:t xml:space="preserve"> compare(T o1, T o2);</w:t>
       </w:r>
       <w:r>
         <w:t xml:space="preserve"> (o1, o2) -&gt; value;</w:t>
@@ -3953,6 +3600,9 @@
         <w:ind w:left="0" w:firstLine="0"/>
       </w:pPr>
       <w:r>
+        <w:rPr>
+          <w:noProof/>
+        </w:rPr>
         <w:drawing>
           <wp:inline distT="0" distB="0" distL="0" distR="0" wp14:anchorId="2546BC9A" wp14:editId="655A2836">
             <wp:extent cx="5943600" cy="1162050"/>
@@ -4001,15 +3651,7 @@
         <w:t>JDBC:</w:t>
       </w:r>
       <w:r>
-        <w:t xml:space="preserve"> Java Database Connectivity, it provides set of </w:t>
-      </w:r>
-      <w:proofErr w:type="gramStart"/>
-      <w:r>
-        <w:t>API’s</w:t>
-      </w:r>
-      <w:proofErr w:type="gramEnd"/>
-      <w:r>
-        <w:t xml:space="preserve"> (interfaces &amp; classes) to interact with any Relational Database, the database vendors must implement these interfaces so that a Java application can use common JDBC API’s regardless of the implementation</w:t>
+        <w:t xml:space="preserve"> Java Database Connectivity, it provides set of API’s (interfaces &amp; classes) to interact with any Relational Database, the database vendors must implement these interfaces so that a Java application can use common JDBC API’s regardless of the implementation</w:t>
       </w:r>
       <w:r>
         <w:t>.</w:t>
@@ -4059,23 +3701,7 @@
       </w:pPr>
       <w:r>
         <w:lastRenderedPageBreak/>
-        <w:t>Class.forName(“</w:t>
-      </w:r>
-      <w:proofErr w:type="gramStart"/>
-      <w:r>
-        <w:t>com.mysql</w:t>
-      </w:r>
-      <w:proofErr w:type="gramEnd"/>
-      <w:r>
-        <w:t>.</w:t>
-      </w:r>
-      <w:proofErr w:type="gramStart"/>
-      <w:r>
-        <w:t>cj.jdbc</w:t>
-      </w:r>
-      <w:proofErr w:type="gramEnd"/>
-      <w:r>
-        <w:t>.Driver”);</w:t>
+        <w:t>Class.forName(“com.mysql.cj.jdbc.Driver”);</w:t>
       </w:r>
     </w:p>
     <w:p>
@@ -4147,15 +3773,7 @@
         <w:t xml:space="preserve">PreparedStatement </w:t>
       </w:r>
       <w:r>
-        <w:t xml:space="preserve">statement = </w:t>
-      </w:r>
-      <w:proofErr w:type="gramStart"/>
-      <w:r>
-        <w:t>connection.prepareStatement</w:t>
-      </w:r>
-      <w:proofErr w:type="gramEnd"/>
-      <w:r>
-        <w:t>(query);</w:t>
+        <w:t>statement = connection.prepareStatement(query);</w:t>
       </w:r>
     </w:p>
     <w:p>
@@ -4185,51 +3803,22 @@
         <w:ind w:firstLine="0"/>
       </w:pPr>
       <w:r>
-        <w:t xml:space="preserve">int count = </w:t>
-      </w:r>
-      <w:proofErr w:type="gramStart"/>
-      <w:r>
-        <w:t>statement.executeUpdate</w:t>
-      </w:r>
-      <w:proofErr w:type="gramEnd"/>
-      <w:r>
-        <w:t xml:space="preserve">(); =&gt; </w:t>
-      </w:r>
-      <w:proofErr w:type="spellStart"/>
-      <w:r>
-        <w:t>insert|update|delete</w:t>
-      </w:r>
-      <w:proofErr w:type="spellEnd"/>
+        <w:t>int count = statement.executeUpdate(); =&gt; insert|update|delete</w:t>
+      </w:r>
     </w:p>
     <w:p>
       <w:pPr>
         <w:pStyle w:val="ListParagraph"/>
         <w:ind w:firstLine="0"/>
       </w:pPr>
-      <w:proofErr w:type="spellStart"/>
       <w:r>
         <w:rPr>
           <w:color w:val="EE0000"/>
         </w:rPr>
-        <w:t>ResulSet</w:t>
-      </w:r>
-      <w:proofErr w:type="spellEnd"/>
-      <w:r>
-        <w:rPr>
-          <w:color w:val="EE0000"/>
-        </w:rPr>
-        <w:t xml:space="preserve"> </w:t>
-      </w:r>
-      <w:r>
-        <w:t xml:space="preserve">result = </w:t>
-      </w:r>
-      <w:proofErr w:type="gramStart"/>
-      <w:r>
-        <w:t>statement.executeQuery</w:t>
-      </w:r>
-      <w:proofErr w:type="gramEnd"/>
-      <w:r>
-        <w:t>(); =&gt; select</w:t>
+        <w:t xml:space="preserve">ResulSet </w:t>
+      </w:r>
+      <w:r>
+        <w:t>result = statement.executeQuery(); =&gt; select</w:t>
       </w:r>
     </w:p>
     <w:p>
@@ -4249,35 +3838,16 @@
         <w:pStyle w:val="ListParagraph"/>
         <w:ind w:firstLine="0"/>
       </w:pPr>
-      <w:proofErr w:type="gramStart"/>
-      <w:r>
-        <w:t>result.close</w:t>
-      </w:r>
-      <w:proofErr w:type="gramEnd"/>
-      <w:r>
-        <w:t>();</w:t>
+      <w:r>
+        <w:t>result.close();</w:t>
       </w:r>
       <w:r>
         <w:br/>
-      </w:r>
-      <w:proofErr w:type="gramStart"/>
-      <w:r>
-        <w:t>statement.close</w:t>
-      </w:r>
-      <w:proofErr w:type="gramEnd"/>
-      <w:r>
-        <w:t>();</w:t>
+        <w:t>statement.close();</w:t>
       </w:r>
       <w:r>
         <w:br/>
-      </w:r>
-      <w:proofErr w:type="gramStart"/>
-      <w:r>
-        <w:t>connection.close</w:t>
-      </w:r>
-      <w:proofErr w:type="gramEnd"/>
-      <w:r>
-        <w:t>();</w:t>
+        <w:t>connection.close();</w:t>
       </w:r>
     </w:p>
     <w:p>
@@ -4305,15 +3875,7 @@
         </w:numPr>
       </w:pPr>
       <w:r>
-        <w:t xml:space="preserve">Statement statement = </w:t>
-      </w:r>
-      <w:proofErr w:type="gramStart"/>
-      <w:r>
-        <w:t>connection.createStatement</w:t>
-      </w:r>
-      <w:proofErr w:type="gramEnd"/>
-      <w:r>
-        <w:t>();</w:t>
+        <w:t>Statement statement = connection.createStatement();</w:t>
       </w:r>
     </w:p>
     <w:p>
@@ -4321,29 +3883,11 @@
         <w:pStyle w:val="ListParagraph"/>
         <w:ind w:firstLine="0"/>
       </w:pPr>
-      <w:proofErr w:type="gramStart"/>
-      <w:r>
-        <w:t>statement.executeUpdate</w:t>
-      </w:r>
-      <w:proofErr w:type="gramEnd"/>
-      <w:r>
-        <w:t xml:space="preserve">(“insert into profile </w:t>
-      </w:r>
-      <w:proofErr w:type="gramStart"/>
-      <w:r>
-        <w:t>values(</w:t>
-      </w:r>
-      <w:proofErr w:type="gramEnd"/>
-      <w:r>
-        <w:t>100, “+</w:t>
-      </w:r>
-      <w:proofErr w:type="gramStart"/>
-      <w:r>
-        <w:t>’”Raj</w:t>
-      </w:r>
-      <w:proofErr w:type="gramEnd"/>
-      <w:r>
-        <w:t>”’+”, 939239</w:t>
+      <w:r>
+        <w:t>statement.executeUpdate(“insert into profile values(</w:t>
+      </w:r>
+      <w:r>
+        <w:t>100, “+’”Raj”’+”, 939239</w:t>
       </w:r>
       <w:r>
         <w:t>)”);</w:t>
@@ -4355,15 +3899,7 @@
         <w:ind w:firstLine="0"/>
       </w:pPr>
       <w:r>
-        <w:t xml:space="preserve">ResultSet result = </w:t>
-      </w:r>
-      <w:proofErr w:type="gramStart"/>
-      <w:r>
-        <w:t>statement.executeQuery</w:t>
-      </w:r>
-      <w:proofErr w:type="gramEnd"/>
-      <w:r>
-        <w:t>(“select * from profile”);</w:t>
+        <w:t>ResultSet result = statement.executeQuery(“select * from profile”);</w:t>
       </w:r>
     </w:p>
     <w:p>
@@ -4375,21 +3911,8 @@
         </w:numPr>
       </w:pPr>
       <w:r>
-        <w:t xml:space="preserve">PreparedStatement statement = </w:t>
-      </w:r>
-      <w:proofErr w:type="gramStart"/>
-      <w:r>
-        <w:t>connection.prepareStatement</w:t>
-      </w:r>
-      <w:proofErr w:type="gramEnd"/>
-      <w:r>
-        <w:t>(“insert into profile values</w:t>
-      </w:r>
-      <w:proofErr w:type="gramStart"/>
-      <w:r>
-        <w:t>(?,?,?</w:t>
-      </w:r>
-      <w:proofErr w:type="gramEnd"/>
+        <w:t>PreparedStatement statement = connection.prepareStatement(“insert into profile values(?,?,?</w:t>
+      </w:r>
       <w:r>
         <w:t>)</w:t>
       </w:r>
@@ -4402,51 +3925,16 @@
         <w:pStyle w:val="ListParagraph"/>
         <w:ind w:firstLine="0"/>
       </w:pPr>
-      <w:proofErr w:type="gramStart"/>
-      <w:r>
-        <w:t>statement.setInt</w:t>
-      </w:r>
-      <w:proofErr w:type="gramEnd"/>
-      <w:r>
-        <w:t>(1, 100</w:t>
-      </w:r>
-      <w:proofErr w:type="gramStart"/>
-      <w:r>
-        <w:t xml:space="preserve">);   </w:t>
-      </w:r>
-      <w:proofErr w:type="gramEnd"/>
-      <w:r>
-        <w:t xml:space="preserve"> </w:t>
-      </w:r>
-      <w:proofErr w:type="gramStart"/>
-      <w:r>
-        <w:t>statement.setString</w:t>
-      </w:r>
-      <w:proofErr w:type="gramEnd"/>
-      <w:r>
-        <w:t xml:space="preserve">(2, “Raj”); </w:t>
+      <w:r>
+        <w:t xml:space="preserve">statement.setInt(1, 100);    statement.setString(2, “Raj”); </w:t>
       </w:r>
       <w:r>
         <w:br/>
-      </w:r>
-      <w:proofErr w:type="gramStart"/>
-      <w:r>
-        <w:t>statement.setLong</w:t>
-      </w:r>
-      <w:proofErr w:type="gramEnd"/>
-      <w:r>
-        <w:t>(3, 9929329239L);</w:t>
+        <w:t>statement.setLong(3, 9929329239L);</w:t>
       </w:r>
       <w:r>
         <w:br/>
-      </w:r>
-      <w:proofErr w:type="gramStart"/>
-      <w:r>
-        <w:t>statement.executeUpdate</w:t>
-      </w:r>
-      <w:proofErr w:type="gramEnd"/>
-      <w:r>
-        <w:t>();</w:t>
+        <w:t>statement.executeUpdate();</w:t>
       </w:r>
     </w:p>
     <w:p>
@@ -4484,6 +3972,9 @@
         <w:ind w:left="0" w:firstLine="0"/>
       </w:pPr>
       <w:r>
+        <w:rPr>
+          <w:noProof/>
+        </w:rPr>
         <w:lastRenderedPageBreak/>
         <w:drawing>
           <wp:inline distT="0" distB="0" distL="0" distR="0" wp14:anchorId="0BC38EA6" wp14:editId="68C9A327">
@@ -4562,6 +4053,9 @@
         <w:ind w:left="0" w:firstLine="0"/>
       </w:pPr>
       <w:r>
+        <w:rPr>
+          <w:noProof/>
+        </w:rPr>
         <w:drawing>
           <wp:inline distT="0" distB="0" distL="0" distR="0" wp14:anchorId="2EE9164A" wp14:editId="619FE38B">
             <wp:extent cx="5943600" cy="2713355"/>
@@ -4640,6 +4134,9 @@
         <w:ind w:left="0" w:firstLine="0"/>
       </w:pPr>
       <w:r>
+        <w:rPr>
+          <w:noProof/>
+        </w:rPr>
         <w:drawing>
           <wp:inline distT="0" distB="0" distL="0" distR="0" wp14:anchorId="72C28A70" wp14:editId="72F437C9">
             <wp:extent cx="5943600" cy="3386455"/>
@@ -4693,6 +4190,9 @@
         <w:ind w:left="0" w:firstLine="0"/>
       </w:pPr>
       <w:r>
+        <w:rPr>
+          <w:noProof/>
+        </w:rPr>
         <w:lastRenderedPageBreak/>
         <w:drawing>
           <wp:inline distT="0" distB="0" distL="0" distR="0" wp14:anchorId="22801742" wp14:editId="652115C2">
@@ -4736,6 +4236,1676 @@
         <w:ind w:left="0" w:firstLine="0"/>
       </w:pPr>
     </w:p>
+    <w:p>
+      <w:pPr>
+        <w:ind w:left="0" w:firstLine="0"/>
+      </w:pPr>
+      <w:r>
+        <w:rPr>
+          <w:highlight w:val="yellow"/>
+        </w:rPr>
+        <w:t>Transaction:</w:t>
+      </w:r>
+    </w:p>
+    <w:p>
+      <w:pPr>
+        <w:ind w:left="0" w:firstLine="0"/>
+      </w:pPr>
+      <w:r>
+        <w:t>It is a process either all should be saved or none should be saved if anything fails</w:t>
+      </w:r>
+    </w:p>
+    <w:p>
+      <w:pPr>
+        <w:ind w:left="0" w:firstLine="0"/>
+      </w:pPr>
+      <w:r>
+        <w:t>In JDBC transaction is disabled because every update you do in the database is auto-saved / auto committed to enable the transaction you must disable the auto-save feature</w:t>
+      </w:r>
+      <w:r>
+        <w:t xml:space="preserve"> so that application will decide when to save or rollback</w:t>
+      </w:r>
+    </w:p>
+    <w:p>
+      <w:pPr>
+        <w:ind w:left="0" w:firstLine="0"/>
+      </w:pPr>
+      <w:r>
+        <w:rPr>
+          <w:highlight w:val="yellow"/>
+        </w:rPr>
+        <w:t>How to enable the transaction</w:t>
+      </w:r>
+    </w:p>
+    <w:p>
+      <w:pPr>
+        <w:ind w:left="0" w:firstLine="0"/>
+      </w:pPr>
+      <w:r>
+        <w:t>connection.setAutoCommit(false);</w:t>
+      </w:r>
+      <w:r>
+        <w:t xml:space="preserve"> </w:t>
+      </w:r>
+    </w:p>
+    <w:p>
+      <w:pPr>
+        <w:ind w:left="0" w:firstLine="0"/>
+      </w:pPr>
+      <w:r>
+        <w:t>connection.commit(); //save</w:t>
+      </w:r>
+    </w:p>
+    <w:p>
+      <w:pPr>
+        <w:ind w:left="0" w:firstLine="0"/>
+      </w:pPr>
+      <w:r>
+        <w:t>connection.rollback(); //undo</w:t>
+      </w:r>
+    </w:p>
+    <w:p>
+      <w:pPr>
+        <w:ind w:left="0" w:firstLine="0"/>
+      </w:pPr>
+    </w:p>
+    <w:p>
+      <w:pPr>
+        <w:ind w:left="0" w:firstLine="0"/>
+      </w:pPr>
+      <w:r>
+        <w:rPr>
+          <w:noProof/>
+        </w:rPr>
+        <w:lastRenderedPageBreak/>
+        <w:drawing>
+          <wp:inline distT="0" distB="0" distL="0" distR="0" wp14:anchorId="42E2116A" wp14:editId="44C48318">
+            <wp:extent cx="5943600" cy="3569970"/>
+            <wp:effectExtent l="0" t="0" r="0" b="0"/>
+            <wp:docPr id="102200096" name="Picture 1"/>
+            <wp:cNvGraphicFramePr>
+              <a:graphicFrameLocks xmlns:a="http://schemas.openxmlformats.org/drawingml/2006/main" noChangeAspect="1"/>
+            </wp:cNvGraphicFramePr>
+            <a:graphic xmlns:a="http://schemas.openxmlformats.org/drawingml/2006/main">
+              <a:graphicData uri="http://schemas.openxmlformats.org/drawingml/2006/picture">
+                <pic:pic xmlns:pic="http://schemas.openxmlformats.org/drawingml/2006/picture">
+                  <pic:nvPicPr>
+                    <pic:cNvPr id="102200096" name=""/>
+                    <pic:cNvPicPr/>
+                  </pic:nvPicPr>
+                  <pic:blipFill>
+                    <a:blip r:embed="rId37"/>
+                    <a:stretch>
+                      <a:fillRect/>
+                    </a:stretch>
+                  </pic:blipFill>
+                  <pic:spPr>
+                    <a:xfrm>
+                      <a:off x="0" y="0"/>
+                      <a:ext cx="5943600" cy="3569970"/>
+                    </a:xfrm>
+                    <a:prstGeom prst="rect">
+                      <a:avLst/>
+                    </a:prstGeom>
+                  </pic:spPr>
+                </pic:pic>
+              </a:graphicData>
+            </a:graphic>
+          </wp:inline>
+        </w:drawing>
+      </w:r>
+    </w:p>
+    <w:p>
+      <w:pPr>
+        <w:ind w:left="0" w:firstLine="0"/>
+      </w:pPr>
+      <w:r>
+        <w:rPr>
+          <w:highlight w:val="yellow"/>
+        </w:rPr>
+        <w:t>RowSet:</w:t>
+      </w:r>
+      <w:r>
+        <w:t xml:space="preserve"> It simplifies writing JDBC code where you don’t have to use Connection, PreparedStatement, ResultSet and work on the database table like the way you access java-beans</w:t>
+      </w:r>
+      <w:r>
+        <w:t xml:space="preserve">, you can navigate over the result either in forward or backward direction </w:t>
+      </w:r>
+    </w:p>
+    <w:p>
+      <w:pPr>
+        <w:ind w:left="0" w:firstLine="0"/>
+      </w:pPr>
+      <w:r>
+        <w:rPr>
+          <w:noProof/>
+        </w:rPr>
+        <w:lastRenderedPageBreak/>
+        <w:drawing>
+          <wp:inline distT="0" distB="0" distL="0" distR="0" wp14:anchorId="68657787" wp14:editId="288C1779">
+            <wp:extent cx="5943600" cy="4026535"/>
+            <wp:effectExtent l="0" t="0" r="0" b="0"/>
+            <wp:docPr id="1958071736" name="Picture 1"/>
+            <wp:cNvGraphicFramePr>
+              <a:graphicFrameLocks xmlns:a="http://schemas.openxmlformats.org/drawingml/2006/main" noChangeAspect="1"/>
+            </wp:cNvGraphicFramePr>
+            <a:graphic xmlns:a="http://schemas.openxmlformats.org/drawingml/2006/main">
+              <a:graphicData uri="http://schemas.openxmlformats.org/drawingml/2006/picture">
+                <pic:pic xmlns:pic="http://schemas.openxmlformats.org/drawingml/2006/picture">
+                  <pic:nvPicPr>
+                    <pic:cNvPr id="1958071736" name=""/>
+                    <pic:cNvPicPr/>
+                  </pic:nvPicPr>
+                  <pic:blipFill>
+                    <a:blip r:embed="rId38"/>
+                    <a:stretch>
+                      <a:fillRect/>
+                    </a:stretch>
+                  </pic:blipFill>
+                  <pic:spPr>
+                    <a:xfrm>
+                      <a:off x="0" y="0"/>
+                      <a:ext cx="5943600" cy="4026535"/>
+                    </a:xfrm>
+                    <a:prstGeom prst="rect">
+                      <a:avLst/>
+                    </a:prstGeom>
+                  </pic:spPr>
+                </pic:pic>
+              </a:graphicData>
+            </a:graphic>
+          </wp:inline>
+        </w:drawing>
+      </w:r>
+    </w:p>
+    <w:p>
+      <w:pPr>
+        <w:ind w:left="0" w:firstLine="0"/>
+      </w:pPr>
+      <w:r>
+        <w:rPr>
+          <w:highlight w:val="yellow"/>
+        </w:rPr>
+        <w:t>Hibernate:</w:t>
+      </w:r>
+    </w:p>
+    <w:p>
+      <w:pPr>
+        <w:ind w:left="0" w:firstLine="0"/>
+      </w:pPr>
+      <w:r>
+        <w:t>It is a ORM framework used to perform DB operations</w:t>
+      </w:r>
+    </w:p>
+    <w:p>
+      <w:pPr>
+        <w:ind w:left="0" w:firstLine="0"/>
+      </w:pPr>
+      <w:r>
+        <w:rPr>
+          <w:highlight w:val="yellow"/>
+        </w:rPr>
+        <w:t>ORM</w:t>
+      </w:r>
+      <w:r>
+        <w:t xml:space="preserve"> stands for Object Relational mapping i.e., Java Objects can be directly mapped to the Table</w:t>
+      </w:r>
+      <w:r>
+        <w:t xml:space="preserve">, consider ORM is like an approach </w:t>
+      </w:r>
+    </w:p>
+    <w:p>
+      <w:pPr>
+        <w:ind w:left="0" w:firstLine="0"/>
+      </w:pPr>
+      <w:r>
+        <w:rPr>
+          <w:highlight w:val="yellow"/>
+        </w:rPr>
+        <w:t>JPA:</w:t>
+      </w:r>
+    </w:p>
+    <w:p>
+      <w:pPr>
+        <w:ind w:left="0" w:firstLine="0"/>
+      </w:pPr>
+      <w:r>
+        <w:t>Java Persistence API / Jakarta Persistence API</w:t>
+      </w:r>
+      <w:r>
+        <w:t xml:space="preserve"> is a specification or standard that provides </w:t>
+      </w:r>
+      <w:r>
+        <w:t>set of interfaces &amp; classes to use ORM</w:t>
+      </w:r>
+      <w:r>
+        <w:t xml:space="preserve">, JPA is going to define the guidelines and rules to implement ORM </w:t>
+      </w:r>
+    </w:p>
+    <w:p>
+      <w:pPr>
+        <w:ind w:left="0" w:firstLine="0"/>
+      </w:pPr>
+      <w:r>
+        <w:rPr>
+          <w:highlight w:val="yellow"/>
+        </w:rPr>
+        <w:t>Hibernate:</w:t>
+      </w:r>
+      <w:r>
+        <w:t xml:space="preserve"> It is one of the implementation of JPA</w:t>
+      </w:r>
+      <w:r>
+        <w:t>, it is an ORM tool</w:t>
+      </w:r>
+    </w:p>
+    <w:p>
+      <w:pPr>
+        <w:ind w:left="0" w:firstLine="0"/>
+      </w:pPr>
+      <w:r>
+        <w:t>There are other implementations to the JPA</w:t>
+      </w:r>
+    </w:p>
+    <w:p>
+      <w:pPr>
+        <w:pStyle w:val="ListParagraph"/>
+        <w:numPr>
+          <w:ilvl w:val="0"/>
+          <w:numId w:val="25"/>
+        </w:numPr>
+      </w:pPr>
+      <w:r>
+        <w:t>Spring Data JPA</w:t>
+      </w:r>
+    </w:p>
+    <w:p>
+      <w:pPr>
+        <w:pStyle w:val="ListParagraph"/>
+        <w:numPr>
+          <w:ilvl w:val="0"/>
+          <w:numId w:val="25"/>
+        </w:numPr>
+      </w:pPr>
+      <w:r>
+        <w:t>i</w:t>
+      </w:r>
+      <w:r>
+        <w:t>Batis</w:t>
+      </w:r>
+    </w:p>
+    <w:p>
+      <w:pPr>
+        <w:pStyle w:val="ListParagraph"/>
+        <w:numPr>
+          <w:ilvl w:val="0"/>
+          <w:numId w:val="25"/>
+        </w:numPr>
+      </w:pPr>
+      <w:r>
+        <w:lastRenderedPageBreak/>
+        <w:t>TopLink</w:t>
+      </w:r>
+    </w:p>
+    <w:p>
+      <w:pPr>
+        <w:ind w:left="0" w:firstLine="0"/>
+      </w:pPr>
+      <w:r>
+        <w:t>JPA defines that a class must be mapped to the table and their attributes/properties must be mapped to the columns through annotations, it provides set of annotations</w:t>
+      </w:r>
+    </w:p>
+    <w:p>
+      <w:pPr>
+        <w:pStyle w:val="ListParagraph"/>
+        <w:numPr>
+          <w:ilvl w:val="0"/>
+          <w:numId w:val="26"/>
+        </w:numPr>
+      </w:pPr>
+      <w:r>
+        <w:t xml:space="preserve">@Entity -&gt; </w:t>
+      </w:r>
+      <w:r>
+        <w:t>marks the class that needs to be mapped to the table</w:t>
+      </w:r>
+    </w:p>
+    <w:p>
+      <w:pPr>
+        <w:pStyle w:val="ListParagraph"/>
+        <w:numPr>
+          <w:ilvl w:val="0"/>
+          <w:numId w:val="26"/>
+        </w:numPr>
+      </w:pPr>
+      <w:r>
+        <w:t>@Table -&gt; to name the table a class must map to</w:t>
+      </w:r>
+    </w:p>
+    <w:p>
+      <w:pPr>
+        <w:pStyle w:val="ListParagraph"/>
+        <w:numPr>
+          <w:ilvl w:val="0"/>
+          <w:numId w:val="26"/>
+        </w:numPr>
+      </w:pPr>
+      <w:r>
+        <w:t>@Id -&gt; to mark the property that maps to the primary key column</w:t>
+      </w:r>
+    </w:p>
+    <w:p>
+      <w:pPr>
+        <w:pStyle w:val="ListParagraph"/>
+        <w:numPr>
+          <w:ilvl w:val="0"/>
+          <w:numId w:val="26"/>
+        </w:numPr>
+      </w:pPr>
+      <w:r>
+        <w:t>@Column -&gt; to specify the column name a property is mapped to</w:t>
+      </w:r>
+    </w:p>
+    <w:p>
+      <w:pPr>
+        <w:pStyle w:val="ListParagraph"/>
+        <w:numPr>
+          <w:ilvl w:val="0"/>
+          <w:numId w:val="26"/>
+        </w:numPr>
+      </w:pPr>
+      <w:r>
+        <w:t>@GeneratedValue -&gt; to generate the primary key automatically</w:t>
+      </w:r>
+    </w:p>
+    <w:p>
+      <w:pPr>
+        <w:ind w:left="360" w:firstLine="0"/>
+      </w:pPr>
+    </w:p>
+    <w:p>
+      <w:pPr>
+        <w:ind w:left="0" w:firstLine="0"/>
+      </w:pPr>
+      <w:r>
+        <w:rPr>
+          <w:highlight w:val="yellow"/>
+        </w:rPr>
+        <w:t>Benefits of using ORM</w:t>
+      </w:r>
+    </w:p>
+    <w:p>
+      <w:pPr>
+        <w:pStyle w:val="ListParagraph"/>
+        <w:numPr>
+          <w:ilvl w:val="0"/>
+          <w:numId w:val="27"/>
+        </w:numPr>
+      </w:pPr>
+      <w:r>
+        <w:t>You get built-in API’s and their methods to perform all the major operations on the table</w:t>
+      </w:r>
+    </w:p>
+    <w:p>
+      <w:pPr>
+        <w:pStyle w:val="ListParagraph"/>
+        <w:numPr>
+          <w:ilvl w:val="0"/>
+          <w:numId w:val="27"/>
+        </w:numPr>
+      </w:pPr>
+      <w:r>
+        <w:t>Writing query is limited</w:t>
+      </w:r>
+    </w:p>
+    <w:p>
+      <w:pPr>
+        <w:pStyle w:val="ListParagraph"/>
+        <w:numPr>
+          <w:ilvl w:val="0"/>
+          <w:numId w:val="27"/>
+        </w:numPr>
+      </w:pPr>
+      <w:r>
+        <w:t>Takes care of converting Java objects to the SQL data &amp; vice-versa, i.e., you don’t have transform ResultSet to Java object or Java object to SQL data</w:t>
+      </w:r>
+    </w:p>
+    <w:p>
+      <w:pPr>
+        <w:pStyle w:val="ListParagraph"/>
+        <w:numPr>
+          <w:ilvl w:val="0"/>
+          <w:numId w:val="27"/>
+        </w:numPr>
+      </w:pPr>
+      <w:r>
+        <w:t>You don’t have to handle exceptions like SQLException | ClassNotFoundException</w:t>
+      </w:r>
+    </w:p>
+    <w:p>
+      <w:pPr>
+        <w:pStyle w:val="ListParagraph"/>
+        <w:numPr>
+          <w:ilvl w:val="0"/>
+          <w:numId w:val="27"/>
+        </w:numPr>
+      </w:pPr>
+      <w:r>
+        <w:t>Complex Join queries are not required when you want to JOIN two tables you have annotations to take care of Joining</w:t>
+      </w:r>
+    </w:p>
+    <w:p>
+      <w:pPr>
+        <w:pStyle w:val="ListParagraph"/>
+        <w:numPr>
+          <w:ilvl w:val="0"/>
+          <w:numId w:val="27"/>
+        </w:numPr>
+      </w:pPr>
+      <w:r>
+        <w:t>Separates DB configurations form the Code so that it will be easier to maintain.</w:t>
+      </w:r>
+    </w:p>
+    <w:p>
+      <w:pPr>
+        <w:pStyle w:val="ListParagraph"/>
+        <w:numPr>
+          <w:ilvl w:val="0"/>
+          <w:numId w:val="27"/>
+        </w:numPr>
+      </w:pPr>
+      <w:r>
+        <w:t>Takes care of establishing connection &amp; closing the connections</w:t>
+      </w:r>
+      <w:r>
+        <w:t>, the application just need to reuse the connections from the connection pool</w:t>
+      </w:r>
+    </w:p>
+    <w:p>
+      <w:pPr>
+        <w:ind w:left="0" w:firstLine="0"/>
+      </w:pPr>
+      <w:r>
+        <w:t xml:space="preserve">Hibernate uses a configuration file called </w:t>
+      </w:r>
+      <w:r>
+        <w:rPr>
+          <w:color w:val="EE0000"/>
+        </w:rPr>
+        <w:t xml:space="preserve">hibernate.cfg.xml </w:t>
+      </w:r>
+      <w:r>
+        <w:t>which keeps all the database credentials in the XML so that you can complete separate DB configurations from the application code</w:t>
+      </w:r>
+    </w:p>
+    <w:p>
+      <w:pPr>
+        <w:ind w:left="0" w:firstLine="0"/>
+      </w:pPr>
+    </w:p>
+    <w:p>
+      <w:pPr>
+        <w:ind w:left="0" w:firstLine="0"/>
+      </w:pPr>
+      <w:r>
+        <w:rPr>
+          <w:highlight w:val="yellow"/>
+        </w:rPr>
+        <w:t>Requirements</w:t>
+      </w:r>
+    </w:p>
+    <w:p>
+      <w:pPr>
+        <w:pStyle w:val="ListParagraph"/>
+        <w:numPr>
+          <w:ilvl w:val="0"/>
+          <w:numId w:val="28"/>
+        </w:numPr>
+      </w:pPr>
+      <w:r>
+        <w:t>Hibernate libraries</w:t>
+      </w:r>
+    </w:p>
+    <w:p>
+      <w:pPr>
+        <w:pStyle w:val="ListParagraph"/>
+        <w:numPr>
+          <w:ilvl w:val="0"/>
+          <w:numId w:val="28"/>
+        </w:numPr>
+      </w:pPr>
+      <w:r>
+        <w:lastRenderedPageBreak/>
+        <w:t>MYSQL library</w:t>
+      </w:r>
+    </w:p>
+    <w:p>
+      <w:pPr>
+        <w:pStyle w:val="ListParagraph"/>
+        <w:numPr>
+          <w:ilvl w:val="0"/>
+          <w:numId w:val="28"/>
+        </w:numPr>
+      </w:pPr>
+      <w:r>
+        <w:t>hibernate.cfg.xml</w:t>
+      </w:r>
+    </w:p>
+    <w:p>
+      <w:pPr>
+        <w:ind w:left="0" w:firstLine="0"/>
+      </w:pPr>
+    </w:p>
+    <w:p>
+      <w:pPr>
+        <w:ind w:left="0" w:firstLine="0"/>
+      </w:pPr>
+      <w:r>
+        <w:t>Configuration cfg = new Configuration(); // reads hibernate.cfg.xml</w:t>
+      </w:r>
+    </w:p>
+    <w:p>
+      <w:pPr>
+        <w:ind w:left="0" w:firstLine="0"/>
+      </w:pPr>
+      <w:r>
+        <w:t xml:space="preserve">cfg.configure(); </w:t>
+      </w:r>
+      <w:r>
+        <w:t>// loads the configuration &amp; creates he session factory (connection pool)</w:t>
+      </w:r>
+    </w:p>
+    <w:p>
+      <w:pPr>
+        <w:ind w:left="0" w:firstLine="0"/>
+      </w:pPr>
+      <w:r>
+        <w:t xml:space="preserve">SessionFactory factory = cfg.buildSessionFactory(); // uses the connection pool </w:t>
+      </w:r>
+    </w:p>
+    <w:p>
+      <w:pPr>
+        <w:ind w:left="0" w:firstLine="0"/>
+      </w:pPr>
+      <w:r>
+        <w:t>Session session = factory.openSession(); // session can do CRUD operations</w:t>
+      </w:r>
+    </w:p>
+    <w:p>
+      <w:pPr>
+        <w:ind w:left="0" w:firstLine="0"/>
+      </w:pPr>
+      <w:r>
+        <w:t>Transaction trans = session.</w:t>
+      </w:r>
+      <w:r>
+        <w:t>begin</w:t>
+      </w:r>
+      <w:r>
+        <w:t>Transaction(); // if you are updating the table</w:t>
+      </w:r>
+      <w:r>
+        <w:br/>
+        <w:t>session.save(obj); // to save data</w:t>
+      </w:r>
+      <w:r>
+        <w:br/>
+        <w:t>session.delete(100); // to delete</w:t>
+      </w:r>
+      <w:r>
+        <w:br/>
+        <w:t>session.update(obj); // to update data</w:t>
+      </w:r>
+      <w:r>
+        <w:br/>
+        <w:t>session.get(Employee.class, 100);</w:t>
+      </w:r>
+      <w:r>
+        <w:br/>
+        <w:t>trans.commit(); // to save the changes -</w:t>
+      </w:r>
+    </w:p>
+    <w:p>
+      <w:pPr>
+        <w:ind w:left="0" w:firstLine="0"/>
+      </w:pPr>
+    </w:p>
+    <w:p>
+      <w:pPr>
+        <w:ind w:left="0" w:firstLine="0"/>
+      </w:pPr>
+    </w:p>
+    <w:p>
+      <w:pPr>
+        <w:ind w:left="0" w:firstLine="0"/>
+      </w:pPr>
+      <w:r>
+        <w:rPr>
+          <w:noProof/>
+        </w:rPr>
+        <w:drawing>
+          <wp:inline distT="0" distB="0" distL="0" distR="0" wp14:anchorId="034202D1" wp14:editId="6E019E7E">
+            <wp:extent cx="5943600" cy="3007360"/>
+            <wp:effectExtent l="0" t="0" r="0" b="2540"/>
+            <wp:docPr id="476409259" name="Picture 1"/>
+            <wp:cNvGraphicFramePr>
+              <a:graphicFrameLocks xmlns:a="http://schemas.openxmlformats.org/drawingml/2006/main" noChangeAspect="1"/>
+            </wp:cNvGraphicFramePr>
+            <a:graphic xmlns:a="http://schemas.openxmlformats.org/drawingml/2006/main">
+              <a:graphicData uri="http://schemas.openxmlformats.org/drawingml/2006/picture">
+                <pic:pic xmlns:pic="http://schemas.openxmlformats.org/drawingml/2006/picture">
+                  <pic:nvPicPr>
+                    <pic:cNvPr id="476409259" name=""/>
+                    <pic:cNvPicPr/>
+                  </pic:nvPicPr>
+                  <pic:blipFill>
+                    <a:blip r:embed="rId39"/>
+                    <a:stretch>
+                      <a:fillRect/>
+                    </a:stretch>
+                  </pic:blipFill>
+                  <pic:spPr>
+                    <a:xfrm>
+                      <a:off x="0" y="0"/>
+                      <a:ext cx="5943600" cy="3007360"/>
+                    </a:xfrm>
+                    <a:prstGeom prst="rect">
+                      <a:avLst/>
+                    </a:prstGeom>
+                  </pic:spPr>
+                </pic:pic>
+              </a:graphicData>
+            </a:graphic>
+          </wp:inline>
+        </w:drawing>
+      </w:r>
+    </w:p>
+    <w:p>
+      <w:pPr>
+        <w:ind w:left="0" w:firstLine="0"/>
+      </w:pPr>
+      <w:r>
+        <w:rPr>
+          <w:highlight w:val="yellow"/>
+        </w:rPr>
+        <w:lastRenderedPageBreak/>
+        <w:t>Inheritance Mapping</w:t>
+      </w:r>
+    </w:p>
+    <w:p>
+      <w:pPr>
+        <w:ind w:left="0" w:firstLine="0"/>
+      </w:pPr>
+      <w:r>
+        <w:t>It is a type of mapping between the classes and tables to understand how the tables are designed, there are 3 strategies in inheritance mapping</w:t>
+      </w:r>
+    </w:p>
+    <w:p>
+      <w:pPr>
+        <w:ind w:left="0" w:firstLine="0"/>
+      </w:pPr>
+      <w:r>
+        <w:drawing>
+          <wp:inline distT="0" distB="0" distL="0" distR="0" wp14:anchorId="75798229" wp14:editId="51836384">
+            <wp:extent cx="5806943" cy="2530059"/>
+            <wp:effectExtent l="0" t="0" r="3810" b="3810"/>
+            <wp:docPr id="377753205" name="Picture 1"/>
+            <wp:cNvGraphicFramePr>
+              <a:graphicFrameLocks xmlns:a="http://schemas.openxmlformats.org/drawingml/2006/main" noChangeAspect="1"/>
+            </wp:cNvGraphicFramePr>
+            <a:graphic xmlns:a="http://schemas.openxmlformats.org/drawingml/2006/main">
+              <a:graphicData uri="http://schemas.openxmlformats.org/drawingml/2006/picture">
+                <pic:pic xmlns:pic="http://schemas.openxmlformats.org/drawingml/2006/picture">
+                  <pic:nvPicPr>
+                    <pic:cNvPr id="377753205" name=""/>
+                    <pic:cNvPicPr/>
+                  </pic:nvPicPr>
+                  <pic:blipFill>
+                    <a:blip r:embed="rId40"/>
+                    <a:stretch>
+                      <a:fillRect/>
+                    </a:stretch>
+                  </pic:blipFill>
+                  <pic:spPr>
+                    <a:xfrm>
+                      <a:off x="0" y="0"/>
+                      <a:ext cx="5806943" cy="2530059"/>
+                    </a:xfrm>
+                    <a:prstGeom prst="rect">
+                      <a:avLst/>
+                    </a:prstGeom>
+                  </pic:spPr>
+                </pic:pic>
+              </a:graphicData>
+            </a:graphic>
+          </wp:inline>
+        </w:drawing>
+      </w:r>
+    </w:p>
+    <w:p>
+      <w:pPr>
+        <w:pStyle w:val="ListParagraph"/>
+        <w:numPr>
+          <w:ilvl w:val="0"/>
+          <w:numId w:val="29"/>
+        </w:numPr>
+      </w:pPr>
+      <w:r>
+        <w:t xml:space="preserve">Table per class: for each class a </w:t>
+      </w:r>
+      <w:r>
+        <w:t>distinct</w:t>
+      </w:r>
+      <w:r>
+        <w:t xml:space="preserve"> table is available, each table will have </w:t>
+      </w:r>
+      <w:r>
+        <w:t>columns required for that entity including inherited properties</w:t>
+      </w:r>
+      <w:r>
+        <w:t xml:space="preserve"> - this is not normalized we usually avoid, but its available in case legacy system are using redundant columns </w:t>
+      </w:r>
+    </w:p>
+    <w:p>
+      <w:pPr>
+        <w:pStyle w:val="ListParagraph"/>
+        <w:numPr>
+          <w:ilvl w:val="0"/>
+          <w:numId w:val="29"/>
+        </w:numPr>
+      </w:pPr>
+      <w:r>
+        <w:t>Table per subclass</w:t>
+      </w:r>
+      <w:r>
+        <w:t xml:space="preserve"> / JOINED</w:t>
+      </w:r>
+      <w:r>
+        <w:t xml:space="preserve">: here you will have table for each class but redundancy wouldn’t be there i.e., </w:t>
+      </w:r>
+      <w:r>
+        <w:t>subclass table will have only those columns present in the class</w:t>
+      </w:r>
+      <w:r>
+        <w:t xml:space="preserve"> and parent class primary key column will be present in each subclass table</w:t>
+      </w:r>
+    </w:p>
+    <w:p>
+      <w:pPr>
+        <w:pStyle w:val="ListParagraph"/>
+        <w:numPr>
+          <w:ilvl w:val="0"/>
+          <w:numId w:val="29"/>
+        </w:numPr>
+      </w:pPr>
+      <w:r>
+        <w:t>Table per hierarchy: here a single table maintains all the class data, subclass columns will be created in the parent table itself</w:t>
+      </w:r>
+      <w:r>
+        <w:t xml:space="preserve"> </w:t>
+      </w:r>
+    </w:p>
+    <w:p>
+      <w:pPr>
+        <w:ind w:left="0" w:firstLine="0"/>
+      </w:pPr>
+      <w:r>
+        <w:lastRenderedPageBreak/>
+        <w:drawing>
+          <wp:inline distT="0" distB="0" distL="0" distR="0" wp14:anchorId="0E31ABC3" wp14:editId="43F2DA5C">
+            <wp:extent cx="5943600" cy="2362835"/>
+            <wp:effectExtent l="0" t="0" r="0" b="0"/>
+            <wp:docPr id="474039810" name="Picture 1"/>
+            <wp:cNvGraphicFramePr>
+              <a:graphicFrameLocks xmlns:a="http://schemas.openxmlformats.org/drawingml/2006/main" noChangeAspect="1"/>
+            </wp:cNvGraphicFramePr>
+            <a:graphic xmlns:a="http://schemas.openxmlformats.org/drawingml/2006/main">
+              <a:graphicData uri="http://schemas.openxmlformats.org/drawingml/2006/picture">
+                <pic:pic xmlns:pic="http://schemas.openxmlformats.org/drawingml/2006/picture">
+                  <pic:nvPicPr>
+                    <pic:cNvPr id="474039810" name=""/>
+                    <pic:cNvPicPr/>
+                  </pic:nvPicPr>
+                  <pic:blipFill>
+                    <a:blip r:embed="rId41"/>
+                    <a:stretch>
+                      <a:fillRect/>
+                    </a:stretch>
+                  </pic:blipFill>
+                  <pic:spPr>
+                    <a:xfrm>
+                      <a:off x="0" y="0"/>
+                      <a:ext cx="5943600" cy="2362835"/>
+                    </a:xfrm>
+                    <a:prstGeom prst="rect">
+                      <a:avLst/>
+                    </a:prstGeom>
+                  </pic:spPr>
+                </pic:pic>
+              </a:graphicData>
+            </a:graphic>
+          </wp:inline>
+        </w:drawing>
+      </w:r>
+    </w:p>
+    <w:p>
+      <w:pPr>
+        <w:ind w:left="0" w:firstLine="0"/>
+      </w:pPr>
+    </w:p>
+    <w:p>
+      <w:pPr>
+        <w:ind w:left="0" w:firstLine="0"/>
+      </w:pPr>
+      <w:r>
+        <w:rPr>
+          <w:highlight w:val="yellow"/>
+        </w:rPr>
+        <w:t>Table per class</w:t>
+      </w:r>
+    </w:p>
+    <w:p>
+      <w:pPr>
+        <w:ind w:left="0" w:firstLine="0"/>
+      </w:pPr>
+      <w:r>
+        <w:drawing>
+          <wp:inline distT="0" distB="0" distL="0" distR="0" wp14:anchorId="70095720" wp14:editId="3330E6C5">
+            <wp:extent cx="5943600" cy="4592320"/>
+            <wp:effectExtent l="0" t="0" r="0" b="0"/>
+            <wp:docPr id="385892945" name="Picture 1"/>
+            <wp:cNvGraphicFramePr>
+              <a:graphicFrameLocks xmlns:a="http://schemas.openxmlformats.org/drawingml/2006/main" noChangeAspect="1"/>
+            </wp:cNvGraphicFramePr>
+            <a:graphic xmlns:a="http://schemas.openxmlformats.org/drawingml/2006/main">
+              <a:graphicData uri="http://schemas.openxmlformats.org/drawingml/2006/picture">
+                <pic:pic xmlns:pic="http://schemas.openxmlformats.org/drawingml/2006/picture">
+                  <pic:nvPicPr>
+                    <pic:cNvPr id="385892945" name=""/>
+                    <pic:cNvPicPr/>
+                  </pic:nvPicPr>
+                  <pic:blipFill>
+                    <a:blip r:embed="rId42"/>
+                    <a:stretch>
+                      <a:fillRect/>
+                    </a:stretch>
+                  </pic:blipFill>
+                  <pic:spPr>
+                    <a:xfrm>
+                      <a:off x="0" y="0"/>
+                      <a:ext cx="5943600" cy="4592320"/>
+                    </a:xfrm>
+                    <a:prstGeom prst="rect">
+                      <a:avLst/>
+                    </a:prstGeom>
+                  </pic:spPr>
+                </pic:pic>
+              </a:graphicData>
+            </a:graphic>
+          </wp:inline>
+        </w:drawing>
+      </w:r>
+    </w:p>
+    <w:p>
+      <w:pPr>
+        <w:ind w:left="0" w:firstLine="0"/>
+      </w:pPr>
+    </w:p>
+    <w:p>
+      <w:pPr>
+        <w:ind w:left="0" w:firstLine="0"/>
+      </w:pPr>
+      <w:r>
+        <w:rPr>
+          <w:highlight w:val="yellow"/>
+        </w:rPr>
+        <w:t>Table per subclass</w:t>
+      </w:r>
+    </w:p>
+    <w:p>
+      <w:pPr>
+        <w:ind w:left="0" w:firstLine="0"/>
+      </w:pPr>
+      <w:r>
+        <w:drawing>
+          <wp:inline distT="0" distB="0" distL="0" distR="0" wp14:anchorId="5010013C" wp14:editId="3EEC3E3D">
+            <wp:extent cx="5943600" cy="4535805"/>
+            <wp:effectExtent l="0" t="0" r="0" b="0"/>
+            <wp:docPr id="459965685" name="Picture 1"/>
+            <wp:cNvGraphicFramePr>
+              <a:graphicFrameLocks xmlns:a="http://schemas.openxmlformats.org/drawingml/2006/main" noChangeAspect="1"/>
+            </wp:cNvGraphicFramePr>
+            <a:graphic xmlns:a="http://schemas.openxmlformats.org/drawingml/2006/main">
+              <a:graphicData uri="http://schemas.openxmlformats.org/drawingml/2006/picture">
+                <pic:pic xmlns:pic="http://schemas.openxmlformats.org/drawingml/2006/picture">
+                  <pic:nvPicPr>
+                    <pic:cNvPr id="459965685" name=""/>
+                    <pic:cNvPicPr/>
+                  </pic:nvPicPr>
+                  <pic:blipFill>
+                    <a:blip r:embed="rId43"/>
+                    <a:stretch>
+                      <a:fillRect/>
+                    </a:stretch>
+                  </pic:blipFill>
+                  <pic:spPr>
+                    <a:xfrm>
+                      <a:off x="0" y="0"/>
+                      <a:ext cx="5943600" cy="4535805"/>
+                    </a:xfrm>
+                    <a:prstGeom prst="rect">
+                      <a:avLst/>
+                    </a:prstGeom>
+                  </pic:spPr>
+                </pic:pic>
+              </a:graphicData>
+            </a:graphic>
+          </wp:inline>
+        </w:drawing>
+      </w:r>
+    </w:p>
+    <w:p>
+      <w:pPr>
+        <w:ind w:left="0" w:firstLine="0"/>
+      </w:pPr>
+      <w:r>
+        <w:rPr>
+          <w:highlight w:val="yellow"/>
+        </w:rPr>
+        <w:t>Subclasses will have @PrimaryKeyJoinColumn</w:t>
+      </w:r>
+    </w:p>
+    <w:p>
+      <w:pPr>
+        <w:ind w:left="0" w:firstLine="0"/>
+      </w:pPr>
+      <w:r>
+        <w:lastRenderedPageBreak/>
+        <w:drawing>
+          <wp:inline distT="0" distB="0" distL="0" distR="0" wp14:anchorId="4CFB734C" wp14:editId="71ABDC97">
+            <wp:extent cx="5943600" cy="3202305"/>
+            <wp:effectExtent l="0" t="0" r="0" b="0"/>
+            <wp:docPr id="1183761029" name="Picture 1"/>
+            <wp:cNvGraphicFramePr>
+              <a:graphicFrameLocks xmlns:a="http://schemas.openxmlformats.org/drawingml/2006/main" noChangeAspect="1"/>
+            </wp:cNvGraphicFramePr>
+            <a:graphic xmlns:a="http://schemas.openxmlformats.org/drawingml/2006/main">
+              <a:graphicData uri="http://schemas.openxmlformats.org/drawingml/2006/picture">
+                <pic:pic xmlns:pic="http://schemas.openxmlformats.org/drawingml/2006/picture">
+                  <pic:nvPicPr>
+                    <pic:cNvPr id="1183761029" name=""/>
+                    <pic:cNvPicPr/>
+                  </pic:nvPicPr>
+                  <pic:blipFill>
+                    <a:blip r:embed="rId44"/>
+                    <a:stretch>
+                      <a:fillRect/>
+                    </a:stretch>
+                  </pic:blipFill>
+                  <pic:spPr>
+                    <a:xfrm>
+                      <a:off x="0" y="0"/>
+                      <a:ext cx="5943600" cy="3202305"/>
+                    </a:xfrm>
+                    <a:prstGeom prst="rect">
+                      <a:avLst/>
+                    </a:prstGeom>
+                  </pic:spPr>
+                </pic:pic>
+              </a:graphicData>
+            </a:graphic>
+          </wp:inline>
+        </w:drawing>
+      </w:r>
+    </w:p>
+    <w:p>
+      <w:pPr>
+        <w:ind w:left="0" w:firstLine="0"/>
+      </w:pPr>
+      <w:r>
+        <w:lastRenderedPageBreak/>
+        <w:drawing>
+          <wp:inline distT="0" distB="0" distL="0" distR="0" wp14:anchorId="12C2DE3B" wp14:editId="28758A41">
+            <wp:extent cx="5943600" cy="5162550"/>
+            <wp:effectExtent l="0" t="0" r="0" b="0"/>
+            <wp:docPr id="1918142072" name="Picture 1"/>
+            <wp:cNvGraphicFramePr>
+              <a:graphicFrameLocks xmlns:a="http://schemas.openxmlformats.org/drawingml/2006/main" noChangeAspect="1"/>
+            </wp:cNvGraphicFramePr>
+            <a:graphic xmlns:a="http://schemas.openxmlformats.org/drawingml/2006/main">
+              <a:graphicData uri="http://schemas.openxmlformats.org/drawingml/2006/picture">
+                <pic:pic xmlns:pic="http://schemas.openxmlformats.org/drawingml/2006/picture">
+                  <pic:nvPicPr>
+                    <pic:cNvPr id="1918142072" name=""/>
+                    <pic:cNvPicPr/>
+                  </pic:nvPicPr>
+                  <pic:blipFill>
+                    <a:blip r:embed="rId45"/>
+                    <a:stretch>
+                      <a:fillRect/>
+                    </a:stretch>
+                  </pic:blipFill>
+                  <pic:spPr>
+                    <a:xfrm>
+                      <a:off x="0" y="0"/>
+                      <a:ext cx="5943600" cy="5162550"/>
+                    </a:xfrm>
+                    <a:prstGeom prst="rect">
+                      <a:avLst/>
+                    </a:prstGeom>
+                  </pic:spPr>
+                </pic:pic>
+              </a:graphicData>
+            </a:graphic>
+          </wp:inline>
+        </w:drawing>
+      </w:r>
+    </w:p>
+    <w:p>
+      <w:pPr>
+        <w:ind w:left="0" w:firstLine="0"/>
+      </w:pPr>
+      <w:r>
+        <w:rPr>
+          <w:highlight w:val="yellow"/>
+        </w:rPr>
+        <w:t>Table per hierarchy</w:t>
+      </w:r>
+    </w:p>
+    <w:p>
+      <w:pPr>
+        <w:ind w:left="0" w:firstLine="0"/>
+      </w:pPr>
+      <w:r>
+        <w:t>It uses discriminating column to discriminate the entities</w:t>
+      </w:r>
+    </w:p>
+    <w:p>
+      <w:pPr>
+        <w:ind w:left="0" w:firstLine="0"/>
+      </w:pPr>
+      <w:r>
+        <w:t>@DiscriminatorColumn - use on top of the parent class</w:t>
+      </w:r>
+    </w:p>
+    <w:p>
+      <w:pPr>
+        <w:ind w:left="0" w:firstLine="0"/>
+      </w:pPr>
+      <w:r>
+        <w:t>@DiscriminatorValue - use on top of every entity</w:t>
+      </w:r>
+    </w:p>
+    <w:p>
+      <w:pPr>
+        <w:ind w:left="0" w:firstLine="0"/>
+      </w:pPr>
+    </w:p>
+    <w:p>
+      <w:pPr>
+        <w:ind w:left="0" w:firstLine="0"/>
+      </w:pPr>
+      <w:r>
+        <w:lastRenderedPageBreak/>
+        <w:drawing>
+          <wp:inline distT="0" distB="0" distL="0" distR="0" wp14:anchorId="638F34B5" wp14:editId="3A67CEB4">
+            <wp:extent cx="5943600" cy="4587240"/>
+            <wp:effectExtent l="0" t="0" r="0" b="3810"/>
+            <wp:docPr id="897083921" name="Picture 1"/>
+            <wp:cNvGraphicFramePr>
+              <a:graphicFrameLocks xmlns:a="http://schemas.openxmlformats.org/drawingml/2006/main" noChangeAspect="1"/>
+            </wp:cNvGraphicFramePr>
+            <a:graphic xmlns:a="http://schemas.openxmlformats.org/drawingml/2006/main">
+              <a:graphicData uri="http://schemas.openxmlformats.org/drawingml/2006/picture">
+                <pic:pic xmlns:pic="http://schemas.openxmlformats.org/drawingml/2006/picture">
+                  <pic:nvPicPr>
+                    <pic:cNvPr id="897083921" name=""/>
+                    <pic:cNvPicPr/>
+                  </pic:nvPicPr>
+                  <pic:blipFill>
+                    <a:blip r:embed="rId46"/>
+                    <a:stretch>
+                      <a:fillRect/>
+                    </a:stretch>
+                  </pic:blipFill>
+                  <pic:spPr>
+                    <a:xfrm>
+                      <a:off x="0" y="0"/>
+                      <a:ext cx="5943600" cy="4587240"/>
+                    </a:xfrm>
+                    <a:prstGeom prst="rect">
+                      <a:avLst/>
+                    </a:prstGeom>
+                  </pic:spPr>
+                </pic:pic>
+              </a:graphicData>
+            </a:graphic>
+          </wp:inline>
+        </w:drawing>
+      </w:r>
+    </w:p>
+    <w:p>
+      <w:pPr>
+        <w:ind w:left="0" w:firstLine="0"/>
+      </w:pPr>
+      <w:r>
+        <w:lastRenderedPageBreak/>
+        <w:drawing>
+          <wp:inline distT="0" distB="0" distL="0" distR="0" wp14:anchorId="5FD9697D" wp14:editId="5C27D825">
+            <wp:extent cx="5943600" cy="3598545"/>
+            <wp:effectExtent l="0" t="0" r="0" b="1905"/>
+            <wp:docPr id="700746408" name="Picture 1"/>
+            <wp:cNvGraphicFramePr>
+              <a:graphicFrameLocks xmlns:a="http://schemas.openxmlformats.org/drawingml/2006/main" noChangeAspect="1"/>
+            </wp:cNvGraphicFramePr>
+            <a:graphic xmlns:a="http://schemas.openxmlformats.org/drawingml/2006/main">
+              <a:graphicData uri="http://schemas.openxmlformats.org/drawingml/2006/picture">
+                <pic:pic xmlns:pic="http://schemas.openxmlformats.org/drawingml/2006/picture">
+                  <pic:nvPicPr>
+                    <pic:cNvPr id="700746408" name=""/>
+                    <pic:cNvPicPr/>
+                  </pic:nvPicPr>
+                  <pic:blipFill>
+                    <a:blip r:embed="rId47"/>
+                    <a:stretch>
+                      <a:fillRect/>
+                    </a:stretch>
+                  </pic:blipFill>
+                  <pic:spPr>
+                    <a:xfrm>
+                      <a:off x="0" y="0"/>
+                      <a:ext cx="5943600" cy="3598545"/>
+                    </a:xfrm>
+                    <a:prstGeom prst="rect">
+                      <a:avLst/>
+                    </a:prstGeom>
+                  </pic:spPr>
+                </pic:pic>
+              </a:graphicData>
+            </a:graphic>
+          </wp:inline>
+        </w:drawing>
+      </w:r>
+    </w:p>
+    <w:p>
+      <w:pPr>
+        <w:ind w:left="0" w:firstLine="0"/>
+      </w:pPr>
+      <w:r>
+        <w:drawing>
+          <wp:inline distT="0" distB="0" distL="0" distR="0" wp14:anchorId="61A07A4A" wp14:editId="272D5724">
+            <wp:extent cx="5943600" cy="2486660"/>
+            <wp:effectExtent l="0" t="0" r="0" b="8890"/>
+            <wp:docPr id="825241596" name="Picture 1"/>
+            <wp:cNvGraphicFramePr>
+              <a:graphicFrameLocks xmlns:a="http://schemas.openxmlformats.org/drawingml/2006/main" noChangeAspect="1"/>
+            </wp:cNvGraphicFramePr>
+            <a:graphic xmlns:a="http://schemas.openxmlformats.org/drawingml/2006/main">
+              <a:graphicData uri="http://schemas.openxmlformats.org/drawingml/2006/picture">
+                <pic:pic xmlns:pic="http://schemas.openxmlformats.org/drawingml/2006/picture">
+                  <pic:nvPicPr>
+                    <pic:cNvPr id="825241596" name=""/>
+                    <pic:cNvPicPr/>
+                  </pic:nvPicPr>
+                  <pic:blipFill>
+                    <a:blip r:embed="rId48"/>
+                    <a:stretch>
+                      <a:fillRect/>
+                    </a:stretch>
+                  </pic:blipFill>
+                  <pic:spPr>
+                    <a:xfrm>
+                      <a:off x="0" y="0"/>
+                      <a:ext cx="5943600" cy="2486660"/>
+                    </a:xfrm>
+                    <a:prstGeom prst="rect">
+                      <a:avLst/>
+                    </a:prstGeom>
+                  </pic:spPr>
+                </pic:pic>
+              </a:graphicData>
+            </a:graphic>
+          </wp:inline>
+        </w:drawing>
+      </w:r>
+    </w:p>
+    <w:p>
+      <w:pPr>
+        <w:ind w:left="0" w:firstLine="0"/>
+      </w:pPr>
+      <w:r>
+        <w:rPr>
+          <w:highlight w:val="yellow"/>
+        </w:rPr>
+        <w:t>Association Mapping</w:t>
+      </w:r>
+    </w:p>
+    <w:p>
+      <w:pPr>
+        <w:ind w:left="0" w:firstLine="0"/>
+      </w:pPr>
+      <w:r>
+        <w:t>It helps to join tables and maintain them in java objects or collections so that an application can easily analyze which object is associated with one or more objects</w:t>
+      </w:r>
+      <w:r>
+        <w:br/>
+        <w:t>ex: person has which address object, a</w:t>
+      </w:r>
+      <w:r>
+        <w:t xml:space="preserve"> </w:t>
+      </w:r>
+      <w:r>
+        <w:t>particular</w:t>
+      </w:r>
+      <w:r>
+        <w:t xml:space="preserve"> department has how many employees</w:t>
+      </w:r>
+    </w:p>
+    <w:p>
+      <w:pPr>
+        <w:ind w:left="0" w:firstLine="0"/>
+      </w:pPr>
+      <w:r>
+        <w:t>4 types of association mapping</w:t>
+      </w:r>
+    </w:p>
+    <w:p>
+      <w:pPr>
+        <w:pStyle w:val="ListParagraph"/>
+        <w:numPr>
+          <w:ilvl w:val="0"/>
+          <w:numId w:val="30"/>
+        </w:numPr>
+      </w:pPr>
+      <w:r>
+        <w:lastRenderedPageBreak/>
+        <w:t>one to one</w:t>
+      </w:r>
+      <w:r>
+        <w:t>: One User has One Passport</w:t>
+      </w:r>
+    </w:p>
+    <w:p>
+      <w:pPr>
+        <w:pStyle w:val="ListParagraph"/>
+        <w:numPr>
+          <w:ilvl w:val="0"/>
+          <w:numId w:val="30"/>
+        </w:numPr>
+      </w:pPr>
+      <w:r>
+        <w:t>one to many</w:t>
+      </w:r>
+      <w:r>
+        <w:t>: One department has many employees</w:t>
+      </w:r>
+    </w:p>
+    <w:p>
+      <w:pPr>
+        <w:pStyle w:val="ListParagraph"/>
+        <w:numPr>
+          <w:ilvl w:val="0"/>
+          <w:numId w:val="30"/>
+        </w:numPr>
+      </w:pPr>
+      <w:r>
+        <w:t>many to one</w:t>
+      </w:r>
+      <w:r>
+        <w:t xml:space="preserve">: An employee belongs which department </w:t>
+      </w:r>
+    </w:p>
+    <w:p>
+      <w:pPr>
+        <w:pStyle w:val="ListParagraph"/>
+        <w:numPr>
+          <w:ilvl w:val="0"/>
+          <w:numId w:val="30"/>
+        </w:numPr>
+      </w:pPr>
+      <w:r>
+        <w:t>many to many</w:t>
+      </w:r>
+      <w:r>
+        <w:t xml:space="preserve">: One Student registers to multiple Course and One Course is registered by Multiple Students  </w:t>
+      </w:r>
+    </w:p>
+    <w:p>
+      <w:pPr>
+        <w:ind w:left="0" w:firstLine="0"/>
+      </w:pPr>
+      <w:r>
+        <w:t xml:space="preserve">In JPA we have annotation that simplify joining tables </w:t>
+      </w:r>
+    </w:p>
+    <w:p>
+      <w:pPr>
+        <w:pStyle w:val="ListParagraph"/>
+        <w:numPr>
+          <w:ilvl w:val="0"/>
+          <w:numId w:val="31"/>
+        </w:numPr>
+      </w:pPr>
+      <w:r>
+        <w:t>@OneToOne</w:t>
+      </w:r>
+    </w:p>
+    <w:p>
+      <w:pPr>
+        <w:pStyle w:val="ListParagraph"/>
+        <w:numPr>
+          <w:ilvl w:val="0"/>
+          <w:numId w:val="31"/>
+        </w:numPr>
+      </w:pPr>
+      <w:r>
+        <w:t>@OneToMany</w:t>
+      </w:r>
+    </w:p>
+    <w:p>
+      <w:pPr>
+        <w:pStyle w:val="ListParagraph"/>
+        <w:numPr>
+          <w:ilvl w:val="0"/>
+          <w:numId w:val="31"/>
+        </w:numPr>
+      </w:pPr>
+      <w:r>
+        <w:t>@ManyToOne</w:t>
+      </w:r>
+    </w:p>
+    <w:p>
+      <w:pPr>
+        <w:pStyle w:val="ListParagraph"/>
+        <w:numPr>
+          <w:ilvl w:val="0"/>
+          <w:numId w:val="31"/>
+        </w:numPr>
+      </w:pPr>
+      <w:r>
+        <w:t>@ManyToMany</w:t>
+      </w:r>
+    </w:p>
+    <w:p>
+      <w:pPr>
+        <w:ind w:left="0" w:firstLine="0"/>
+      </w:pPr>
+      <w:r>
+        <w:drawing>
+          <wp:inline distT="0" distB="0" distL="0" distR="0" wp14:anchorId="44193BAD" wp14:editId="71D60890">
+            <wp:extent cx="5943600" cy="3363595"/>
+            <wp:effectExtent l="0" t="0" r="0" b="8255"/>
+            <wp:docPr id="1400559979" name="Picture 1"/>
+            <wp:cNvGraphicFramePr>
+              <a:graphicFrameLocks xmlns:a="http://schemas.openxmlformats.org/drawingml/2006/main" noChangeAspect="1"/>
+            </wp:cNvGraphicFramePr>
+            <a:graphic xmlns:a="http://schemas.openxmlformats.org/drawingml/2006/main">
+              <a:graphicData uri="http://schemas.openxmlformats.org/drawingml/2006/picture">
+                <pic:pic xmlns:pic="http://schemas.openxmlformats.org/drawingml/2006/picture">
+                  <pic:nvPicPr>
+                    <pic:cNvPr id="1400559979" name=""/>
+                    <pic:cNvPicPr/>
+                  </pic:nvPicPr>
+                  <pic:blipFill>
+                    <a:blip r:embed="rId49"/>
+                    <a:stretch>
+                      <a:fillRect/>
+                    </a:stretch>
+                  </pic:blipFill>
+                  <pic:spPr>
+                    <a:xfrm>
+                      <a:off x="0" y="0"/>
+                      <a:ext cx="5943600" cy="3363595"/>
+                    </a:xfrm>
+                    <a:prstGeom prst="rect">
+                      <a:avLst/>
+                    </a:prstGeom>
+                  </pic:spPr>
+                </pic:pic>
+              </a:graphicData>
+            </a:graphic>
+          </wp:inline>
+        </w:drawing>
+      </w:r>
+    </w:p>
+    <w:p>
+      <w:pPr>
+        <w:ind w:left="0" w:firstLine="0"/>
+      </w:pPr>
+      <w:r>
+        <w:lastRenderedPageBreak/>
+        <w:drawing>
+          <wp:inline distT="0" distB="0" distL="0" distR="0" wp14:anchorId="1867ECE9" wp14:editId="41C0B4BE">
+            <wp:extent cx="5943600" cy="4505960"/>
+            <wp:effectExtent l="0" t="0" r="0" b="8890"/>
+            <wp:docPr id="1600710631" name="Picture 1"/>
+            <wp:cNvGraphicFramePr>
+              <a:graphicFrameLocks xmlns:a="http://schemas.openxmlformats.org/drawingml/2006/main" noChangeAspect="1"/>
+            </wp:cNvGraphicFramePr>
+            <a:graphic xmlns:a="http://schemas.openxmlformats.org/drawingml/2006/main">
+              <a:graphicData uri="http://schemas.openxmlformats.org/drawingml/2006/picture">
+                <pic:pic xmlns:pic="http://schemas.openxmlformats.org/drawingml/2006/picture">
+                  <pic:nvPicPr>
+                    <pic:cNvPr id="1600710631" name=""/>
+                    <pic:cNvPicPr/>
+                  </pic:nvPicPr>
+                  <pic:blipFill>
+                    <a:blip r:embed="rId50"/>
+                    <a:stretch>
+                      <a:fillRect/>
+                    </a:stretch>
+                  </pic:blipFill>
+                  <pic:spPr>
+                    <a:xfrm>
+                      <a:off x="0" y="0"/>
+                      <a:ext cx="5943600" cy="4505960"/>
+                    </a:xfrm>
+                    <a:prstGeom prst="rect">
+                      <a:avLst/>
+                    </a:prstGeom>
+                  </pic:spPr>
+                </pic:pic>
+              </a:graphicData>
+            </a:graphic>
+          </wp:inline>
+        </w:drawing>
+      </w:r>
+    </w:p>
+    <w:p>
+      <w:pPr>
+        <w:ind w:left="0" w:firstLine="0"/>
+      </w:pPr>
+      <w:r>
+        <w:rPr>
+          <w:highlight w:val="yellow"/>
+        </w:rPr>
+        <w:t>adding one to one inside passport</w:t>
+      </w:r>
+    </w:p>
+    <w:p>
+      <w:pPr>
+        <w:ind w:left="0" w:firstLine="0"/>
+      </w:pPr>
+      <w:r>
+        <w:drawing>
+          <wp:inline distT="0" distB="0" distL="0" distR="0" wp14:anchorId="6F2A71A9" wp14:editId="6AB711F9">
+            <wp:extent cx="5943600" cy="3068955"/>
+            <wp:effectExtent l="0" t="0" r="0" b="0"/>
+            <wp:docPr id="2063163721" name="Picture 1"/>
+            <wp:cNvGraphicFramePr>
+              <a:graphicFrameLocks xmlns:a="http://schemas.openxmlformats.org/drawingml/2006/main" noChangeAspect="1"/>
+            </wp:cNvGraphicFramePr>
+            <a:graphic xmlns:a="http://schemas.openxmlformats.org/drawingml/2006/main">
+              <a:graphicData uri="http://schemas.openxmlformats.org/drawingml/2006/picture">
+                <pic:pic xmlns:pic="http://schemas.openxmlformats.org/drawingml/2006/picture">
+                  <pic:nvPicPr>
+                    <pic:cNvPr id="2063163721" name=""/>
+                    <pic:cNvPicPr/>
+                  </pic:nvPicPr>
+                  <pic:blipFill>
+                    <a:blip r:embed="rId51"/>
+                    <a:stretch>
+                      <a:fillRect/>
+                    </a:stretch>
+                  </pic:blipFill>
+                  <pic:spPr>
+                    <a:xfrm>
+                      <a:off x="0" y="0"/>
+                      <a:ext cx="5943600" cy="3068955"/>
+                    </a:xfrm>
+                    <a:prstGeom prst="rect">
+                      <a:avLst/>
+                    </a:prstGeom>
+                  </pic:spPr>
+                </pic:pic>
+              </a:graphicData>
+            </a:graphic>
+          </wp:inline>
+        </w:drawing>
+      </w:r>
+    </w:p>
+    <w:p>
+      <w:pPr>
+        <w:ind w:left="0" w:firstLine="0"/>
+      </w:pPr>
+      <w:r>
+        <w:lastRenderedPageBreak/>
+        <w:drawing>
+          <wp:inline distT="0" distB="0" distL="0" distR="0" wp14:anchorId="3D871E89" wp14:editId="5F94B4B0">
+            <wp:extent cx="5943600" cy="3335020"/>
+            <wp:effectExtent l="0" t="0" r="0" b="0"/>
+            <wp:docPr id="470540242" name="Picture 1"/>
+            <wp:cNvGraphicFramePr>
+              <a:graphicFrameLocks xmlns:a="http://schemas.openxmlformats.org/drawingml/2006/main" noChangeAspect="1"/>
+            </wp:cNvGraphicFramePr>
+            <a:graphic xmlns:a="http://schemas.openxmlformats.org/drawingml/2006/main">
+              <a:graphicData uri="http://schemas.openxmlformats.org/drawingml/2006/picture">
+                <pic:pic xmlns:pic="http://schemas.openxmlformats.org/drawingml/2006/picture">
+                  <pic:nvPicPr>
+                    <pic:cNvPr id="470540242" name=""/>
+                    <pic:cNvPicPr/>
+                  </pic:nvPicPr>
+                  <pic:blipFill>
+                    <a:blip r:embed="rId52"/>
+                    <a:stretch>
+                      <a:fillRect/>
+                    </a:stretch>
+                  </pic:blipFill>
+                  <pic:spPr>
+                    <a:xfrm>
+                      <a:off x="0" y="0"/>
+                      <a:ext cx="5943600" cy="3335020"/>
+                    </a:xfrm>
+                    <a:prstGeom prst="rect">
+                      <a:avLst/>
+                    </a:prstGeom>
+                  </pic:spPr>
+                </pic:pic>
+              </a:graphicData>
+            </a:graphic>
+          </wp:inline>
+        </w:drawing>
+      </w:r>
+    </w:p>
+    <w:p>
+      <w:pPr>
+        <w:ind w:left="0" w:firstLine="0"/>
+      </w:pPr>
+      <w:r>
+        <w:drawing>
+          <wp:inline distT="0" distB="0" distL="0" distR="0" wp14:anchorId="1AFC949A" wp14:editId="248F034E">
+            <wp:extent cx="5943600" cy="3594100"/>
+            <wp:effectExtent l="0" t="0" r="0" b="6350"/>
+            <wp:docPr id="378528627" name="Picture 1"/>
+            <wp:cNvGraphicFramePr>
+              <a:graphicFrameLocks xmlns:a="http://schemas.openxmlformats.org/drawingml/2006/main" noChangeAspect="1"/>
+            </wp:cNvGraphicFramePr>
+            <a:graphic xmlns:a="http://schemas.openxmlformats.org/drawingml/2006/main">
+              <a:graphicData uri="http://schemas.openxmlformats.org/drawingml/2006/picture">
+                <pic:pic xmlns:pic="http://schemas.openxmlformats.org/drawingml/2006/picture">
+                  <pic:nvPicPr>
+                    <pic:cNvPr id="378528627" name=""/>
+                    <pic:cNvPicPr/>
+                  </pic:nvPicPr>
+                  <pic:blipFill>
+                    <a:blip r:embed="rId53"/>
+                    <a:stretch>
+                      <a:fillRect/>
+                    </a:stretch>
+                  </pic:blipFill>
+                  <pic:spPr>
+                    <a:xfrm>
+                      <a:off x="0" y="0"/>
+                      <a:ext cx="5943600" cy="3594100"/>
+                    </a:xfrm>
+                    <a:prstGeom prst="rect">
+                      <a:avLst/>
+                    </a:prstGeom>
+                  </pic:spPr>
+                </pic:pic>
+              </a:graphicData>
+            </a:graphic>
+          </wp:inline>
+        </w:drawing>
+      </w:r>
+    </w:p>
+    <w:p>
+      <w:pPr>
+        <w:ind w:left="0" w:firstLine="0"/>
+      </w:pPr>
+    </w:p>
+    <w:p>
+      <w:pPr>
+        <w:ind w:left="0" w:firstLine="0"/>
+      </w:pPr>
+    </w:p>
+    <w:p>
+      <w:pPr>
+        <w:ind w:left="0" w:firstLine="0"/>
+      </w:pPr>
+      <w:r>
+        <w:rPr>
+          <w:highlight w:val="yellow"/>
+        </w:rPr>
+        <w:lastRenderedPageBreak/>
+        <w:t>Multithreading:</w:t>
+      </w:r>
+    </w:p>
+    <w:p>
+      <w:pPr>
+        <w:ind w:left="0" w:firstLine="0"/>
+      </w:pPr>
+      <w:r>
+        <w:t>A program to perform more than one task at the same time</w:t>
+      </w:r>
+    </w:p>
+    <w:p>
+      <w:pPr>
+        <w:ind w:left="0" w:firstLine="0"/>
+      </w:pPr>
+      <w:r>
+        <w:t>Runnable interface</w:t>
+      </w:r>
+      <w:r>
+        <w:t xml:space="preserve"> - it has one abstract method called run() which is an entry point for the threads</w:t>
+      </w:r>
+    </w:p>
+    <w:p>
+      <w:pPr>
+        <w:ind w:left="0" w:firstLine="0"/>
+      </w:pPr>
+      <w:r>
+        <w:t>Thread class</w:t>
+      </w:r>
+      <w:r>
+        <w:t xml:space="preserve"> - it is used to create and manage the thread objects</w:t>
+      </w:r>
+    </w:p>
+    <w:p>
+      <w:pPr>
+        <w:ind w:left="0" w:firstLine="0"/>
+      </w:pPr>
+    </w:p>
     <w:sectPr>
       <w:pgSz w:w="12240" w:h="15840"/>
       <w:pgMar w:top="1440" w:right="1440" w:bottom="1440" w:left="1440" w:header="720" w:footer="720" w:gutter="0"/>
@@ -4927,6 +6097,184 @@
     </w:lvl>
   </w:abstractNum>
   <w:abstractNum w:abstractNumId="2" w15:restartNumberingAfterBreak="0">
+    <w:nsid w:val="021D4E2B"/>
+    <w:multiLevelType w:val="hybridMultilevel"/>
+    <w:tmpl w:val="BD448468"/>
+    <w:lvl w:ilvl="0" w:tplc="0409000F">
+      <w:start w:val="1"/>
+      <w:numFmt w:val="decimal"/>
+      <w:lvlText w:val="%1."/>
+      <w:lvlJc w:val="left"/>
+      <w:pPr>
+        <w:ind w:left="720" w:hanging="360"/>
+      </w:pPr>
+      <w:rPr>
+        <w:rFonts w:hint="default"/>
+      </w:rPr>
+    </w:lvl>
+    <w:lvl w:ilvl="1" w:tplc="04090019" w:tentative="1">
+      <w:start w:val="1"/>
+      <w:numFmt w:val="lowerLetter"/>
+      <w:lvlText w:val="%2."/>
+      <w:lvlJc w:val="left"/>
+      <w:pPr>
+        <w:ind w:left="1440" w:hanging="360"/>
+      </w:pPr>
+    </w:lvl>
+    <w:lvl w:ilvl="2" w:tplc="0409001B" w:tentative="1">
+      <w:start w:val="1"/>
+      <w:numFmt w:val="lowerRoman"/>
+      <w:lvlText w:val="%3."/>
+      <w:lvlJc w:val="right"/>
+      <w:pPr>
+        <w:ind w:left="2160" w:hanging="180"/>
+      </w:pPr>
+    </w:lvl>
+    <w:lvl w:ilvl="3" w:tplc="0409000F" w:tentative="1">
+      <w:start w:val="1"/>
+      <w:numFmt w:val="decimal"/>
+      <w:lvlText w:val="%4."/>
+      <w:lvlJc w:val="left"/>
+      <w:pPr>
+        <w:ind w:left="2880" w:hanging="360"/>
+      </w:pPr>
+    </w:lvl>
+    <w:lvl w:ilvl="4" w:tplc="04090019" w:tentative="1">
+      <w:start w:val="1"/>
+      <w:numFmt w:val="lowerLetter"/>
+      <w:lvlText w:val="%5."/>
+      <w:lvlJc w:val="left"/>
+      <w:pPr>
+        <w:ind w:left="3600" w:hanging="360"/>
+      </w:pPr>
+    </w:lvl>
+    <w:lvl w:ilvl="5" w:tplc="0409001B" w:tentative="1">
+      <w:start w:val="1"/>
+      <w:numFmt w:val="lowerRoman"/>
+      <w:lvlText w:val="%6."/>
+      <w:lvlJc w:val="right"/>
+      <w:pPr>
+        <w:ind w:left="4320" w:hanging="180"/>
+      </w:pPr>
+    </w:lvl>
+    <w:lvl w:ilvl="6" w:tplc="0409000F" w:tentative="1">
+      <w:start w:val="1"/>
+      <w:numFmt w:val="decimal"/>
+      <w:lvlText w:val="%7."/>
+      <w:lvlJc w:val="left"/>
+      <w:pPr>
+        <w:ind w:left="5040" w:hanging="360"/>
+      </w:pPr>
+    </w:lvl>
+    <w:lvl w:ilvl="7" w:tplc="04090019" w:tentative="1">
+      <w:start w:val="1"/>
+      <w:numFmt w:val="lowerLetter"/>
+      <w:lvlText w:val="%8."/>
+      <w:lvlJc w:val="left"/>
+      <w:pPr>
+        <w:ind w:left="5760" w:hanging="360"/>
+      </w:pPr>
+    </w:lvl>
+    <w:lvl w:ilvl="8" w:tplc="0409001B" w:tentative="1">
+      <w:start w:val="1"/>
+      <w:numFmt w:val="lowerRoman"/>
+      <w:lvlText w:val="%9."/>
+      <w:lvlJc w:val="right"/>
+      <w:pPr>
+        <w:ind w:left="6480" w:hanging="180"/>
+      </w:pPr>
+    </w:lvl>
+  </w:abstractNum>
+  <w:abstractNum w:abstractNumId="3" w15:restartNumberingAfterBreak="0">
+    <w:nsid w:val="038B12F8"/>
+    <w:multiLevelType w:val="hybridMultilevel"/>
+    <w:tmpl w:val="95E2A438"/>
+    <w:lvl w:ilvl="0" w:tplc="0409000F">
+      <w:start w:val="1"/>
+      <w:numFmt w:val="decimal"/>
+      <w:lvlText w:val="%1."/>
+      <w:lvlJc w:val="left"/>
+      <w:pPr>
+        <w:ind w:left="720" w:hanging="360"/>
+      </w:pPr>
+      <w:rPr>
+        <w:rFonts w:hint="default"/>
+      </w:rPr>
+    </w:lvl>
+    <w:lvl w:ilvl="1" w:tplc="04090019" w:tentative="1">
+      <w:start w:val="1"/>
+      <w:numFmt w:val="lowerLetter"/>
+      <w:lvlText w:val="%2."/>
+      <w:lvlJc w:val="left"/>
+      <w:pPr>
+        <w:ind w:left="1440" w:hanging="360"/>
+      </w:pPr>
+    </w:lvl>
+    <w:lvl w:ilvl="2" w:tplc="0409001B" w:tentative="1">
+      <w:start w:val="1"/>
+      <w:numFmt w:val="lowerRoman"/>
+      <w:lvlText w:val="%3."/>
+      <w:lvlJc w:val="right"/>
+      <w:pPr>
+        <w:ind w:left="2160" w:hanging="180"/>
+      </w:pPr>
+    </w:lvl>
+    <w:lvl w:ilvl="3" w:tplc="0409000F" w:tentative="1">
+      <w:start w:val="1"/>
+      <w:numFmt w:val="decimal"/>
+      <w:lvlText w:val="%4."/>
+      <w:lvlJc w:val="left"/>
+      <w:pPr>
+        <w:ind w:left="2880" w:hanging="360"/>
+      </w:pPr>
+    </w:lvl>
+    <w:lvl w:ilvl="4" w:tplc="04090019" w:tentative="1">
+      <w:start w:val="1"/>
+      <w:numFmt w:val="lowerLetter"/>
+      <w:lvlText w:val="%5."/>
+      <w:lvlJc w:val="left"/>
+      <w:pPr>
+        <w:ind w:left="3600" w:hanging="360"/>
+      </w:pPr>
+    </w:lvl>
+    <w:lvl w:ilvl="5" w:tplc="0409001B" w:tentative="1">
+      <w:start w:val="1"/>
+      <w:numFmt w:val="lowerRoman"/>
+      <w:lvlText w:val="%6."/>
+      <w:lvlJc w:val="right"/>
+      <w:pPr>
+        <w:ind w:left="4320" w:hanging="180"/>
+      </w:pPr>
+    </w:lvl>
+    <w:lvl w:ilvl="6" w:tplc="0409000F" w:tentative="1">
+      <w:start w:val="1"/>
+      <w:numFmt w:val="decimal"/>
+      <w:lvlText w:val="%7."/>
+      <w:lvlJc w:val="left"/>
+      <w:pPr>
+        <w:ind w:left="5040" w:hanging="360"/>
+      </w:pPr>
+    </w:lvl>
+    <w:lvl w:ilvl="7" w:tplc="04090019" w:tentative="1">
+      <w:start w:val="1"/>
+      <w:numFmt w:val="lowerLetter"/>
+      <w:lvlText w:val="%8."/>
+      <w:lvlJc w:val="left"/>
+      <w:pPr>
+        <w:ind w:left="5760" w:hanging="360"/>
+      </w:pPr>
+    </w:lvl>
+    <w:lvl w:ilvl="8" w:tplc="0409001B" w:tentative="1">
+      <w:start w:val="1"/>
+      <w:numFmt w:val="lowerRoman"/>
+      <w:lvlText w:val="%9."/>
+      <w:lvlJc w:val="right"/>
+      <w:pPr>
+        <w:ind w:left="6480" w:hanging="180"/>
+      </w:pPr>
+    </w:lvl>
+  </w:abstractNum>
+  <w:abstractNum w:abstractNumId="4" w15:restartNumberingAfterBreak="0">
     <w:nsid w:val="08597C95"/>
     <w:multiLevelType w:val="hybridMultilevel"/>
     <w:tmpl w:val="07385308"/>
@@ -5015,7 +6363,7 @@
       </w:pPr>
     </w:lvl>
   </w:abstractNum>
-  <w:abstractNum w:abstractNumId="3" w15:restartNumberingAfterBreak="0">
+  <w:abstractNum w:abstractNumId="5" w15:restartNumberingAfterBreak="0">
     <w:nsid w:val="0CB51F87"/>
     <w:multiLevelType w:val="hybridMultilevel"/>
     <w:tmpl w:val="BB7AC91A"/>
@@ -5104,7 +6452,7 @@
       </w:pPr>
     </w:lvl>
   </w:abstractNum>
-  <w:abstractNum w:abstractNumId="4" w15:restartNumberingAfterBreak="0">
+  <w:abstractNum w:abstractNumId="6" w15:restartNumberingAfterBreak="0">
     <w:nsid w:val="0F544EF7"/>
     <w:multiLevelType w:val="hybridMultilevel"/>
     <w:tmpl w:val="ED00C47A"/>
@@ -5193,7 +6541,7 @@
       </w:pPr>
     </w:lvl>
   </w:abstractNum>
-  <w:abstractNum w:abstractNumId="5" w15:restartNumberingAfterBreak="0">
+  <w:abstractNum w:abstractNumId="7" w15:restartNumberingAfterBreak="0">
     <w:nsid w:val="14280995"/>
     <w:multiLevelType w:val="hybridMultilevel"/>
     <w:tmpl w:val="966AE394"/>
@@ -5282,7 +6630,7 @@
       </w:pPr>
     </w:lvl>
   </w:abstractNum>
-  <w:abstractNum w:abstractNumId="6" w15:restartNumberingAfterBreak="0">
+  <w:abstractNum w:abstractNumId="8" w15:restartNumberingAfterBreak="0">
     <w:nsid w:val="14EC6323"/>
     <w:multiLevelType w:val="hybridMultilevel"/>
     <w:tmpl w:val="32F0784E"/>
@@ -5395,7 +6743,7 @@
       </w:rPr>
     </w:lvl>
   </w:abstractNum>
-  <w:abstractNum w:abstractNumId="7" w15:restartNumberingAfterBreak="0">
+  <w:abstractNum w:abstractNumId="9" w15:restartNumberingAfterBreak="0">
     <w:nsid w:val="1A5444C1"/>
     <w:multiLevelType w:val="hybridMultilevel"/>
     <w:tmpl w:val="ADCAB732"/>
@@ -5484,7 +6832,7 @@
       </w:pPr>
     </w:lvl>
   </w:abstractNum>
-  <w:abstractNum w:abstractNumId="8" w15:restartNumberingAfterBreak="0">
+  <w:abstractNum w:abstractNumId="10" w15:restartNumberingAfterBreak="0">
     <w:nsid w:val="1D0F7A06"/>
     <w:multiLevelType w:val="hybridMultilevel"/>
     <w:tmpl w:val="A6629502"/>
@@ -5573,7 +6921,7 @@
       </w:pPr>
     </w:lvl>
   </w:abstractNum>
-  <w:abstractNum w:abstractNumId="9" w15:restartNumberingAfterBreak="0">
+  <w:abstractNum w:abstractNumId="11" w15:restartNumberingAfterBreak="0">
     <w:nsid w:val="2101597C"/>
     <w:multiLevelType w:val="hybridMultilevel"/>
     <w:tmpl w:val="270A1FE0"/>
@@ -5662,7 +7010,185 @@
       </w:pPr>
     </w:lvl>
   </w:abstractNum>
-  <w:abstractNum w:abstractNumId="10" w15:restartNumberingAfterBreak="0">
+  <w:abstractNum w:abstractNumId="12" w15:restartNumberingAfterBreak="0">
+    <w:nsid w:val="22AA1902"/>
+    <w:multiLevelType w:val="hybridMultilevel"/>
+    <w:tmpl w:val="52CA62C2"/>
+    <w:lvl w:ilvl="0" w:tplc="0409000F">
+      <w:start w:val="1"/>
+      <w:numFmt w:val="decimal"/>
+      <w:lvlText w:val="%1."/>
+      <w:lvlJc w:val="left"/>
+      <w:pPr>
+        <w:ind w:left="720" w:hanging="360"/>
+      </w:pPr>
+      <w:rPr>
+        <w:rFonts w:hint="default"/>
+      </w:rPr>
+    </w:lvl>
+    <w:lvl w:ilvl="1" w:tplc="04090019" w:tentative="1">
+      <w:start w:val="1"/>
+      <w:numFmt w:val="lowerLetter"/>
+      <w:lvlText w:val="%2."/>
+      <w:lvlJc w:val="left"/>
+      <w:pPr>
+        <w:ind w:left="1440" w:hanging="360"/>
+      </w:pPr>
+    </w:lvl>
+    <w:lvl w:ilvl="2" w:tplc="0409001B" w:tentative="1">
+      <w:start w:val="1"/>
+      <w:numFmt w:val="lowerRoman"/>
+      <w:lvlText w:val="%3."/>
+      <w:lvlJc w:val="right"/>
+      <w:pPr>
+        <w:ind w:left="2160" w:hanging="180"/>
+      </w:pPr>
+    </w:lvl>
+    <w:lvl w:ilvl="3" w:tplc="0409000F" w:tentative="1">
+      <w:start w:val="1"/>
+      <w:numFmt w:val="decimal"/>
+      <w:lvlText w:val="%4."/>
+      <w:lvlJc w:val="left"/>
+      <w:pPr>
+        <w:ind w:left="2880" w:hanging="360"/>
+      </w:pPr>
+    </w:lvl>
+    <w:lvl w:ilvl="4" w:tplc="04090019" w:tentative="1">
+      <w:start w:val="1"/>
+      <w:numFmt w:val="lowerLetter"/>
+      <w:lvlText w:val="%5."/>
+      <w:lvlJc w:val="left"/>
+      <w:pPr>
+        <w:ind w:left="3600" w:hanging="360"/>
+      </w:pPr>
+    </w:lvl>
+    <w:lvl w:ilvl="5" w:tplc="0409001B" w:tentative="1">
+      <w:start w:val="1"/>
+      <w:numFmt w:val="lowerRoman"/>
+      <w:lvlText w:val="%6."/>
+      <w:lvlJc w:val="right"/>
+      <w:pPr>
+        <w:ind w:left="4320" w:hanging="180"/>
+      </w:pPr>
+    </w:lvl>
+    <w:lvl w:ilvl="6" w:tplc="0409000F" w:tentative="1">
+      <w:start w:val="1"/>
+      <w:numFmt w:val="decimal"/>
+      <w:lvlText w:val="%7."/>
+      <w:lvlJc w:val="left"/>
+      <w:pPr>
+        <w:ind w:left="5040" w:hanging="360"/>
+      </w:pPr>
+    </w:lvl>
+    <w:lvl w:ilvl="7" w:tplc="04090019" w:tentative="1">
+      <w:start w:val="1"/>
+      <w:numFmt w:val="lowerLetter"/>
+      <w:lvlText w:val="%8."/>
+      <w:lvlJc w:val="left"/>
+      <w:pPr>
+        <w:ind w:left="5760" w:hanging="360"/>
+      </w:pPr>
+    </w:lvl>
+    <w:lvl w:ilvl="8" w:tplc="0409001B" w:tentative="1">
+      <w:start w:val="1"/>
+      <w:numFmt w:val="lowerRoman"/>
+      <w:lvlText w:val="%9."/>
+      <w:lvlJc w:val="right"/>
+      <w:pPr>
+        <w:ind w:left="6480" w:hanging="180"/>
+      </w:pPr>
+    </w:lvl>
+  </w:abstractNum>
+  <w:abstractNum w:abstractNumId="13" w15:restartNumberingAfterBreak="0">
+    <w:nsid w:val="24F5716A"/>
+    <w:multiLevelType w:val="hybridMultilevel"/>
+    <w:tmpl w:val="407C627E"/>
+    <w:lvl w:ilvl="0" w:tplc="0409000F">
+      <w:start w:val="1"/>
+      <w:numFmt w:val="decimal"/>
+      <w:lvlText w:val="%1."/>
+      <w:lvlJc w:val="left"/>
+      <w:pPr>
+        <w:ind w:left="720" w:hanging="360"/>
+      </w:pPr>
+      <w:rPr>
+        <w:rFonts w:hint="default"/>
+      </w:rPr>
+    </w:lvl>
+    <w:lvl w:ilvl="1" w:tplc="04090019" w:tentative="1">
+      <w:start w:val="1"/>
+      <w:numFmt w:val="lowerLetter"/>
+      <w:lvlText w:val="%2."/>
+      <w:lvlJc w:val="left"/>
+      <w:pPr>
+        <w:ind w:left="1440" w:hanging="360"/>
+      </w:pPr>
+    </w:lvl>
+    <w:lvl w:ilvl="2" w:tplc="0409001B" w:tentative="1">
+      <w:start w:val="1"/>
+      <w:numFmt w:val="lowerRoman"/>
+      <w:lvlText w:val="%3."/>
+      <w:lvlJc w:val="right"/>
+      <w:pPr>
+        <w:ind w:left="2160" w:hanging="180"/>
+      </w:pPr>
+    </w:lvl>
+    <w:lvl w:ilvl="3" w:tplc="0409000F" w:tentative="1">
+      <w:start w:val="1"/>
+      <w:numFmt w:val="decimal"/>
+      <w:lvlText w:val="%4."/>
+      <w:lvlJc w:val="left"/>
+      <w:pPr>
+        <w:ind w:left="2880" w:hanging="360"/>
+      </w:pPr>
+    </w:lvl>
+    <w:lvl w:ilvl="4" w:tplc="04090019" w:tentative="1">
+      <w:start w:val="1"/>
+      <w:numFmt w:val="lowerLetter"/>
+      <w:lvlText w:val="%5."/>
+      <w:lvlJc w:val="left"/>
+      <w:pPr>
+        <w:ind w:left="3600" w:hanging="360"/>
+      </w:pPr>
+    </w:lvl>
+    <w:lvl w:ilvl="5" w:tplc="0409001B" w:tentative="1">
+      <w:start w:val="1"/>
+      <w:numFmt w:val="lowerRoman"/>
+      <w:lvlText w:val="%6."/>
+      <w:lvlJc w:val="right"/>
+      <w:pPr>
+        <w:ind w:left="4320" w:hanging="180"/>
+      </w:pPr>
+    </w:lvl>
+    <w:lvl w:ilvl="6" w:tplc="0409000F" w:tentative="1">
+      <w:start w:val="1"/>
+      <w:numFmt w:val="decimal"/>
+      <w:lvlText w:val="%7."/>
+      <w:lvlJc w:val="left"/>
+      <w:pPr>
+        <w:ind w:left="5040" w:hanging="360"/>
+      </w:pPr>
+    </w:lvl>
+    <w:lvl w:ilvl="7" w:tplc="04090019" w:tentative="1">
+      <w:start w:val="1"/>
+      <w:numFmt w:val="lowerLetter"/>
+      <w:lvlText w:val="%8."/>
+      <w:lvlJc w:val="left"/>
+      <w:pPr>
+        <w:ind w:left="5760" w:hanging="360"/>
+      </w:pPr>
+    </w:lvl>
+    <w:lvl w:ilvl="8" w:tplc="0409001B" w:tentative="1">
+      <w:start w:val="1"/>
+      <w:numFmt w:val="lowerRoman"/>
+      <w:lvlText w:val="%9."/>
+      <w:lvlJc w:val="right"/>
+      <w:pPr>
+        <w:ind w:left="6480" w:hanging="180"/>
+      </w:pPr>
+    </w:lvl>
+  </w:abstractNum>
+  <w:abstractNum w:abstractNumId="14" w15:restartNumberingAfterBreak="0">
     <w:nsid w:val="25875411"/>
     <w:multiLevelType w:val="hybridMultilevel"/>
     <w:tmpl w:val="10226456"/>
@@ -5751,7 +7277,7 @@
       </w:pPr>
     </w:lvl>
   </w:abstractNum>
-  <w:abstractNum w:abstractNumId="11" w15:restartNumberingAfterBreak="0">
+  <w:abstractNum w:abstractNumId="15" w15:restartNumberingAfterBreak="0">
     <w:nsid w:val="268D3485"/>
     <w:multiLevelType w:val="hybridMultilevel"/>
     <w:tmpl w:val="B8A2CAC8"/>
@@ -5840,7 +7366,96 @@
       </w:pPr>
     </w:lvl>
   </w:abstractNum>
-  <w:abstractNum w:abstractNumId="12" w15:restartNumberingAfterBreak="0">
+  <w:abstractNum w:abstractNumId="16" w15:restartNumberingAfterBreak="0">
+    <w:nsid w:val="29205D17"/>
+    <w:multiLevelType w:val="hybridMultilevel"/>
+    <w:tmpl w:val="3F9CD306"/>
+    <w:lvl w:ilvl="0" w:tplc="0409000F">
+      <w:start w:val="1"/>
+      <w:numFmt w:val="decimal"/>
+      <w:lvlText w:val="%1."/>
+      <w:lvlJc w:val="left"/>
+      <w:pPr>
+        <w:ind w:left="720" w:hanging="360"/>
+      </w:pPr>
+      <w:rPr>
+        <w:rFonts w:hint="default"/>
+      </w:rPr>
+    </w:lvl>
+    <w:lvl w:ilvl="1" w:tplc="04090019" w:tentative="1">
+      <w:start w:val="1"/>
+      <w:numFmt w:val="lowerLetter"/>
+      <w:lvlText w:val="%2."/>
+      <w:lvlJc w:val="left"/>
+      <w:pPr>
+        <w:ind w:left="1440" w:hanging="360"/>
+      </w:pPr>
+    </w:lvl>
+    <w:lvl w:ilvl="2" w:tplc="0409001B" w:tentative="1">
+      <w:start w:val="1"/>
+      <w:numFmt w:val="lowerRoman"/>
+      <w:lvlText w:val="%3."/>
+      <w:lvlJc w:val="right"/>
+      <w:pPr>
+        <w:ind w:left="2160" w:hanging="180"/>
+      </w:pPr>
+    </w:lvl>
+    <w:lvl w:ilvl="3" w:tplc="0409000F" w:tentative="1">
+      <w:start w:val="1"/>
+      <w:numFmt w:val="decimal"/>
+      <w:lvlText w:val="%4."/>
+      <w:lvlJc w:val="left"/>
+      <w:pPr>
+        <w:ind w:left="2880" w:hanging="360"/>
+      </w:pPr>
+    </w:lvl>
+    <w:lvl w:ilvl="4" w:tplc="04090019" w:tentative="1">
+      <w:start w:val="1"/>
+      <w:numFmt w:val="lowerLetter"/>
+      <w:lvlText w:val="%5."/>
+      <w:lvlJc w:val="left"/>
+      <w:pPr>
+        <w:ind w:left="3600" w:hanging="360"/>
+      </w:pPr>
+    </w:lvl>
+    <w:lvl w:ilvl="5" w:tplc="0409001B" w:tentative="1">
+      <w:start w:val="1"/>
+      <w:numFmt w:val="lowerRoman"/>
+      <w:lvlText w:val="%6."/>
+      <w:lvlJc w:val="right"/>
+      <w:pPr>
+        <w:ind w:left="4320" w:hanging="180"/>
+      </w:pPr>
+    </w:lvl>
+    <w:lvl w:ilvl="6" w:tplc="0409000F" w:tentative="1">
+      <w:start w:val="1"/>
+      <w:numFmt w:val="decimal"/>
+      <w:lvlText w:val="%7."/>
+      <w:lvlJc w:val="left"/>
+      <w:pPr>
+        <w:ind w:left="5040" w:hanging="360"/>
+      </w:pPr>
+    </w:lvl>
+    <w:lvl w:ilvl="7" w:tplc="04090019" w:tentative="1">
+      <w:start w:val="1"/>
+      <w:numFmt w:val="lowerLetter"/>
+      <w:lvlText w:val="%8."/>
+      <w:lvlJc w:val="left"/>
+      <w:pPr>
+        <w:ind w:left="5760" w:hanging="360"/>
+      </w:pPr>
+    </w:lvl>
+    <w:lvl w:ilvl="8" w:tplc="0409001B" w:tentative="1">
+      <w:start w:val="1"/>
+      <w:numFmt w:val="lowerRoman"/>
+      <w:lvlText w:val="%9."/>
+      <w:lvlJc w:val="right"/>
+      <w:pPr>
+        <w:ind w:left="6480" w:hanging="180"/>
+      </w:pPr>
+    </w:lvl>
+  </w:abstractNum>
+  <w:abstractNum w:abstractNumId="17" w15:restartNumberingAfterBreak="0">
     <w:nsid w:val="331F7B95"/>
     <w:multiLevelType w:val="hybridMultilevel"/>
     <w:tmpl w:val="B8BA5112"/>
@@ -5929,7 +7544,7 @@
       </w:pPr>
     </w:lvl>
   </w:abstractNum>
-  <w:abstractNum w:abstractNumId="13" w15:restartNumberingAfterBreak="0">
+  <w:abstractNum w:abstractNumId="18" w15:restartNumberingAfterBreak="0">
     <w:nsid w:val="41E951E7"/>
     <w:multiLevelType w:val="hybridMultilevel"/>
     <w:tmpl w:val="D728C5AA"/>
@@ -6018,7 +7633,7 @@
       </w:pPr>
     </w:lvl>
   </w:abstractNum>
-  <w:abstractNum w:abstractNumId="14" w15:restartNumberingAfterBreak="0">
+  <w:abstractNum w:abstractNumId="19" w15:restartNumberingAfterBreak="0">
     <w:nsid w:val="46E86CF1"/>
     <w:multiLevelType w:val="hybridMultilevel"/>
     <w:tmpl w:val="9732DEEA"/>
@@ -6107,7 +7722,7 @@
       </w:pPr>
     </w:lvl>
   </w:abstractNum>
-  <w:abstractNum w:abstractNumId="15" w15:restartNumberingAfterBreak="0">
+  <w:abstractNum w:abstractNumId="20" w15:restartNumberingAfterBreak="0">
     <w:nsid w:val="477216CB"/>
     <w:multiLevelType w:val="hybridMultilevel"/>
     <w:tmpl w:val="D638C09E"/>
@@ -6196,7 +7811,96 @@
       </w:pPr>
     </w:lvl>
   </w:abstractNum>
-  <w:abstractNum w:abstractNumId="16" w15:restartNumberingAfterBreak="0">
+  <w:abstractNum w:abstractNumId="21" w15:restartNumberingAfterBreak="0">
+    <w:nsid w:val="50DD6F60"/>
+    <w:multiLevelType w:val="hybridMultilevel"/>
+    <w:tmpl w:val="E3549A5C"/>
+    <w:lvl w:ilvl="0" w:tplc="0409000F">
+      <w:start w:val="1"/>
+      <w:numFmt w:val="decimal"/>
+      <w:lvlText w:val="%1."/>
+      <w:lvlJc w:val="left"/>
+      <w:pPr>
+        <w:ind w:left="720" w:hanging="360"/>
+      </w:pPr>
+      <w:rPr>
+        <w:rFonts w:hint="default"/>
+      </w:rPr>
+    </w:lvl>
+    <w:lvl w:ilvl="1" w:tplc="04090019" w:tentative="1">
+      <w:start w:val="1"/>
+      <w:numFmt w:val="lowerLetter"/>
+      <w:lvlText w:val="%2."/>
+      <w:lvlJc w:val="left"/>
+      <w:pPr>
+        <w:ind w:left="1440" w:hanging="360"/>
+      </w:pPr>
+    </w:lvl>
+    <w:lvl w:ilvl="2" w:tplc="0409001B" w:tentative="1">
+      <w:start w:val="1"/>
+      <w:numFmt w:val="lowerRoman"/>
+      <w:lvlText w:val="%3."/>
+      <w:lvlJc w:val="right"/>
+      <w:pPr>
+        <w:ind w:left="2160" w:hanging="180"/>
+      </w:pPr>
+    </w:lvl>
+    <w:lvl w:ilvl="3" w:tplc="0409000F" w:tentative="1">
+      <w:start w:val="1"/>
+      <w:numFmt w:val="decimal"/>
+      <w:lvlText w:val="%4."/>
+      <w:lvlJc w:val="left"/>
+      <w:pPr>
+        <w:ind w:left="2880" w:hanging="360"/>
+      </w:pPr>
+    </w:lvl>
+    <w:lvl w:ilvl="4" w:tplc="04090019" w:tentative="1">
+      <w:start w:val="1"/>
+      <w:numFmt w:val="lowerLetter"/>
+      <w:lvlText w:val="%5."/>
+      <w:lvlJc w:val="left"/>
+      <w:pPr>
+        <w:ind w:left="3600" w:hanging="360"/>
+      </w:pPr>
+    </w:lvl>
+    <w:lvl w:ilvl="5" w:tplc="0409001B" w:tentative="1">
+      <w:start w:val="1"/>
+      <w:numFmt w:val="lowerRoman"/>
+      <w:lvlText w:val="%6."/>
+      <w:lvlJc w:val="right"/>
+      <w:pPr>
+        <w:ind w:left="4320" w:hanging="180"/>
+      </w:pPr>
+    </w:lvl>
+    <w:lvl w:ilvl="6" w:tplc="0409000F" w:tentative="1">
+      <w:start w:val="1"/>
+      <w:numFmt w:val="decimal"/>
+      <w:lvlText w:val="%7."/>
+      <w:lvlJc w:val="left"/>
+      <w:pPr>
+        <w:ind w:left="5040" w:hanging="360"/>
+      </w:pPr>
+    </w:lvl>
+    <w:lvl w:ilvl="7" w:tplc="04090019" w:tentative="1">
+      <w:start w:val="1"/>
+      <w:numFmt w:val="lowerLetter"/>
+      <w:lvlText w:val="%8."/>
+      <w:lvlJc w:val="left"/>
+      <w:pPr>
+        <w:ind w:left="5760" w:hanging="360"/>
+      </w:pPr>
+    </w:lvl>
+    <w:lvl w:ilvl="8" w:tplc="0409001B" w:tentative="1">
+      <w:start w:val="1"/>
+      <w:numFmt w:val="lowerRoman"/>
+      <w:lvlText w:val="%9."/>
+      <w:lvlJc w:val="right"/>
+      <w:pPr>
+        <w:ind w:left="6480" w:hanging="180"/>
+      </w:pPr>
+    </w:lvl>
+  </w:abstractNum>
+  <w:abstractNum w:abstractNumId="22" w15:restartNumberingAfterBreak="0">
     <w:nsid w:val="53F774DD"/>
     <w:multiLevelType w:val="hybridMultilevel"/>
     <w:tmpl w:val="8BBE88B6"/>
@@ -6285,7 +7989,7 @@
       </w:pPr>
     </w:lvl>
   </w:abstractNum>
-  <w:abstractNum w:abstractNumId="17" w15:restartNumberingAfterBreak="0">
+  <w:abstractNum w:abstractNumId="23" w15:restartNumberingAfterBreak="0">
     <w:nsid w:val="59FC6119"/>
     <w:multiLevelType w:val="hybridMultilevel"/>
     <w:tmpl w:val="9B046A14"/>
@@ -6374,7 +8078,96 @@
       </w:pPr>
     </w:lvl>
   </w:abstractNum>
-  <w:abstractNum w:abstractNumId="18" w15:restartNumberingAfterBreak="0">
+  <w:abstractNum w:abstractNumId="24" w15:restartNumberingAfterBreak="0">
+    <w:nsid w:val="5CF73C7B"/>
+    <w:multiLevelType w:val="hybridMultilevel"/>
+    <w:tmpl w:val="D27459DE"/>
+    <w:lvl w:ilvl="0" w:tplc="0409000F">
+      <w:start w:val="1"/>
+      <w:numFmt w:val="decimal"/>
+      <w:lvlText w:val="%1."/>
+      <w:lvlJc w:val="left"/>
+      <w:pPr>
+        <w:ind w:left="720" w:hanging="360"/>
+      </w:pPr>
+      <w:rPr>
+        <w:rFonts w:hint="default"/>
+      </w:rPr>
+    </w:lvl>
+    <w:lvl w:ilvl="1" w:tplc="04090019" w:tentative="1">
+      <w:start w:val="1"/>
+      <w:numFmt w:val="lowerLetter"/>
+      <w:lvlText w:val="%2."/>
+      <w:lvlJc w:val="left"/>
+      <w:pPr>
+        <w:ind w:left="1440" w:hanging="360"/>
+      </w:pPr>
+    </w:lvl>
+    <w:lvl w:ilvl="2" w:tplc="0409001B" w:tentative="1">
+      <w:start w:val="1"/>
+      <w:numFmt w:val="lowerRoman"/>
+      <w:lvlText w:val="%3."/>
+      <w:lvlJc w:val="right"/>
+      <w:pPr>
+        <w:ind w:left="2160" w:hanging="180"/>
+      </w:pPr>
+    </w:lvl>
+    <w:lvl w:ilvl="3" w:tplc="0409000F" w:tentative="1">
+      <w:start w:val="1"/>
+      <w:numFmt w:val="decimal"/>
+      <w:lvlText w:val="%4."/>
+      <w:lvlJc w:val="left"/>
+      <w:pPr>
+        <w:ind w:left="2880" w:hanging="360"/>
+      </w:pPr>
+    </w:lvl>
+    <w:lvl w:ilvl="4" w:tplc="04090019" w:tentative="1">
+      <w:start w:val="1"/>
+      <w:numFmt w:val="lowerLetter"/>
+      <w:lvlText w:val="%5."/>
+      <w:lvlJc w:val="left"/>
+      <w:pPr>
+        <w:ind w:left="3600" w:hanging="360"/>
+      </w:pPr>
+    </w:lvl>
+    <w:lvl w:ilvl="5" w:tplc="0409001B" w:tentative="1">
+      <w:start w:val="1"/>
+      <w:numFmt w:val="lowerRoman"/>
+      <w:lvlText w:val="%6."/>
+      <w:lvlJc w:val="right"/>
+      <w:pPr>
+        <w:ind w:left="4320" w:hanging="180"/>
+      </w:pPr>
+    </w:lvl>
+    <w:lvl w:ilvl="6" w:tplc="0409000F" w:tentative="1">
+      <w:start w:val="1"/>
+      <w:numFmt w:val="decimal"/>
+      <w:lvlText w:val="%7."/>
+      <w:lvlJc w:val="left"/>
+      <w:pPr>
+        <w:ind w:left="5040" w:hanging="360"/>
+      </w:pPr>
+    </w:lvl>
+    <w:lvl w:ilvl="7" w:tplc="04090019" w:tentative="1">
+      <w:start w:val="1"/>
+      <w:numFmt w:val="lowerLetter"/>
+      <w:lvlText w:val="%8."/>
+      <w:lvlJc w:val="left"/>
+      <w:pPr>
+        <w:ind w:left="5760" w:hanging="360"/>
+      </w:pPr>
+    </w:lvl>
+    <w:lvl w:ilvl="8" w:tplc="0409001B" w:tentative="1">
+      <w:start w:val="1"/>
+      <w:numFmt w:val="lowerRoman"/>
+      <w:lvlText w:val="%9."/>
+      <w:lvlJc w:val="right"/>
+      <w:pPr>
+        <w:ind w:left="6480" w:hanging="180"/>
+      </w:pPr>
+    </w:lvl>
+  </w:abstractNum>
+  <w:abstractNum w:abstractNumId="25" w15:restartNumberingAfterBreak="0">
     <w:nsid w:val="5E2041C4"/>
     <w:multiLevelType w:val="hybridMultilevel"/>
     <w:tmpl w:val="F5CA0346"/>
@@ -6463,7 +8256,7 @@
       </w:pPr>
     </w:lvl>
   </w:abstractNum>
-  <w:abstractNum w:abstractNumId="19" w15:restartNumberingAfterBreak="0">
+  <w:abstractNum w:abstractNumId="26" w15:restartNumberingAfterBreak="0">
     <w:nsid w:val="6EB614C1"/>
     <w:multiLevelType w:val="hybridMultilevel"/>
     <w:tmpl w:val="B11AD8B4"/>
@@ -6552,7 +8345,7 @@
       </w:pPr>
     </w:lvl>
   </w:abstractNum>
-  <w:abstractNum w:abstractNumId="20" w15:restartNumberingAfterBreak="0">
+  <w:abstractNum w:abstractNumId="27" w15:restartNumberingAfterBreak="0">
     <w:nsid w:val="6F8B0254"/>
     <w:multiLevelType w:val="hybridMultilevel"/>
     <w:tmpl w:val="36C0CDAE"/>
@@ -6641,7 +8434,7 @@
       </w:pPr>
     </w:lvl>
   </w:abstractNum>
-  <w:abstractNum w:abstractNumId="21" w15:restartNumberingAfterBreak="0">
+  <w:abstractNum w:abstractNumId="28" w15:restartNumberingAfterBreak="0">
     <w:nsid w:val="74970E84"/>
     <w:multiLevelType w:val="hybridMultilevel"/>
     <w:tmpl w:val="9FC49330"/>
@@ -6730,7 +8523,7 @@
       </w:pPr>
     </w:lvl>
   </w:abstractNum>
-  <w:abstractNum w:abstractNumId="22" w15:restartNumberingAfterBreak="0">
+  <w:abstractNum w:abstractNumId="29" w15:restartNumberingAfterBreak="0">
     <w:nsid w:val="78C43BBF"/>
     <w:multiLevelType w:val="hybridMultilevel"/>
     <w:tmpl w:val="8BB63548"/>
@@ -6819,7 +8612,7 @@
       </w:pPr>
     </w:lvl>
   </w:abstractNum>
-  <w:abstractNum w:abstractNumId="23" w15:restartNumberingAfterBreak="0">
+  <w:abstractNum w:abstractNumId="30" w15:restartNumberingAfterBreak="0">
     <w:nsid w:val="7CBB7824"/>
     <w:multiLevelType w:val="hybridMultilevel"/>
     <w:tmpl w:val="54047810"/>
@@ -6909,76 +8702,97 @@
     </w:lvl>
   </w:abstractNum>
   <w:num w:numId="1" w16cid:durableId="1277978649">
-    <w:abstractNumId w:val="3"/>
+    <w:abstractNumId w:val="5"/>
   </w:num>
   <w:num w:numId="2" w16cid:durableId="1569879146">
-    <w:abstractNumId w:val="11"/>
+    <w:abstractNumId w:val="15"/>
   </w:num>
   <w:num w:numId="3" w16cid:durableId="2035567955">
+    <w:abstractNumId w:val="8"/>
+  </w:num>
+  <w:num w:numId="4" w16cid:durableId="1783576402">
+    <w:abstractNumId w:val="14"/>
+  </w:num>
+  <w:num w:numId="5" w16cid:durableId="1096361739">
+    <w:abstractNumId w:val="4"/>
+  </w:num>
+  <w:num w:numId="6" w16cid:durableId="777987303">
+    <w:abstractNumId w:val="18"/>
+  </w:num>
+  <w:num w:numId="7" w16cid:durableId="769394706">
+    <w:abstractNumId w:val="19"/>
+  </w:num>
+  <w:num w:numId="8" w16cid:durableId="823862055">
+    <w:abstractNumId w:val="7"/>
+  </w:num>
+  <w:num w:numId="9" w16cid:durableId="1179539560">
+    <w:abstractNumId w:val="26"/>
+  </w:num>
+  <w:num w:numId="10" w16cid:durableId="887767792">
+    <w:abstractNumId w:val="22"/>
+  </w:num>
+  <w:num w:numId="11" w16cid:durableId="869293645">
+    <w:abstractNumId w:val="25"/>
+  </w:num>
+  <w:num w:numId="12" w16cid:durableId="42406734">
+    <w:abstractNumId w:val="28"/>
+  </w:num>
+  <w:num w:numId="13" w16cid:durableId="999120446">
+    <w:abstractNumId w:val="23"/>
+  </w:num>
+  <w:num w:numId="14" w16cid:durableId="1562791856">
+    <w:abstractNumId w:val="9"/>
+  </w:num>
+  <w:num w:numId="15" w16cid:durableId="1582332008">
     <w:abstractNumId w:val="6"/>
   </w:num>
-  <w:num w:numId="4" w16cid:durableId="1783576402">
+  <w:num w:numId="16" w16cid:durableId="1419135015">
     <w:abstractNumId w:val="10"/>
   </w:num>
-  <w:num w:numId="5" w16cid:durableId="1096361739">
-    <w:abstractNumId w:val="2"/>
-  </w:num>
-  <w:num w:numId="6" w16cid:durableId="777987303">
-    <w:abstractNumId w:val="13"/>
-  </w:num>
-  <w:num w:numId="7" w16cid:durableId="769394706">
-    <w:abstractNumId w:val="14"/>
-  </w:num>
-  <w:num w:numId="8" w16cid:durableId="823862055">
-    <w:abstractNumId w:val="5"/>
-  </w:num>
-  <w:num w:numId="9" w16cid:durableId="1179539560">
-    <w:abstractNumId w:val="19"/>
-  </w:num>
-  <w:num w:numId="10" w16cid:durableId="887767792">
-    <w:abstractNumId w:val="16"/>
-  </w:num>
-  <w:num w:numId="11" w16cid:durableId="869293645">
-    <w:abstractNumId w:val="18"/>
-  </w:num>
-  <w:num w:numId="12" w16cid:durableId="42406734">
-    <w:abstractNumId w:val="21"/>
-  </w:num>
-  <w:num w:numId="13" w16cid:durableId="999120446">
-    <w:abstractNumId w:val="17"/>
-  </w:num>
-  <w:num w:numId="14" w16cid:durableId="1562791856">
-    <w:abstractNumId w:val="7"/>
-  </w:num>
-  <w:num w:numId="15" w16cid:durableId="1582332008">
-    <w:abstractNumId w:val="4"/>
-  </w:num>
-  <w:num w:numId="16" w16cid:durableId="1419135015">
-    <w:abstractNumId w:val="8"/>
-  </w:num>
   <w:num w:numId="17" w16cid:durableId="897058677">
-    <w:abstractNumId w:val="22"/>
+    <w:abstractNumId w:val="29"/>
   </w:num>
   <w:num w:numId="18" w16cid:durableId="1750082258">
-    <w:abstractNumId w:val="9"/>
+    <w:abstractNumId w:val="11"/>
   </w:num>
   <w:num w:numId="19" w16cid:durableId="1237132301">
     <w:abstractNumId w:val="0"/>
   </w:num>
   <w:num w:numId="20" w16cid:durableId="393628986">
-    <w:abstractNumId w:val="15"/>
+    <w:abstractNumId w:val="20"/>
   </w:num>
   <w:num w:numId="21" w16cid:durableId="368993634">
-    <w:abstractNumId w:val="20"/>
+    <w:abstractNumId w:val="27"/>
   </w:num>
   <w:num w:numId="22" w16cid:durableId="2023697524">
-    <w:abstractNumId w:val="23"/>
+    <w:abstractNumId w:val="30"/>
   </w:num>
   <w:num w:numId="23" w16cid:durableId="579406677">
-    <w:abstractNumId w:val="12"/>
+    <w:abstractNumId w:val="17"/>
   </w:num>
   <w:num w:numId="24" w16cid:durableId="621309657">
     <w:abstractNumId w:val="1"/>
+  </w:num>
+  <w:num w:numId="25" w16cid:durableId="882137126">
+    <w:abstractNumId w:val="21"/>
+  </w:num>
+  <w:num w:numId="26" w16cid:durableId="1447968199">
+    <w:abstractNumId w:val="3"/>
+  </w:num>
+  <w:num w:numId="27" w16cid:durableId="1105348836">
+    <w:abstractNumId w:val="16"/>
+  </w:num>
+  <w:num w:numId="28" w16cid:durableId="551422745">
+    <w:abstractNumId w:val="24"/>
+  </w:num>
+  <w:num w:numId="29" w16cid:durableId="412824362">
+    <w:abstractNumId w:val="13"/>
+  </w:num>
+  <w:num w:numId="30" w16cid:durableId="946618380">
+    <w:abstractNumId w:val="2"/>
+  </w:num>
+  <w:num w:numId="31" w16cid:durableId="1017346854">
+    <w:abstractNumId w:val="12"/>
   </w:num>
 </w:numbering>
 </file>

</xml_diff>